<commit_message>
updating ackage for MCAR
</commit_message>
<xml_diff>
--- a/Output/Table 1 Overall Descriptives.docx
+++ b/Output/Table 1 Overall Descriptives.docx
@@ -40,9 +40,10 @@
       </w:tblGrid>
       <w:tr>
         <w:trPr>
-          <w:trHeight w:val="638" w:hRule="auto"/>
+          <w:trHeight w:val="604" w:hRule="auto"/>
           <w:tblHeader/>
         </w:trPr>
+        header 1
         <w:tc>
           <w:tcPr>
             <w:tcBorders>
@@ -62,7 +63,6 @@
           </w:tcPr>
           <w:p>
             <w:pPr>
-              <w:pStyle w:val="Normal"/>
               <w:jc w:val="left"/>
               <w:pBdr>
                 <w:bottom w:val="none" w:sz="0" w:space="0" w:color="000000"/>
@@ -73,19 +73,19 @@
               <w:spacing w:after="40" w:before="40" w:line="240"/>
               <w:ind w:left="100" w:right="100" w:firstLine="0" w:firstLineChars="0"/>
               <w:rPr>
-                <w:rFonts w:ascii="Helvetica" w:hAnsi="Helvetica" w:eastAsia="Helvetica" w:cs="Helvetica"/>
-                <w:i w:val="false"/>
-                <w:b w:val="false"/>
-                <w:u w:val="none"/>
-                <w:strike w:val="false"/>
-                <w:sz w:val="22"/>
-                <w:szCs w:val="22"/>
-                <w:color w:val="000000"/>
-              </w:rPr>
-            </w:pPr>
-            <w:r>
-              <w:rPr>
-                <w:rFonts w:ascii="Helvetica" w:hAnsi="Helvetica" w:eastAsia="Helvetica" w:cs="Helvetica"/>
+                <w:rFonts w:ascii="Arial" w:hAnsi="Arial" w:eastAsia="Arial" w:cs="Arial"/>
+                <w:i w:val="false"/>
+                <w:b w:val="false"/>
+                <w:u w:val="none"/>
+                <w:strike w:val="false"/>
+                <w:sz w:val="22"/>
+                <w:szCs w:val="22"/>
+                <w:color w:val="000000"/>
+              </w:rPr>
+            </w:pPr>
+            <w:r>
+              <w:rPr>
+                <w:rFonts w:ascii="Arial" w:hAnsi="Arial" w:eastAsia="Arial" w:cs="Arial"/>
                 <w:i w:val="false"/>
                 <w:b w:val="true"/>
                 <w:u w:val="none"/>
@@ -117,7 +117,6 @@
           </w:tcPr>
           <w:p>
             <w:pPr>
-              <w:pStyle w:val="Normal"/>
               <w:jc w:val="center"/>
               <w:pBdr>
                 <w:bottom w:val="none" w:sz="0" w:space="0" w:color="000000"/>
@@ -128,19 +127,19 @@
               <w:spacing w:after="40" w:before="40" w:line="240"/>
               <w:ind w:left="100" w:right="100" w:firstLine="0" w:firstLineChars="0"/>
               <w:rPr>
-                <w:rFonts w:ascii="Helvetica" w:hAnsi="Helvetica" w:eastAsia="Helvetica" w:cs="Helvetica"/>
-                <w:i w:val="false"/>
-                <w:b w:val="false"/>
-                <w:u w:val="none"/>
-                <w:strike w:val="false"/>
-                <w:sz w:val="22"/>
-                <w:szCs w:val="22"/>
-                <w:color w:val="000000"/>
-              </w:rPr>
-            </w:pPr>
-            <w:r>
-              <w:rPr>
-                <w:rFonts w:ascii="Helvetica" w:hAnsi="Helvetica" w:eastAsia="Helvetica" w:cs="Helvetica"/>
+                <w:rFonts w:ascii="Arial" w:hAnsi="Arial" w:eastAsia="Arial" w:cs="Arial"/>
+                <w:i w:val="false"/>
+                <w:b w:val="false"/>
+                <w:u w:val="none"/>
+                <w:strike w:val="false"/>
+                <w:sz w:val="22"/>
+                <w:szCs w:val="22"/>
+                <w:color w:val="000000"/>
+              </w:rPr>
+            </w:pPr>
+            <w:r>
+              <w:rPr>
+                <w:rFonts w:ascii="Arial" w:hAnsi="Arial" w:eastAsia="Arial" w:cs="Arial"/>
                 <w:i w:val="false"/>
                 <w:b w:val="true"/>
                 <w:u w:val="none"/>
@@ -156,8 +155,9 @@
       </w:tr>
       <w:tr>
         <w:trPr>
-          <w:trHeight w:val="608" w:hRule="auto"/>
+          <w:trHeight w:val="617" w:hRule="auto"/>
         </w:trPr>
+        body 1
         <w:tc>
           <w:tcPr>
             <w:tcBorders>
@@ -177,7 +177,6 @@
           </w:tcPr>
           <w:p>
             <w:pPr>
-              <w:pStyle w:val="Normal"/>
               <w:jc w:val="left"/>
               <w:pBdr>
                 <w:bottom w:val="none" w:sz="0" w:space="0" w:color="000000"/>
@@ -188,7 +187,7 @@
               <w:spacing w:after="100" w:before="100" w:line="240"/>
               <w:ind w:left="100" w:right="100" w:firstLine="0" w:firstLineChars="0"/>
               <w:rPr>
-                <w:rFonts w:ascii="Helvetica" w:hAnsi="Helvetica" w:eastAsia="Helvetica" w:cs="Helvetica"/>
+                <w:rFonts w:ascii="Arial" w:hAnsi="Arial" w:eastAsia="Arial" w:cs="Arial"/>
                 <w:i w:val="false"/>
                 <w:b w:val="true"/>
                 <w:u w:val="none"/>
@@ -200,7 +199,7 @@
             </w:pPr>
             <w:r>
               <w:rPr>
-                <w:rFonts w:ascii="Helvetica" w:hAnsi="Helvetica" w:eastAsia="Helvetica" w:cs="Helvetica"/>
+                <w:rFonts w:ascii="Arial" w:hAnsi="Arial" w:eastAsia="Arial" w:cs="Arial"/>
                 <w:i w:val="false"/>
                 <w:b w:val="true"/>
                 <w:u w:val="none"/>
@@ -232,7 +231,6 @@
           </w:tcPr>
           <w:p>
             <w:pPr>
-              <w:pStyle w:val="Normal"/>
               <w:jc w:val="center"/>
               <w:pBdr>
                 <w:bottom w:val="none" w:sz="0" w:space="0" w:color="000000"/>
@@ -243,19 +241,19 @@
               <w:spacing w:after="100" w:before="100" w:line="240"/>
               <w:ind w:left="100" w:right="100" w:firstLine="0" w:firstLineChars="0"/>
               <w:rPr>
-                <w:rFonts w:ascii="Helvetica" w:hAnsi="Helvetica" w:eastAsia="Helvetica" w:cs="Helvetica"/>
-                <w:i w:val="false"/>
-                <w:b w:val="false"/>
-                <w:u w:val="none"/>
-                <w:strike w:val="false"/>
-                <w:sz w:val="22"/>
-                <w:szCs w:val="22"/>
-                <w:color w:val="000000"/>
-              </w:rPr>
-            </w:pPr>
-            <w:r>
-              <w:rPr>
-                <w:rFonts w:ascii="Helvetica" w:hAnsi="Helvetica" w:eastAsia="Helvetica" w:cs="Helvetica"/>
+                <w:rFonts w:ascii="Arial" w:hAnsi="Arial" w:eastAsia="Arial" w:cs="Arial"/>
+                <w:i w:val="false"/>
+                <w:b w:val="false"/>
+                <w:u w:val="none"/>
+                <w:strike w:val="false"/>
+                <w:sz w:val="22"/>
+                <w:szCs w:val="22"/>
+                <w:color w:val="000000"/>
+              </w:rPr>
+            </w:pPr>
+            <w:r>
+              <w:rPr>
+                <w:rFonts w:ascii="Arial" w:hAnsi="Arial" w:eastAsia="Arial" w:cs="Arial"/>
                 <w:i w:val="false"/>
                 <w:b w:val="false"/>
                 <w:u w:val="none"/>
@@ -271,28 +269,28 @@
       </w:tr>
       <w:tr>
         <w:trPr>
-          <w:trHeight w:val="608" w:hRule="auto"/>
+          <w:trHeight w:val="617" w:hRule="auto"/>
         </w:trPr>
-        <w:tc>
-          <w:tcPr>
-            <w:tcBorders>
-              <w:bottom w:val="none" w:sz="0" w:space="0" w:color="000000"/>
-              <w:top w:val="none" w:sz="0" w:space="0" w:color="000000"/>
-              <w:left w:val="none" w:sz="0" w:space="0" w:color="000000"/>
-              <w:right w:val="none" w:sz="0" w:space="0" w:color="000000"/>
-            </w:tcBorders>
-            <w:shd w:val="clear" w:color="auto" w:fill="FFFFFF"/>
-            <w:tcMar>
-              <w:top w:w="0" w:type="dxa"/>
-              <w:bottom w:w="0" w:type="dxa"/>
-              <w:left w:w="0" w:type="dxa"/>
-              <w:right w:w="0" w:type="dxa"/>
-            </w:tcMar>
-            <w:vAlign w:val="top"/>
-          </w:tcPr>
-          <w:p>
-            <w:pPr>
-              <w:pStyle w:val="Normal"/>
+        body 2
+        <w:tc>
+          <w:tcPr>
+            <w:tcBorders>
+              <w:bottom w:val="none" w:sz="0" w:space="0" w:color="000000"/>
+              <w:top w:val="none" w:sz="0" w:space="0" w:color="000000"/>
+              <w:left w:val="none" w:sz="0" w:space="0" w:color="000000"/>
+              <w:right w:val="none" w:sz="0" w:space="0" w:color="000000"/>
+            </w:tcBorders>
+            <w:shd w:val="clear" w:color="auto" w:fill="FFFFFF"/>
+            <w:tcMar>
+              <w:top w:w="0" w:type="dxa"/>
+              <w:bottom w:w="0" w:type="dxa"/>
+              <w:left w:w="0" w:type="dxa"/>
+              <w:right w:w="0" w:type="dxa"/>
+            </w:tcMar>
+            <w:vAlign w:val="top"/>
+          </w:tcPr>
+          <w:p>
+            <w:pPr>
               <w:jc w:val="left"/>
               <w:pBdr>
                 <w:bottom w:val="none" w:sz="0" w:space="0" w:color="000000"/>
@@ -303,7 +301,7 @@
               <w:spacing w:after="100" w:before="100" w:line="240"/>
               <w:ind w:left="100" w:right="100" w:firstLine="0" w:firstLineChars="0"/>
               <w:rPr>
-                <w:rFonts w:ascii="Helvetica" w:hAnsi="Helvetica" w:eastAsia="Helvetica" w:cs="Helvetica"/>
+                <w:rFonts w:ascii="Arial" w:hAnsi="Arial" w:eastAsia="Arial" w:cs="Arial"/>
                 <w:i w:val="false"/>
                 <w:b w:val="true"/>
                 <w:u w:val="none"/>
@@ -315,7 +313,7 @@
             </w:pPr>
             <w:r>
               <w:rPr>
-                <w:rFonts w:ascii="Helvetica" w:hAnsi="Helvetica" w:eastAsia="Helvetica" w:cs="Helvetica"/>
+                <w:rFonts w:ascii="Arial" w:hAnsi="Arial" w:eastAsia="Arial" w:cs="Arial"/>
                 <w:i w:val="false"/>
                 <w:b w:val="true"/>
                 <w:u w:val="none"/>
@@ -347,7 +345,6 @@
           </w:tcPr>
           <w:p>
             <w:pPr>
-              <w:pStyle w:val="Normal"/>
               <w:jc w:val="center"/>
               <w:pBdr>
                 <w:bottom w:val="none" w:sz="0" w:space="0" w:color="000000"/>
@@ -358,19 +355,19 @@
               <w:spacing w:after="100" w:before="100" w:line="240"/>
               <w:ind w:left="100" w:right="100" w:firstLine="0" w:firstLineChars="0"/>
               <w:rPr>
-                <w:rFonts w:ascii="Helvetica" w:hAnsi="Helvetica" w:eastAsia="Helvetica" w:cs="Helvetica"/>
-                <w:i w:val="false"/>
-                <w:b w:val="false"/>
-                <w:u w:val="none"/>
-                <w:strike w:val="false"/>
-                <w:sz w:val="22"/>
-                <w:szCs w:val="22"/>
-                <w:color w:val="000000"/>
-              </w:rPr>
-            </w:pPr>
-            <w:r>
-              <w:rPr>
-                <w:rFonts w:ascii="Helvetica" w:hAnsi="Helvetica" w:eastAsia="Helvetica" w:cs="Helvetica"/>
+                <w:rFonts w:ascii="Arial" w:hAnsi="Arial" w:eastAsia="Arial" w:cs="Arial"/>
+                <w:i w:val="false"/>
+                <w:b w:val="false"/>
+                <w:u w:val="none"/>
+                <w:strike w:val="false"/>
+                <w:sz w:val="22"/>
+                <w:szCs w:val="22"/>
+                <w:color w:val="000000"/>
+              </w:rPr>
+            </w:pPr>
+            <w:r>
+              <w:rPr>
+                <w:rFonts w:ascii="Arial" w:hAnsi="Arial" w:eastAsia="Arial" w:cs="Arial"/>
                 <w:i w:val="false"/>
                 <w:b w:val="false"/>
                 <w:u w:val="none"/>
@@ -386,28 +383,28 @@
       </w:tr>
       <w:tr>
         <w:trPr>
-          <w:trHeight w:val="608" w:hRule="auto"/>
+          <w:trHeight w:val="617" w:hRule="auto"/>
         </w:trPr>
-        <w:tc>
-          <w:tcPr>
-            <w:tcBorders>
-              <w:bottom w:val="none" w:sz="0" w:space="0" w:color="000000"/>
-              <w:top w:val="none" w:sz="0" w:space="0" w:color="000000"/>
-              <w:left w:val="none" w:sz="0" w:space="0" w:color="000000"/>
-              <w:right w:val="none" w:sz="0" w:space="0" w:color="000000"/>
-            </w:tcBorders>
-            <w:shd w:val="clear" w:color="auto" w:fill="FFFFFF"/>
-            <w:tcMar>
-              <w:top w:w="0" w:type="dxa"/>
-              <w:bottom w:w="0" w:type="dxa"/>
-              <w:left w:w="0" w:type="dxa"/>
-              <w:right w:w="0" w:type="dxa"/>
-            </w:tcMar>
-            <w:vAlign w:val="top"/>
-          </w:tcPr>
-          <w:p>
-            <w:pPr>
-              <w:pStyle w:val="Normal"/>
+        body 3
+        <w:tc>
+          <w:tcPr>
+            <w:tcBorders>
+              <w:bottom w:val="none" w:sz="0" w:space="0" w:color="000000"/>
+              <w:top w:val="none" w:sz="0" w:space="0" w:color="000000"/>
+              <w:left w:val="none" w:sz="0" w:space="0" w:color="000000"/>
+              <w:right w:val="none" w:sz="0" w:space="0" w:color="000000"/>
+            </w:tcBorders>
+            <w:shd w:val="clear" w:color="auto" w:fill="FFFFFF"/>
+            <w:tcMar>
+              <w:top w:w="0" w:type="dxa"/>
+              <w:bottom w:w="0" w:type="dxa"/>
+              <w:left w:w="0" w:type="dxa"/>
+              <w:right w:w="0" w:type="dxa"/>
+            </w:tcMar>
+            <w:vAlign w:val="top"/>
+          </w:tcPr>
+          <w:p>
+            <w:pPr>
               <w:jc w:val="left"/>
               <w:pBdr>
                 <w:bottom w:val="none" w:sz="0" w:space="0" w:color="000000"/>
@@ -418,19 +415,19 @@
               <w:spacing w:after="100" w:before="100" w:line="240"/>
               <w:ind w:left="300" w:right="100" w:firstLine="0" w:firstLineChars="0"/>
               <w:rPr>
-                <w:rFonts w:ascii="Helvetica" w:hAnsi="Helvetica" w:eastAsia="Helvetica" w:cs="Helvetica"/>
-                <w:i w:val="false"/>
-                <w:b w:val="false"/>
-                <w:u w:val="none"/>
-                <w:strike w:val="false"/>
-                <w:sz w:val="22"/>
-                <w:szCs w:val="22"/>
-                <w:color w:val="000000"/>
-              </w:rPr>
-            </w:pPr>
-            <w:r>
-              <w:rPr>
-                <w:rFonts w:ascii="Helvetica" w:hAnsi="Helvetica" w:eastAsia="Helvetica" w:cs="Helvetica"/>
+                <w:rFonts w:ascii="Arial" w:hAnsi="Arial" w:eastAsia="Arial" w:cs="Arial"/>
+                <w:i w:val="false"/>
+                <w:b w:val="false"/>
+                <w:u w:val="none"/>
+                <w:strike w:val="false"/>
+                <w:sz w:val="22"/>
+                <w:szCs w:val="22"/>
+                <w:color w:val="000000"/>
+              </w:rPr>
+            </w:pPr>
+            <w:r>
+              <w:rPr>
+                <w:rFonts w:ascii="Arial" w:hAnsi="Arial" w:eastAsia="Arial" w:cs="Arial"/>
                 <w:i w:val="false"/>
                 <w:b w:val="false"/>
                 <w:u w:val="none"/>
@@ -462,7 +459,6 @@
           </w:tcPr>
           <w:p>
             <w:pPr>
-              <w:pStyle w:val="Normal"/>
               <w:jc w:val="center"/>
               <w:pBdr>
                 <w:bottom w:val="none" w:sz="0" w:space="0" w:color="000000"/>
@@ -473,19 +469,19 @@
               <w:spacing w:after="100" w:before="100" w:line="240"/>
               <w:ind w:left="100" w:right="100" w:firstLine="0" w:firstLineChars="0"/>
               <w:rPr>
-                <w:rFonts w:ascii="Helvetica" w:hAnsi="Helvetica" w:eastAsia="Helvetica" w:cs="Helvetica"/>
-                <w:i w:val="false"/>
-                <w:b w:val="false"/>
-                <w:u w:val="none"/>
-                <w:strike w:val="false"/>
-                <w:sz w:val="22"/>
-                <w:szCs w:val="22"/>
-                <w:color w:val="000000"/>
-              </w:rPr>
-            </w:pPr>
-            <w:r>
-              <w:rPr>
-                <w:rFonts w:ascii="Helvetica" w:hAnsi="Helvetica" w:eastAsia="Helvetica" w:cs="Helvetica"/>
+                <w:rFonts w:ascii="Arial" w:hAnsi="Arial" w:eastAsia="Arial" w:cs="Arial"/>
+                <w:i w:val="false"/>
+                <w:b w:val="false"/>
+                <w:u w:val="none"/>
+                <w:strike w:val="false"/>
+                <w:sz w:val="22"/>
+                <w:szCs w:val="22"/>
+                <w:color w:val="000000"/>
+              </w:rPr>
+            </w:pPr>
+            <w:r>
+              <w:rPr>
+                <w:rFonts w:ascii="Arial" w:hAnsi="Arial" w:eastAsia="Arial" w:cs="Arial"/>
                 <w:i w:val="false"/>
                 <w:b w:val="false"/>
                 <w:u w:val="none"/>
@@ -501,28 +497,28 @@
       </w:tr>
       <w:tr>
         <w:trPr>
-          <w:trHeight w:val="608" w:hRule="auto"/>
+          <w:trHeight w:val="617" w:hRule="auto"/>
         </w:trPr>
-        <w:tc>
-          <w:tcPr>
-            <w:tcBorders>
-              <w:bottom w:val="none" w:sz="0" w:space="0" w:color="000000"/>
-              <w:top w:val="none" w:sz="0" w:space="0" w:color="000000"/>
-              <w:left w:val="none" w:sz="0" w:space="0" w:color="000000"/>
-              <w:right w:val="none" w:sz="0" w:space="0" w:color="000000"/>
-            </w:tcBorders>
-            <w:shd w:val="clear" w:color="auto" w:fill="FFFFFF"/>
-            <w:tcMar>
-              <w:top w:w="0" w:type="dxa"/>
-              <w:bottom w:w="0" w:type="dxa"/>
-              <w:left w:w="0" w:type="dxa"/>
-              <w:right w:w="0" w:type="dxa"/>
-            </w:tcMar>
-            <w:vAlign w:val="top"/>
-          </w:tcPr>
-          <w:p>
-            <w:pPr>
-              <w:pStyle w:val="Normal"/>
+        body 4
+        <w:tc>
+          <w:tcPr>
+            <w:tcBorders>
+              <w:bottom w:val="none" w:sz="0" w:space="0" w:color="000000"/>
+              <w:top w:val="none" w:sz="0" w:space="0" w:color="000000"/>
+              <w:left w:val="none" w:sz="0" w:space="0" w:color="000000"/>
+              <w:right w:val="none" w:sz="0" w:space="0" w:color="000000"/>
+            </w:tcBorders>
+            <w:shd w:val="clear" w:color="auto" w:fill="FFFFFF"/>
+            <w:tcMar>
+              <w:top w:w="0" w:type="dxa"/>
+              <w:bottom w:w="0" w:type="dxa"/>
+              <w:left w:w="0" w:type="dxa"/>
+              <w:right w:w="0" w:type="dxa"/>
+            </w:tcMar>
+            <w:vAlign w:val="top"/>
+          </w:tcPr>
+          <w:p>
+            <w:pPr>
               <w:jc w:val="left"/>
               <w:pBdr>
                 <w:bottom w:val="none" w:sz="0" w:space="0" w:color="000000"/>
@@ -533,19 +529,19 @@
               <w:spacing w:after="100" w:before="100" w:line="240"/>
               <w:ind w:left="300" w:right="100" w:firstLine="0" w:firstLineChars="0"/>
               <w:rPr>
-                <w:rFonts w:ascii="Helvetica" w:hAnsi="Helvetica" w:eastAsia="Helvetica" w:cs="Helvetica"/>
-                <w:i w:val="false"/>
-                <w:b w:val="false"/>
-                <w:u w:val="none"/>
-                <w:strike w:val="false"/>
-                <w:sz w:val="22"/>
-                <w:szCs w:val="22"/>
-                <w:color w:val="000000"/>
-              </w:rPr>
-            </w:pPr>
-            <w:r>
-              <w:rPr>
-                <w:rFonts w:ascii="Helvetica" w:hAnsi="Helvetica" w:eastAsia="Helvetica" w:cs="Helvetica"/>
+                <w:rFonts w:ascii="Arial" w:hAnsi="Arial" w:eastAsia="Arial" w:cs="Arial"/>
+                <w:i w:val="false"/>
+                <w:b w:val="false"/>
+                <w:u w:val="none"/>
+                <w:strike w:val="false"/>
+                <w:sz w:val="22"/>
+                <w:szCs w:val="22"/>
+                <w:color w:val="000000"/>
+              </w:rPr>
+            </w:pPr>
+            <w:r>
+              <w:rPr>
+                <w:rFonts w:ascii="Arial" w:hAnsi="Arial" w:eastAsia="Arial" w:cs="Arial"/>
                 <w:i w:val="false"/>
                 <w:b w:val="false"/>
                 <w:u w:val="none"/>
@@ -577,7 +573,6 @@
           </w:tcPr>
           <w:p>
             <w:pPr>
-              <w:pStyle w:val="Normal"/>
               <w:jc w:val="center"/>
               <w:pBdr>
                 <w:bottom w:val="none" w:sz="0" w:space="0" w:color="000000"/>
@@ -588,19 +583,19 @@
               <w:spacing w:after="100" w:before="100" w:line="240"/>
               <w:ind w:left="100" w:right="100" w:firstLine="0" w:firstLineChars="0"/>
               <w:rPr>
-                <w:rFonts w:ascii="Helvetica" w:hAnsi="Helvetica" w:eastAsia="Helvetica" w:cs="Helvetica"/>
-                <w:i w:val="false"/>
-                <w:b w:val="false"/>
-                <w:u w:val="none"/>
-                <w:strike w:val="false"/>
-                <w:sz w:val="22"/>
-                <w:szCs w:val="22"/>
-                <w:color w:val="000000"/>
-              </w:rPr>
-            </w:pPr>
-            <w:r>
-              <w:rPr>
-                <w:rFonts w:ascii="Helvetica" w:hAnsi="Helvetica" w:eastAsia="Helvetica" w:cs="Helvetica"/>
+                <w:rFonts w:ascii="Arial" w:hAnsi="Arial" w:eastAsia="Arial" w:cs="Arial"/>
+                <w:i w:val="false"/>
+                <w:b w:val="false"/>
+                <w:u w:val="none"/>
+                <w:strike w:val="false"/>
+                <w:sz w:val="22"/>
+                <w:szCs w:val="22"/>
+                <w:color w:val="000000"/>
+              </w:rPr>
+            </w:pPr>
+            <w:r>
+              <w:rPr>
+                <w:rFonts w:ascii="Arial" w:hAnsi="Arial" w:eastAsia="Arial" w:cs="Arial"/>
                 <w:i w:val="false"/>
                 <w:b w:val="false"/>
                 <w:u w:val="none"/>
@@ -616,28 +611,28 @@
       </w:tr>
       <w:tr>
         <w:trPr>
-          <w:trHeight w:val="608" w:hRule="auto"/>
+          <w:trHeight w:val="617" w:hRule="auto"/>
         </w:trPr>
-        <w:tc>
-          <w:tcPr>
-            <w:tcBorders>
-              <w:bottom w:val="none" w:sz="0" w:space="0" w:color="000000"/>
-              <w:top w:val="none" w:sz="0" w:space="0" w:color="000000"/>
-              <w:left w:val="none" w:sz="0" w:space="0" w:color="000000"/>
-              <w:right w:val="none" w:sz="0" w:space="0" w:color="000000"/>
-            </w:tcBorders>
-            <w:shd w:val="clear" w:color="auto" w:fill="FFFFFF"/>
-            <w:tcMar>
-              <w:top w:w="0" w:type="dxa"/>
-              <w:bottom w:w="0" w:type="dxa"/>
-              <w:left w:w="0" w:type="dxa"/>
-              <w:right w:w="0" w:type="dxa"/>
-            </w:tcMar>
-            <w:vAlign w:val="top"/>
-          </w:tcPr>
-          <w:p>
-            <w:pPr>
-              <w:pStyle w:val="Normal"/>
+        body 5
+        <w:tc>
+          <w:tcPr>
+            <w:tcBorders>
+              <w:bottom w:val="none" w:sz="0" w:space="0" w:color="000000"/>
+              <w:top w:val="none" w:sz="0" w:space="0" w:color="000000"/>
+              <w:left w:val="none" w:sz="0" w:space="0" w:color="000000"/>
+              <w:right w:val="none" w:sz="0" w:space="0" w:color="000000"/>
+            </w:tcBorders>
+            <w:shd w:val="clear" w:color="auto" w:fill="FFFFFF"/>
+            <w:tcMar>
+              <w:top w:w="0" w:type="dxa"/>
+              <w:bottom w:w="0" w:type="dxa"/>
+              <w:left w:w="0" w:type="dxa"/>
+              <w:right w:w="0" w:type="dxa"/>
+            </w:tcMar>
+            <w:vAlign w:val="top"/>
+          </w:tcPr>
+          <w:p>
+            <w:pPr>
               <w:jc w:val="left"/>
               <w:pBdr>
                 <w:bottom w:val="none" w:sz="0" w:space="0" w:color="000000"/>
@@ -648,7 +643,7 @@
               <w:spacing w:after="100" w:before="100" w:line="240"/>
               <w:ind w:left="100" w:right="100" w:firstLine="0" w:firstLineChars="0"/>
               <w:rPr>
-                <w:rFonts w:ascii="Helvetica" w:hAnsi="Helvetica" w:eastAsia="Helvetica" w:cs="Helvetica"/>
+                <w:rFonts w:ascii="Arial" w:hAnsi="Arial" w:eastAsia="Arial" w:cs="Arial"/>
                 <w:i w:val="false"/>
                 <w:b w:val="true"/>
                 <w:u w:val="none"/>
@@ -660,7 +655,7 @@
             </w:pPr>
             <w:r>
               <w:rPr>
-                <w:rFonts w:ascii="Helvetica" w:hAnsi="Helvetica" w:eastAsia="Helvetica" w:cs="Helvetica"/>
+                <w:rFonts w:ascii="Arial" w:hAnsi="Arial" w:eastAsia="Arial" w:cs="Arial"/>
                 <w:i w:val="false"/>
                 <w:b w:val="true"/>
                 <w:u w:val="none"/>
@@ -692,7 +687,6 @@
           </w:tcPr>
           <w:p>
             <w:pPr>
-              <w:pStyle w:val="Normal"/>
               <w:jc w:val="center"/>
               <w:pBdr>
                 <w:bottom w:val="none" w:sz="0" w:space="0" w:color="000000"/>
@@ -703,19 +697,19 @@
               <w:spacing w:after="100" w:before="100" w:line="240"/>
               <w:ind w:left="100" w:right="100" w:firstLine="0" w:firstLineChars="0"/>
               <w:rPr>
-                <w:rFonts w:ascii="Helvetica" w:hAnsi="Helvetica" w:eastAsia="Helvetica" w:cs="Helvetica"/>
-                <w:i w:val="false"/>
-                <w:b w:val="false"/>
-                <w:u w:val="none"/>
-                <w:strike w:val="false"/>
-                <w:sz w:val="22"/>
-                <w:szCs w:val="22"/>
-                <w:color w:val="000000"/>
-              </w:rPr>
-            </w:pPr>
-            <w:r>
-              <w:rPr>
-                <w:rFonts w:ascii="Helvetica" w:hAnsi="Helvetica" w:eastAsia="Helvetica" w:cs="Helvetica"/>
+                <w:rFonts w:ascii="Arial" w:hAnsi="Arial" w:eastAsia="Arial" w:cs="Arial"/>
+                <w:i w:val="false"/>
+                <w:b w:val="false"/>
+                <w:u w:val="none"/>
+                <w:strike w:val="false"/>
+                <w:sz w:val="22"/>
+                <w:szCs w:val="22"/>
+                <w:color w:val="000000"/>
+              </w:rPr>
+            </w:pPr>
+            <w:r>
+              <w:rPr>
+                <w:rFonts w:ascii="Arial" w:hAnsi="Arial" w:eastAsia="Arial" w:cs="Arial"/>
                 <w:i w:val="false"/>
                 <w:b w:val="false"/>
                 <w:u w:val="none"/>
@@ -731,28 +725,28 @@
       </w:tr>
       <w:tr>
         <w:trPr>
-          <w:trHeight w:val="608" w:hRule="auto"/>
+          <w:trHeight w:val="617" w:hRule="auto"/>
         </w:trPr>
-        <w:tc>
-          <w:tcPr>
-            <w:tcBorders>
-              <w:bottom w:val="none" w:sz="0" w:space="0" w:color="000000"/>
-              <w:top w:val="none" w:sz="0" w:space="0" w:color="000000"/>
-              <w:left w:val="none" w:sz="0" w:space="0" w:color="000000"/>
-              <w:right w:val="none" w:sz="0" w:space="0" w:color="000000"/>
-            </w:tcBorders>
-            <w:shd w:val="clear" w:color="auto" w:fill="FFFFFF"/>
-            <w:tcMar>
-              <w:top w:w="0" w:type="dxa"/>
-              <w:bottom w:w="0" w:type="dxa"/>
-              <w:left w:w="0" w:type="dxa"/>
-              <w:right w:w="0" w:type="dxa"/>
-            </w:tcMar>
-            <w:vAlign w:val="top"/>
-          </w:tcPr>
-          <w:p>
-            <w:pPr>
-              <w:pStyle w:val="Normal"/>
+        body 6
+        <w:tc>
+          <w:tcPr>
+            <w:tcBorders>
+              <w:bottom w:val="none" w:sz="0" w:space="0" w:color="000000"/>
+              <w:top w:val="none" w:sz="0" w:space="0" w:color="000000"/>
+              <w:left w:val="none" w:sz="0" w:space="0" w:color="000000"/>
+              <w:right w:val="none" w:sz="0" w:space="0" w:color="000000"/>
+            </w:tcBorders>
+            <w:shd w:val="clear" w:color="auto" w:fill="FFFFFF"/>
+            <w:tcMar>
+              <w:top w:w="0" w:type="dxa"/>
+              <w:bottom w:w="0" w:type="dxa"/>
+              <w:left w:w="0" w:type="dxa"/>
+              <w:right w:w="0" w:type="dxa"/>
+            </w:tcMar>
+            <w:vAlign w:val="top"/>
+          </w:tcPr>
+          <w:p>
+            <w:pPr>
               <w:jc w:val="left"/>
               <w:pBdr>
                 <w:bottom w:val="none" w:sz="0" w:space="0" w:color="000000"/>
@@ -763,19 +757,19 @@
               <w:spacing w:after="100" w:before="100" w:line="240"/>
               <w:ind w:left="300" w:right="100" w:firstLine="0" w:firstLineChars="0"/>
               <w:rPr>
-                <w:rFonts w:ascii="Helvetica" w:hAnsi="Helvetica" w:eastAsia="Helvetica" w:cs="Helvetica"/>
-                <w:i w:val="false"/>
-                <w:b w:val="false"/>
-                <w:u w:val="none"/>
-                <w:strike w:val="false"/>
-                <w:sz w:val="22"/>
-                <w:szCs w:val="22"/>
-                <w:color w:val="000000"/>
-              </w:rPr>
-            </w:pPr>
-            <w:r>
-              <w:rPr>
-                <w:rFonts w:ascii="Helvetica" w:hAnsi="Helvetica" w:eastAsia="Helvetica" w:cs="Helvetica"/>
+                <w:rFonts w:ascii="Arial" w:hAnsi="Arial" w:eastAsia="Arial" w:cs="Arial"/>
+                <w:i w:val="false"/>
+                <w:b w:val="false"/>
+                <w:u w:val="none"/>
+                <w:strike w:val="false"/>
+                <w:sz w:val="22"/>
+                <w:szCs w:val="22"/>
+                <w:color w:val="000000"/>
+              </w:rPr>
+            </w:pPr>
+            <w:r>
+              <w:rPr>
+                <w:rFonts w:ascii="Arial" w:hAnsi="Arial" w:eastAsia="Arial" w:cs="Arial"/>
                 <w:i w:val="false"/>
                 <w:b w:val="false"/>
                 <w:u w:val="none"/>
@@ -807,7 +801,6 @@
           </w:tcPr>
           <w:p>
             <w:pPr>
-              <w:pStyle w:val="Normal"/>
               <w:jc w:val="center"/>
               <w:pBdr>
                 <w:bottom w:val="none" w:sz="0" w:space="0" w:color="000000"/>
@@ -818,19 +811,19 @@
               <w:spacing w:after="100" w:before="100" w:line="240"/>
               <w:ind w:left="100" w:right="100" w:firstLine="0" w:firstLineChars="0"/>
               <w:rPr>
-                <w:rFonts w:ascii="Helvetica" w:hAnsi="Helvetica" w:eastAsia="Helvetica" w:cs="Helvetica"/>
-                <w:i w:val="false"/>
-                <w:b w:val="false"/>
-                <w:u w:val="none"/>
-                <w:strike w:val="false"/>
-                <w:sz w:val="22"/>
-                <w:szCs w:val="22"/>
-                <w:color w:val="000000"/>
-              </w:rPr>
-            </w:pPr>
-            <w:r>
-              <w:rPr>
-                <w:rFonts w:ascii="Helvetica" w:hAnsi="Helvetica" w:eastAsia="Helvetica" w:cs="Helvetica"/>
+                <w:rFonts w:ascii="Arial" w:hAnsi="Arial" w:eastAsia="Arial" w:cs="Arial"/>
+                <w:i w:val="false"/>
+                <w:b w:val="false"/>
+                <w:u w:val="none"/>
+                <w:strike w:val="false"/>
+                <w:sz w:val="22"/>
+                <w:szCs w:val="22"/>
+                <w:color w:val="000000"/>
+              </w:rPr>
+            </w:pPr>
+            <w:r>
+              <w:rPr>
+                <w:rFonts w:ascii="Arial" w:hAnsi="Arial" w:eastAsia="Arial" w:cs="Arial"/>
                 <w:i w:val="false"/>
                 <w:b w:val="false"/>
                 <w:u w:val="none"/>
@@ -846,28 +839,28 @@
       </w:tr>
       <w:tr>
         <w:trPr>
-          <w:trHeight w:val="608" w:hRule="auto"/>
+          <w:trHeight w:val="617" w:hRule="auto"/>
         </w:trPr>
-        <w:tc>
-          <w:tcPr>
-            <w:tcBorders>
-              <w:bottom w:val="none" w:sz="0" w:space="0" w:color="000000"/>
-              <w:top w:val="none" w:sz="0" w:space="0" w:color="000000"/>
-              <w:left w:val="none" w:sz="0" w:space="0" w:color="000000"/>
-              <w:right w:val="none" w:sz="0" w:space="0" w:color="000000"/>
-            </w:tcBorders>
-            <w:shd w:val="clear" w:color="auto" w:fill="FFFFFF"/>
-            <w:tcMar>
-              <w:top w:w="0" w:type="dxa"/>
-              <w:bottom w:w="0" w:type="dxa"/>
-              <w:left w:w="0" w:type="dxa"/>
-              <w:right w:w="0" w:type="dxa"/>
-            </w:tcMar>
-            <w:vAlign w:val="top"/>
-          </w:tcPr>
-          <w:p>
-            <w:pPr>
-              <w:pStyle w:val="Normal"/>
+        body 7
+        <w:tc>
+          <w:tcPr>
+            <w:tcBorders>
+              <w:bottom w:val="none" w:sz="0" w:space="0" w:color="000000"/>
+              <w:top w:val="none" w:sz="0" w:space="0" w:color="000000"/>
+              <w:left w:val="none" w:sz="0" w:space="0" w:color="000000"/>
+              <w:right w:val="none" w:sz="0" w:space="0" w:color="000000"/>
+            </w:tcBorders>
+            <w:shd w:val="clear" w:color="auto" w:fill="FFFFFF"/>
+            <w:tcMar>
+              <w:top w:w="0" w:type="dxa"/>
+              <w:bottom w:w="0" w:type="dxa"/>
+              <w:left w:w="0" w:type="dxa"/>
+              <w:right w:w="0" w:type="dxa"/>
+            </w:tcMar>
+            <w:vAlign w:val="top"/>
+          </w:tcPr>
+          <w:p>
+            <w:pPr>
               <w:jc w:val="left"/>
               <w:pBdr>
                 <w:bottom w:val="none" w:sz="0" w:space="0" w:color="000000"/>
@@ -878,19 +871,19 @@
               <w:spacing w:after="100" w:before="100" w:line="240"/>
               <w:ind w:left="300" w:right="100" w:firstLine="0" w:firstLineChars="0"/>
               <w:rPr>
-                <w:rFonts w:ascii="Helvetica" w:hAnsi="Helvetica" w:eastAsia="Helvetica" w:cs="Helvetica"/>
-                <w:i w:val="false"/>
-                <w:b w:val="false"/>
-                <w:u w:val="none"/>
-                <w:strike w:val="false"/>
-                <w:sz w:val="22"/>
-                <w:szCs w:val="22"/>
-                <w:color w:val="000000"/>
-              </w:rPr>
-            </w:pPr>
-            <w:r>
-              <w:rPr>
-                <w:rFonts w:ascii="Helvetica" w:hAnsi="Helvetica" w:eastAsia="Helvetica" w:cs="Helvetica"/>
+                <w:rFonts w:ascii="Arial" w:hAnsi="Arial" w:eastAsia="Arial" w:cs="Arial"/>
+                <w:i w:val="false"/>
+                <w:b w:val="false"/>
+                <w:u w:val="none"/>
+                <w:strike w:val="false"/>
+                <w:sz w:val="22"/>
+                <w:szCs w:val="22"/>
+                <w:color w:val="000000"/>
+              </w:rPr>
+            </w:pPr>
+            <w:r>
+              <w:rPr>
+                <w:rFonts w:ascii="Arial" w:hAnsi="Arial" w:eastAsia="Arial" w:cs="Arial"/>
                 <w:i w:val="false"/>
                 <w:b w:val="false"/>
                 <w:u w:val="none"/>
@@ -922,7 +915,6 @@
           </w:tcPr>
           <w:p>
             <w:pPr>
-              <w:pStyle w:val="Normal"/>
               <w:jc w:val="center"/>
               <w:pBdr>
                 <w:bottom w:val="none" w:sz="0" w:space="0" w:color="000000"/>
@@ -933,19 +925,19 @@
               <w:spacing w:after="100" w:before="100" w:line="240"/>
               <w:ind w:left="100" w:right="100" w:firstLine="0" w:firstLineChars="0"/>
               <w:rPr>
-                <w:rFonts w:ascii="Helvetica" w:hAnsi="Helvetica" w:eastAsia="Helvetica" w:cs="Helvetica"/>
-                <w:i w:val="false"/>
-                <w:b w:val="false"/>
-                <w:u w:val="none"/>
-                <w:strike w:val="false"/>
-                <w:sz w:val="22"/>
-                <w:szCs w:val="22"/>
-                <w:color w:val="000000"/>
-              </w:rPr>
-            </w:pPr>
-            <w:r>
-              <w:rPr>
-                <w:rFonts w:ascii="Helvetica" w:hAnsi="Helvetica" w:eastAsia="Helvetica" w:cs="Helvetica"/>
+                <w:rFonts w:ascii="Arial" w:hAnsi="Arial" w:eastAsia="Arial" w:cs="Arial"/>
+                <w:i w:val="false"/>
+                <w:b w:val="false"/>
+                <w:u w:val="none"/>
+                <w:strike w:val="false"/>
+                <w:sz w:val="22"/>
+                <w:szCs w:val="22"/>
+                <w:color w:val="000000"/>
+              </w:rPr>
+            </w:pPr>
+            <w:r>
+              <w:rPr>
+                <w:rFonts w:ascii="Arial" w:hAnsi="Arial" w:eastAsia="Arial" w:cs="Arial"/>
                 <w:i w:val="false"/>
                 <w:b w:val="false"/>
                 <w:u w:val="none"/>
@@ -961,28 +953,28 @@
       </w:tr>
       <w:tr>
         <w:trPr>
-          <w:trHeight w:val="608" w:hRule="auto"/>
+          <w:trHeight w:val="617" w:hRule="auto"/>
         </w:trPr>
-        <w:tc>
-          <w:tcPr>
-            <w:tcBorders>
-              <w:bottom w:val="none" w:sz="0" w:space="0" w:color="000000"/>
-              <w:top w:val="none" w:sz="0" w:space="0" w:color="000000"/>
-              <w:left w:val="none" w:sz="0" w:space="0" w:color="000000"/>
-              <w:right w:val="none" w:sz="0" w:space="0" w:color="000000"/>
-            </w:tcBorders>
-            <w:shd w:val="clear" w:color="auto" w:fill="FFFFFF"/>
-            <w:tcMar>
-              <w:top w:w="0" w:type="dxa"/>
-              <w:bottom w:w="0" w:type="dxa"/>
-              <w:left w:w="0" w:type="dxa"/>
-              <w:right w:w="0" w:type="dxa"/>
-            </w:tcMar>
-            <w:vAlign w:val="top"/>
-          </w:tcPr>
-          <w:p>
-            <w:pPr>
-              <w:pStyle w:val="Normal"/>
+        body 8
+        <w:tc>
+          <w:tcPr>
+            <w:tcBorders>
+              <w:bottom w:val="none" w:sz="0" w:space="0" w:color="000000"/>
+              <w:top w:val="none" w:sz="0" w:space="0" w:color="000000"/>
+              <w:left w:val="none" w:sz="0" w:space="0" w:color="000000"/>
+              <w:right w:val="none" w:sz="0" w:space="0" w:color="000000"/>
+            </w:tcBorders>
+            <w:shd w:val="clear" w:color="auto" w:fill="FFFFFF"/>
+            <w:tcMar>
+              <w:top w:w="0" w:type="dxa"/>
+              <w:bottom w:w="0" w:type="dxa"/>
+              <w:left w:w="0" w:type="dxa"/>
+              <w:right w:w="0" w:type="dxa"/>
+            </w:tcMar>
+            <w:vAlign w:val="top"/>
+          </w:tcPr>
+          <w:p>
+            <w:pPr>
               <w:jc w:val="left"/>
               <w:pBdr>
                 <w:bottom w:val="none" w:sz="0" w:space="0" w:color="000000"/>
@@ -993,19 +985,19 @@
               <w:spacing w:after="100" w:before="100" w:line="240"/>
               <w:ind w:left="300" w:right="100" w:firstLine="0" w:firstLineChars="0"/>
               <w:rPr>
-                <w:rFonts w:ascii="Helvetica" w:hAnsi="Helvetica" w:eastAsia="Helvetica" w:cs="Helvetica"/>
-                <w:i w:val="false"/>
-                <w:b w:val="false"/>
-                <w:u w:val="none"/>
-                <w:strike w:val="false"/>
-                <w:sz w:val="22"/>
-                <w:szCs w:val="22"/>
-                <w:color w:val="000000"/>
-              </w:rPr>
-            </w:pPr>
-            <w:r>
-              <w:rPr>
-                <w:rFonts w:ascii="Helvetica" w:hAnsi="Helvetica" w:eastAsia="Helvetica" w:cs="Helvetica"/>
+                <w:rFonts w:ascii="Arial" w:hAnsi="Arial" w:eastAsia="Arial" w:cs="Arial"/>
+                <w:i w:val="false"/>
+                <w:b w:val="false"/>
+                <w:u w:val="none"/>
+                <w:strike w:val="false"/>
+                <w:sz w:val="22"/>
+                <w:szCs w:val="22"/>
+                <w:color w:val="000000"/>
+              </w:rPr>
+            </w:pPr>
+            <w:r>
+              <w:rPr>
+                <w:rFonts w:ascii="Arial" w:hAnsi="Arial" w:eastAsia="Arial" w:cs="Arial"/>
                 <w:i w:val="false"/>
                 <w:b w:val="false"/>
                 <w:u w:val="none"/>
@@ -1037,7 +1029,6 @@
           </w:tcPr>
           <w:p>
             <w:pPr>
-              <w:pStyle w:val="Normal"/>
               <w:jc w:val="center"/>
               <w:pBdr>
                 <w:bottom w:val="none" w:sz="0" w:space="0" w:color="000000"/>
@@ -1048,19 +1039,19 @@
               <w:spacing w:after="100" w:before="100" w:line="240"/>
               <w:ind w:left="100" w:right="100" w:firstLine="0" w:firstLineChars="0"/>
               <w:rPr>
-                <w:rFonts w:ascii="Helvetica" w:hAnsi="Helvetica" w:eastAsia="Helvetica" w:cs="Helvetica"/>
-                <w:i w:val="false"/>
-                <w:b w:val="false"/>
-                <w:u w:val="none"/>
-                <w:strike w:val="false"/>
-                <w:sz w:val="22"/>
-                <w:szCs w:val="22"/>
-                <w:color w:val="000000"/>
-              </w:rPr>
-            </w:pPr>
-            <w:r>
-              <w:rPr>
-                <w:rFonts w:ascii="Helvetica" w:hAnsi="Helvetica" w:eastAsia="Helvetica" w:cs="Helvetica"/>
+                <w:rFonts w:ascii="Arial" w:hAnsi="Arial" w:eastAsia="Arial" w:cs="Arial"/>
+                <w:i w:val="false"/>
+                <w:b w:val="false"/>
+                <w:u w:val="none"/>
+                <w:strike w:val="false"/>
+                <w:sz w:val="22"/>
+                <w:szCs w:val="22"/>
+                <w:color w:val="000000"/>
+              </w:rPr>
+            </w:pPr>
+            <w:r>
+              <w:rPr>
+                <w:rFonts w:ascii="Arial" w:hAnsi="Arial" w:eastAsia="Arial" w:cs="Arial"/>
                 <w:i w:val="false"/>
                 <w:b w:val="false"/>
                 <w:u w:val="none"/>
@@ -1076,28 +1067,28 @@
       </w:tr>
       <w:tr>
         <w:trPr>
-          <w:trHeight w:val="608" w:hRule="auto"/>
+          <w:trHeight w:val="617" w:hRule="auto"/>
         </w:trPr>
-        <w:tc>
-          <w:tcPr>
-            <w:tcBorders>
-              <w:bottom w:val="none" w:sz="0" w:space="0" w:color="000000"/>
-              <w:top w:val="none" w:sz="0" w:space="0" w:color="000000"/>
-              <w:left w:val="none" w:sz="0" w:space="0" w:color="000000"/>
-              <w:right w:val="none" w:sz="0" w:space="0" w:color="000000"/>
-            </w:tcBorders>
-            <w:shd w:val="clear" w:color="auto" w:fill="FFFFFF"/>
-            <w:tcMar>
-              <w:top w:w="0" w:type="dxa"/>
-              <w:bottom w:w="0" w:type="dxa"/>
-              <w:left w:w="0" w:type="dxa"/>
-              <w:right w:w="0" w:type="dxa"/>
-            </w:tcMar>
-            <w:vAlign w:val="top"/>
-          </w:tcPr>
-          <w:p>
-            <w:pPr>
-              <w:pStyle w:val="Normal"/>
+        body 9
+        <w:tc>
+          <w:tcPr>
+            <w:tcBorders>
+              <w:bottom w:val="none" w:sz="0" w:space="0" w:color="000000"/>
+              <w:top w:val="none" w:sz="0" w:space="0" w:color="000000"/>
+              <w:left w:val="none" w:sz="0" w:space="0" w:color="000000"/>
+              <w:right w:val="none" w:sz="0" w:space="0" w:color="000000"/>
+            </w:tcBorders>
+            <w:shd w:val="clear" w:color="auto" w:fill="FFFFFF"/>
+            <w:tcMar>
+              <w:top w:w="0" w:type="dxa"/>
+              <w:bottom w:w="0" w:type="dxa"/>
+              <w:left w:w="0" w:type="dxa"/>
+              <w:right w:w="0" w:type="dxa"/>
+            </w:tcMar>
+            <w:vAlign w:val="top"/>
+          </w:tcPr>
+          <w:p>
+            <w:pPr>
               <w:jc w:val="left"/>
               <w:pBdr>
                 <w:bottom w:val="none" w:sz="0" w:space="0" w:color="000000"/>
@@ -1108,19 +1099,19 @@
               <w:spacing w:after="100" w:before="100" w:line="240"/>
               <w:ind w:left="300" w:right="100" w:firstLine="0" w:firstLineChars="0"/>
               <w:rPr>
-                <w:rFonts w:ascii="Helvetica" w:hAnsi="Helvetica" w:eastAsia="Helvetica" w:cs="Helvetica"/>
-                <w:i w:val="false"/>
-                <w:b w:val="false"/>
-                <w:u w:val="none"/>
-                <w:strike w:val="false"/>
-                <w:sz w:val="22"/>
-                <w:szCs w:val="22"/>
-                <w:color w:val="000000"/>
-              </w:rPr>
-            </w:pPr>
-            <w:r>
-              <w:rPr>
-                <w:rFonts w:ascii="Helvetica" w:hAnsi="Helvetica" w:eastAsia="Helvetica" w:cs="Helvetica"/>
+                <w:rFonts w:ascii="Arial" w:hAnsi="Arial" w:eastAsia="Arial" w:cs="Arial"/>
+                <w:i w:val="false"/>
+                <w:b w:val="false"/>
+                <w:u w:val="none"/>
+                <w:strike w:val="false"/>
+                <w:sz w:val="22"/>
+                <w:szCs w:val="22"/>
+                <w:color w:val="000000"/>
+              </w:rPr>
+            </w:pPr>
+            <w:r>
+              <w:rPr>
+                <w:rFonts w:ascii="Arial" w:hAnsi="Arial" w:eastAsia="Arial" w:cs="Arial"/>
                 <w:i w:val="false"/>
                 <w:b w:val="false"/>
                 <w:u w:val="none"/>
@@ -1152,7 +1143,6 @@
           </w:tcPr>
           <w:p>
             <w:pPr>
-              <w:pStyle w:val="Normal"/>
               <w:jc w:val="center"/>
               <w:pBdr>
                 <w:bottom w:val="none" w:sz="0" w:space="0" w:color="000000"/>
@@ -1163,19 +1153,19 @@
               <w:spacing w:after="100" w:before="100" w:line="240"/>
               <w:ind w:left="100" w:right="100" w:firstLine="0" w:firstLineChars="0"/>
               <w:rPr>
-                <w:rFonts w:ascii="Helvetica" w:hAnsi="Helvetica" w:eastAsia="Helvetica" w:cs="Helvetica"/>
-                <w:i w:val="false"/>
-                <w:b w:val="false"/>
-                <w:u w:val="none"/>
-                <w:strike w:val="false"/>
-                <w:sz w:val="22"/>
-                <w:szCs w:val="22"/>
-                <w:color w:val="000000"/>
-              </w:rPr>
-            </w:pPr>
-            <w:r>
-              <w:rPr>
-                <w:rFonts w:ascii="Helvetica" w:hAnsi="Helvetica" w:eastAsia="Helvetica" w:cs="Helvetica"/>
+                <w:rFonts w:ascii="Arial" w:hAnsi="Arial" w:eastAsia="Arial" w:cs="Arial"/>
+                <w:i w:val="false"/>
+                <w:b w:val="false"/>
+                <w:u w:val="none"/>
+                <w:strike w:val="false"/>
+                <w:sz w:val="22"/>
+                <w:szCs w:val="22"/>
+                <w:color w:val="000000"/>
+              </w:rPr>
+            </w:pPr>
+            <w:r>
+              <w:rPr>
+                <w:rFonts w:ascii="Arial" w:hAnsi="Arial" w:eastAsia="Arial" w:cs="Arial"/>
                 <w:i w:val="false"/>
                 <w:b w:val="false"/>
                 <w:u w:val="none"/>
@@ -1191,28 +1181,28 @@
       </w:tr>
       <w:tr>
         <w:trPr>
-          <w:trHeight w:val="608" w:hRule="auto"/>
+          <w:trHeight w:val="617" w:hRule="auto"/>
         </w:trPr>
-        <w:tc>
-          <w:tcPr>
-            <w:tcBorders>
-              <w:bottom w:val="none" w:sz="0" w:space="0" w:color="000000"/>
-              <w:top w:val="none" w:sz="0" w:space="0" w:color="000000"/>
-              <w:left w:val="none" w:sz="0" w:space="0" w:color="000000"/>
-              <w:right w:val="none" w:sz="0" w:space="0" w:color="000000"/>
-            </w:tcBorders>
-            <w:shd w:val="clear" w:color="auto" w:fill="FFFFFF"/>
-            <w:tcMar>
-              <w:top w:w="0" w:type="dxa"/>
-              <w:bottom w:w="0" w:type="dxa"/>
-              <w:left w:w="0" w:type="dxa"/>
-              <w:right w:w="0" w:type="dxa"/>
-            </w:tcMar>
-            <w:vAlign w:val="top"/>
-          </w:tcPr>
-          <w:p>
-            <w:pPr>
-              <w:pStyle w:val="Normal"/>
+        body10
+        <w:tc>
+          <w:tcPr>
+            <w:tcBorders>
+              <w:bottom w:val="none" w:sz="0" w:space="0" w:color="000000"/>
+              <w:top w:val="none" w:sz="0" w:space="0" w:color="000000"/>
+              <w:left w:val="none" w:sz="0" w:space="0" w:color="000000"/>
+              <w:right w:val="none" w:sz="0" w:space="0" w:color="000000"/>
+            </w:tcBorders>
+            <w:shd w:val="clear" w:color="auto" w:fill="FFFFFF"/>
+            <w:tcMar>
+              <w:top w:w="0" w:type="dxa"/>
+              <w:bottom w:w="0" w:type="dxa"/>
+              <w:left w:w="0" w:type="dxa"/>
+              <w:right w:w="0" w:type="dxa"/>
+            </w:tcMar>
+            <w:vAlign w:val="top"/>
+          </w:tcPr>
+          <w:p>
+            <w:pPr>
               <w:jc w:val="left"/>
               <w:pBdr>
                 <w:bottom w:val="none" w:sz="0" w:space="0" w:color="000000"/>
@@ -1223,7 +1213,7 @@
               <w:spacing w:after="100" w:before="100" w:line="240"/>
               <w:ind w:left="100" w:right="100" w:firstLine="0" w:firstLineChars="0"/>
               <w:rPr>
-                <w:rFonts w:ascii="Helvetica" w:hAnsi="Helvetica" w:eastAsia="Helvetica" w:cs="Helvetica"/>
+                <w:rFonts w:ascii="Arial" w:hAnsi="Arial" w:eastAsia="Arial" w:cs="Arial"/>
                 <w:i w:val="false"/>
                 <w:b w:val="true"/>
                 <w:u w:val="none"/>
@@ -1235,7 +1225,7 @@
             </w:pPr>
             <w:r>
               <w:rPr>
-                <w:rFonts w:ascii="Helvetica" w:hAnsi="Helvetica" w:eastAsia="Helvetica" w:cs="Helvetica"/>
+                <w:rFonts w:ascii="Arial" w:hAnsi="Arial" w:eastAsia="Arial" w:cs="Arial"/>
                 <w:i w:val="false"/>
                 <w:b w:val="true"/>
                 <w:u w:val="none"/>
@@ -1267,7 +1257,6 @@
           </w:tcPr>
           <w:p>
             <w:pPr>
-              <w:pStyle w:val="Normal"/>
               <w:jc w:val="center"/>
               <w:pBdr>
                 <w:bottom w:val="none" w:sz="0" w:space="0" w:color="000000"/>
@@ -1278,19 +1267,19 @@
               <w:spacing w:after="100" w:before="100" w:line="240"/>
               <w:ind w:left="100" w:right="100" w:firstLine="0" w:firstLineChars="0"/>
               <w:rPr>
-                <w:rFonts w:ascii="Helvetica" w:hAnsi="Helvetica" w:eastAsia="Helvetica" w:cs="Helvetica"/>
-                <w:i w:val="false"/>
-                <w:b w:val="false"/>
-                <w:u w:val="none"/>
-                <w:strike w:val="false"/>
-                <w:sz w:val="22"/>
-                <w:szCs w:val="22"/>
-                <w:color w:val="000000"/>
-              </w:rPr>
-            </w:pPr>
-            <w:r>
-              <w:rPr>
-                <w:rFonts w:ascii="Helvetica" w:hAnsi="Helvetica" w:eastAsia="Helvetica" w:cs="Helvetica"/>
+                <w:rFonts w:ascii="Arial" w:hAnsi="Arial" w:eastAsia="Arial" w:cs="Arial"/>
+                <w:i w:val="false"/>
+                <w:b w:val="false"/>
+                <w:u w:val="none"/>
+                <w:strike w:val="false"/>
+                <w:sz w:val="22"/>
+                <w:szCs w:val="22"/>
+                <w:color w:val="000000"/>
+              </w:rPr>
+            </w:pPr>
+            <w:r>
+              <w:rPr>
+                <w:rFonts w:ascii="Arial" w:hAnsi="Arial" w:eastAsia="Arial" w:cs="Arial"/>
                 <w:i w:val="false"/>
                 <w:b w:val="false"/>
                 <w:u w:val="none"/>
@@ -1306,28 +1295,28 @@
       </w:tr>
       <w:tr>
         <w:trPr>
-          <w:trHeight w:val="608" w:hRule="auto"/>
+          <w:trHeight w:val="617" w:hRule="auto"/>
         </w:trPr>
-        <w:tc>
-          <w:tcPr>
-            <w:tcBorders>
-              <w:bottom w:val="none" w:sz="0" w:space="0" w:color="000000"/>
-              <w:top w:val="none" w:sz="0" w:space="0" w:color="000000"/>
-              <w:left w:val="none" w:sz="0" w:space="0" w:color="000000"/>
-              <w:right w:val="none" w:sz="0" w:space="0" w:color="000000"/>
-            </w:tcBorders>
-            <w:shd w:val="clear" w:color="auto" w:fill="FFFFFF"/>
-            <w:tcMar>
-              <w:top w:w="0" w:type="dxa"/>
-              <w:bottom w:w="0" w:type="dxa"/>
-              <w:left w:w="0" w:type="dxa"/>
-              <w:right w:w="0" w:type="dxa"/>
-            </w:tcMar>
-            <w:vAlign w:val="top"/>
-          </w:tcPr>
-          <w:p>
-            <w:pPr>
-              <w:pStyle w:val="Normal"/>
+        body11
+        <w:tc>
+          <w:tcPr>
+            <w:tcBorders>
+              <w:bottom w:val="none" w:sz="0" w:space="0" w:color="000000"/>
+              <w:top w:val="none" w:sz="0" w:space="0" w:color="000000"/>
+              <w:left w:val="none" w:sz="0" w:space="0" w:color="000000"/>
+              <w:right w:val="none" w:sz="0" w:space="0" w:color="000000"/>
+            </w:tcBorders>
+            <w:shd w:val="clear" w:color="auto" w:fill="FFFFFF"/>
+            <w:tcMar>
+              <w:top w:w="0" w:type="dxa"/>
+              <w:bottom w:w="0" w:type="dxa"/>
+              <w:left w:w="0" w:type="dxa"/>
+              <w:right w:w="0" w:type="dxa"/>
+            </w:tcMar>
+            <w:vAlign w:val="top"/>
+          </w:tcPr>
+          <w:p>
+            <w:pPr>
               <w:jc w:val="left"/>
               <w:pBdr>
                 <w:bottom w:val="none" w:sz="0" w:space="0" w:color="000000"/>
@@ -1338,19 +1327,19 @@
               <w:spacing w:after="100" w:before="100" w:line="240"/>
               <w:ind w:left="300" w:right="100" w:firstLine="0" w:firstLineChars="0"/>
               <w:rPr>
-                <w:rFonts w:ascii="Helvetica" w:hAnsi="Helvetica" w:eastAsia="Helvetica" w:cs="Helvetica"/>
-                <w:i w:val="false"/>
-                <w:b w:val="false"/>
-                <w:u w:val="none"/>
-                <w:strike w:val="false"/>
-                <w:sz w:val="22"/>
-                <w:szCs w:val="22"/>
-                <w:color w:val="000000"/>
-              </w:rPr>
-            </w:pPr>
-            <w:r>
-              <w:rPr>
-                <w:rFonts w:ascii="Helvetica" w:hAnsi="Helvetica" w:eastAsia="Helvetica" w:cs="Helvetica"/>
+                <w:rFonts w:ascii="Arial" w:hAnsi="Arial" w:eastAsia="Arial" w:cs="Arial"/>
+                <w:i w:val="false"/>
+                <w:b w:val="false"/>
+                <w:u w:val="none"/>
+                <w:strike w:val="false"/>
+                <w:sz w:val="22"/>
+                <w:szCs w:val="22"/>
+                <w:color w:val="000000"/>
+              </w:rPr>
+            </w:pPr>
+            <w:r>
+              <w:rPr>
+                <w:rFonts w:ascii="Arial" w:hAnsi="Arial" w:eastAsia="Arial" w:cs="Arial"/>
                 <w:i w:val="false"/>
                 <w:b w:val="false"/>
                 <w:u w:val="none"/>
@@ -1382,7 +1371,6 @@
           </w:tcPr>
           <w:p>
             <w:pPr>
-              <w:pStyle w:val="Normal"/>
               <w:jc w:val="center"/>
               <w:pBdr>
                 <w:bottom w:val="none" w:sz="0" w:space="0" w:color="000000"/>
@@ -1393,19 +1381,19 @@
               <w:spacing w:after="100" w:before="100" w:line="240"/>
               <w:ind w:left="100" w:right="100" w:firstLine="0" w:firstLineChars="0"/>
               <w:rPr>
-                <w:rFonts w:ascii="Helvetica" w:hAnsi="Helvetica" w:eastAsia="Helvetica" w:cs="Helvetica"/>
-                <w:i w:val="false"/>
-                <w:b w:val="false"/>
-                <w:u w:val="none"/>
-                <w:strike w:val="false"/>
-                <w:sz w:val="22"/>
-                <w:szCs w:val="22"/>
-                <w:color w:val="000000"/>
-              </w:rPr>
-            </w:pPr>
-            <w:r>
-              <w:rPr>
-                <w:rFonts w:ascii="Helvetica" w:hAnsi="Helvetica" w:eastAsia="Helvetica" w:cs="Helvetica"/>
+                <w:rFonts w:ascii="Arial" w:hAnsi="Arial" w:eastAsia="Arial" w:cs="Arial"/>
+                <w:i w:val="false"/>
+                <w:b w:val="false"/>
+                <w:u w:val="none"/>
+                <w:strike w:val="false"/>
+                <w:sz w:val="22"/>
+                <w:szCs w:val="22"/>
+                <w:color w:val="000000"/>
+              </w:rPr>
+            </w:pPr>
+            <w:r>
+              <w:rPr>
+                <w:rFonts w:ascii="Arial" w:hAnsi="Arial" w:eastAsia="Arial" w:cs="Arial"/>
                 <w:i w:val="false"/>
                 <w:b w:val="false"/>
                 <w:u w:val="none"/>
@@ -1421,28 +1409,28 @@
       </w:tr>
       <w:tr>
         <w:trPr>
-          <w:trHeight w:val="608" w:hRule="auto"/>
+          <w:trHeight w:val="617" w:hRule="auto"/>
         </w:trPr>
-        <w:tc>
-          <w:tcPr>
-            <w:tcBorders>
-              <w:bottom w:val="none" w:sz="0" w:space="0" w:color="000000"/>
-              <w:top w:val="none" w:sz="0" w:space="0" w:color="000000"/>
-              <w:left w:val="none" w:sz="0" w:space="0" w:color="000000"/>
-              <w:right w:val="none" w:sz="0" w:space="0" w:color="000000"/>
-            </w:tcBorders>
-            <w:shd w:val="clear" w:color="auto" w:fill="FFFFFF"/>
-            <w:tcMar>
-              <w:top w:w="0" w:type="dxa"/>
-              <w:bottom w:w="0" w:type="dxa"/>
-              <w:left w:w="0" w:type="dxa"/>
-              <w:right w:w="0" w:type="dxa"/>
-            </w:tcMar>
-            <w:vAlign w:val="top"/>
-          </w:tcPr>
-          <w:p>
-            <w:pPr>
-              <w:pStyle w:val="Normal"/>
+        body12
+        <w:tc>
+          <w:tcPr>
+            <w:tcBorders>
+              <w:bottom w:val="none" w:sz="0" w:space="0" w:color="000000"/>
+              <w:top w:val="none" w:sz="0" w:space="0" w:color="000000"/>
+              <w:left w:val="none" w:sz="0" w:space="0" w:color="000000"/>
+              <w:right w:val="none" w:sz="0" w:space="0" w:color="000000"/>
+            </w:tcBorders>
+            <w:shd w:val="clear" w:color="auto" w:fill="FFFFFF"/>
+            <w:tcMar>
+              <w:top w:w="0" w:type="dxa"/>
+              <w:bottom w:w="0" w:type="dxa"/>
+              <w:left w:w="0" w:type="dxa"/>
+              <w:right w:w="0" w:type="dxa"/>
+            </w:tcMar>
+            <w:vAlign w:val="top"/>
+          </w:tcPr>
+          <w:p>
+            <w:pPr>
               <w:jc w:val="left"/>
               <w:pBdr>
                 <w:bottom w:val="none" w:sz="0" w:space="0" w:color="000000"/>
@@ -1453,19 +1441,19 @@
               <w:spacing w:after="100" w:before="100" w:line="240"/>
               <w:ind w:left="300" w:right="100" w:firstLine="0" w:firstLineChars="0"/>
               <w:rPr>
-                <w:rFonts w:ascii="Helvetica" w:hAnsi="Helvetica" w:eastAsia="Helvetica" w:cs="Helvetica"/>
-                <w:i w:val="false"/>
-                <w:b w:val="false"/>
-                <w:u w:val="none"/>
-                <w:strike w:val="false"/>
-                <w:sz w:val="22"/>
-                <w:szCs w:val="22"/>
-                <w:color w:val="000000"/>
-              </w:rPr>
-            </w:pPr>
-            <w:r>
-              <w:rPr>
-                <w:rFonts w:ascii="Helvetica" w:hAnsi="Helvetica" w:eastAsia="Helvetica" w:cs="Helvetica"/>
+                <w:rFonts w:ascii="Arial" w:hAnsi="Arial" w:eastAsia="Arial" w:cs="Arial"/>
+                <w:i w:val="false"/>
+                <w:b w:val="false"/>
+                <w:u w:val="none"/>
+                <w:strike w:val="false"/>
+                <w:sz w:val="22"/>
+                <w:szCs w:val="22"/>
+                <w:color w:val="000000"/>
+              </w:rPr>
+            </w:pPr>
+            <w:r>
+              <w:rPr>
+                <w:rFonts w:ascii="Arial" w:hAnsi="Arial" w:eastAsia="Arial" w:cs="Arial"/>
                 <w:i w:val="false"/>
                 <w:b w:val="false"/>
                 <w:u w:val="none"/>
@@ -1497,7 +1485,6 @@
           </w:tcPr>
           <w:p>
             <w:pPr>
-              <w:pStyle w:val="Normal"/>
               <w:jc w:val="center"/>
               <w:pBdr>
                 <w:bottom w:val="none" w:sz="0" w:space="0" w:color="000000"/>
@@ -1508,19 +1495,19 @@
               <w:spacing w:after="100" w:before="100" w:line="240"/>
               <w:ind w:left="100" w:right="100" w:firstLine="0" w:firstLineChars="0"/>
               <w:rPr>
-                <w:rFonts w:ascii="Helvetica" w:hAnsi="Helvetica" w:eastAsia="Helvetica" w:cs="Helvetica"/>
-                <w:i w:val="false"/>
-                <w:b w:val="false"/>
-                <w:u w:val="none"/>
-                <w:strike w:val="false"/>
-                <w:sz w:val="22"/>
-                <w:szCs w:val="22"/>
-                <w:color w:val="000000"/>
-              </w:rPr>
-            </w:pPr>
-            <w:r>
-              <w:rPr>
-                <w:rFonts w:ascii="Helvetica" w:hAnsi="Helvetica" w:eastAsia="Helvetica" w:cs="Helvetica"/>
+                <w:rFonts w:ascii="Arial" w:hAnsi="Arial" w:eastAsia="Arial" w:cs="Arial"/>
+                <w:i w:val="false"/>
+                <w:b w:val="false"/>
+                <w:u w:val="none"/>
+                <w:strike w:val="false"/>
+                <w:sz w:val="22"/>
+                <w:szCs w:val="22"/>
+                <w:color w:val="000000"/>
+              </w:rPr>
+            </w:pPr>
+            <w:r>
+              <w:rPr>
+                <w:rFonts w:ascii="Arial" w:hAnsi="Arial" w:eastAsia="Arial" w:cs="Arial"/>
                 <w:i w:val="false"/>
                 <w:b w:val="false"/>
                 <w:u w:val="none"/>
@@ -1536,28 +1523,28 @@
       </w:tr>
       <w:tr>
         <w:trPr>
-          <w:trHeight w:val="608" w:hRule="auto"/>
+          <w:trHeight w:val="617" w:hRule="auto"/>
         </w:trPr>
-        <w:tc>
-          <w:tcPr>
-            <w:tcBorders>
-              <w:bottom w:val="none" w:sz="0" w:space="0" w:color="000000"/>
-              <w:top w:val="none" w:sz="0" w:space="0" w:color="000000"/>
-              <w:left w:val="none" w:sz="0" w:space="0" w:color="000000"/>
-              <w:right w:val="none" w:sz="0" w:space="0" w:color="000000"/>
-            </w:tcBorders>
-            <w:shd w:val="clear" w:color="auto" w:fill="FFFFFF"/>
-            <w:tcMar>
-              <w:top w:w="0" w:type="dxa"/>
-              <w:bottom w:w="0" w:type="dxa"/>
-              <w:left w:w="0" w:type="dxa"/>
-              <w:right w:w="0" w:type="dxa"/>
-            </w:tcMar>
-            <w:vAlign w:val="top"/>
-          </w:tcPr>
-          <w:p>
-            <w:pPr>
-              <w:pStyle w:val="Normal"/>
+        body13
+        <w:tc>
+          <w:tcPr>
+            <w:tcBorders>
+              <w:bottom w:val="none" w:sz="0" w:space="0" w:color="000000"/>
+              <w:top w:val="none" w:sz="0" w:space="0" w:color="000000"/>
+              <w:left w:val="none" w:sz="0" w:space="0" w:color="000000"/>
+              <w:right w:val="none" w:sz="0" w:space="0" w:color="000000"/>
+            </w:tcBorders>
+            <w:shd w:val="clear" w:color="auto" w:fill="FFFFFF"/>
+            <w:tcMar>
+              <w:top w:w="0" w:type="dxa"/>
+              <w:bottom w:w="0" w:type="dxa"/>
+              <w:left w:w="0" w:type="dxa"/>
+              <w:right w:w="0" w:type="dxa"/>
+            </w:tcMar>
+            <w:vAlign w:val="top"/>
+          </w:tcPr>
+          <w:p>
+            <w:pPr>
               <w:jc w:val="left"/>
               <w:pBdr>
                 <w:bottom w:val="none" w:sz="0" w:space="0" w:color="000000"/>
@@ -1568,19 +1555,19 @@
               <w:spacing w:after="100" w:before="100" w:line="240"/>
               <w:ind w:left="300" w:right="100" w:firstLine="0" w:firstLineChars="0"/>
               <w:rPr>
-                <w:rFonts w:ascii="Helvetica" w:hAnsi="Helvetica" w:eastAsia="Helvetica" w:cs="Helvetica"/>
-                <w:i w:val="false"/>
-                <w:b w:val="false"/>
-                <w:u w:val="none"/>
-                <w:strike w:val="false"/>
-                <w:sz w:val="22"/>
-                <w:szCs w:val="22"/>
-                <w:color w:val="000000"/>
-              </w:rPr>
-            </w:pPr>
-            <w:r>
-              <w:rPr>
-                <w:rFonts w:ascii="Helvetica" w:hAnsi="Helvetica" w:eastAsia="Helvetica" w:cs="Helvetica"/>
+                <w:rFonts w:ascii="Arial" w:hAnsi="Arial" w:eastAsia="Arial" w:cs="Arial"/>
+                <w:i w:val="false"/>
+                <w:b w:val="false"/>
+                <w:u w:val="none"/>
+                <w:strike w:val="false"/>
+                <w:sz w:val="22"/>
+                <w:szCs w:val="22"/>
+                <w:color w:val="000000"/>
+              </w:rPr>
+            </w:pPr>
+            <w:r>
+              <w:rPr>
+                <w:rFonts w:ascii="Arial" w:hAnsi="Arial" w:eastAsia="Arial" w:cs="Arial"/>
                 <w:i w:val="false"/>
                 <w:b w:val="false"/>
                 <w:u w:val="none"/>
@@ -1612,7 +1599,6 @@
           </w:tcPr>
           <w:p>
             <w:pPr>
-              <w:pStyle w:val="Normal"/>
               <w:jc w:val="center"/>
               <w:pBdr>
                 <w:bottom w:val="none" w:sz="0" w:space="0" w:color="000000"/>
@@ -1623,19 +1609,19 @@
               <w:spacing w:after="100" w:before="100" w:line="240"/>
               <w:ind w:left="100" w:right="100" w:firstLine="0" w:firstLineChars="0"/>
               <w:rPr>
-                <w:rFonts w:ascii="Helvetica" w:hAnsi="Helvetica" w:eastAsia="Helvetica" w:cs="Helvetica"/>
-                <w:i w:val="false"/>
-                <w:b w:val="false"/>
-                <w:u w:val="none"/>
-                <w:strike w:val="false"/>
-                <w:sz w:val="22"/>
-                <w:szCs w:val="22"/>
-                <w:color w:val="000000"/>
-              </w:rPr>
-            </w:pPr>
-            <w:r>
-              <w:rPr>
-                <w:rFonts w:ascii="Helvetica" w:hAnsi="Helvetica" w:eastAsia="Helvetica" w:cs="Helvetica"/>
+                <w:rFonts w:ascii="Arial" w:hAnsi="Arial" w:eastAsia="Arial" w:cs="Arial"/>
+                <w:i w:val="false"/>
+                <w:b w:val="false"/>
+                <w:u w:val="none"/>
+                <w:strike w:val="false"/>
+                <w:sz w:val="22"/>
+                <w:szCs w:val="22"/>
+                <w:color w:val="000000"/>
+              </w:rPr>
+            </w:pPr>
+            <w:r>
+              <w:rPr>
+                <w:rFonts w:ascii="Arial" w:hAnsi="Arial" w:eastAsia="Arial" w:cs="Arial"/>
                 <w:i w:val="false"/>
                 <w:b w:val="false"/>
                 <w:u w:val="none"/>
@@ -1651,28 +1637,28 @@
       </w:tr>
       <w:tr>
         <w:trPr>
-          <w:trHeight w:val="608" w:hRule="auto"/>
+          <w:trHeight w:val="617" w:hRule="auto"/>
         </w:trPr>
-        <w:tc>
-          <w:tcPr>
-            <w:tcBorders>
-              <w:bottom w:val="none" w:sz="0" w:space="0" w:color="000000"/>
-              <w:top w:val="none" w:sz="0" w:space="0" w:color="000000"/>
-              <w:left w:val="none" w:sz="0" w:space="0" w:color="000000"/>
-              <w:right w:val="none" w:sz="0" w:space="0" w:color="000000"/>
-            </w:tcBorders>
-            <w:shd w:val="clear" w:color="auto" w:fill="FFFFFF"/>
-            <w:tcMar>
-              <w:top w:w="0" w:type="dxa"/>
-              <w:bottom w:w="0" w:type="dxa"/>
-              <w:left w:w="0" w:type="dxa"/>
-              <w:right w:w="0" w:type="dxa"/>
-            </w:tcMar>
-            <w:vAlign w:val="top"/>
-          </w:tcPr>
-          <w:p>
-            <w:pPr>
-              <w:pStyle w:val="Normal"/>
+        body14
+        <w:tc>
+          <w:tcPr>
+            <w:tcBorders>
+              <w:bottom w:val="none" w:sz="0" w:space="0" w:color="000000"/>
+              <w:top w:val="none" w:sz="0" w:space="0" w:color="000000"/>
+              <w:left w:val="none" w:sz="0" w:space="0" w:color="000000"/>
+              <w:right w:val="none" w:sz="0" w:space="0" w:color="000000"/>
+            </w:tcBorders>
+            <w:shd w:val="clear" w:color="auto" w:fill="FFFFFF"/>
+            <w:tcMar>
+              <w:top w:w="0" w:type="dxa"/>
+              <w:bottom w:w="0" w:type="dxa"/>
+              <w:left w:w="0" w:type="dxa"/>
+              <w:right w:w="0" w:type="dxa"/>
+            </w:tcMar>
+            <w:vAlign w:val="top"/>
+          </w:tcPr>
+          <w:p>
+            <w:pPr>
               <w:jc w:val="left"/>
               <w:pBdr>
                 <w:bottom w:val="none" w:sz="0" w:space="0" w:color="000000"/>
@@ -1683,19 +1669,19 @@
               <w:spacing w:after="100" w:before="100" w:line="240"/>
               <w:ind w:left="300" w:right="100" w:firstLine="0" w:firstLineChars="0"/>
               <w:rPr>
-                <w:rFonts w:ascii="Helvetica" w:hAnsi="Helvetica" w:eastAsia="Helvetica" w:cs="Helvetica"/>
-                <w:i w:val="false"/>
-                <w:b w:val="false"/>
-                <w:u w:val="none"/>
-                <w:strike w:val="false"/>
-                <w:sz w:val="22"/>
-                <w:szCs w:val="22"/>
-                <w:color w:val="000000"/>
-              </w:rPr>
-            </w:pPr>
-            <w:r>
-              <w:rPr>
-                <w:rFonts w:ascii="Helvetica" w:hAnsi="Helvetica" w:eastAsia="Helvetica" w:cs="Helvetica"/>
+                <w:rFonts w:ascii="Arial" w:hAnsi="Arial" w:eastAsia="Arial" w:cs="Arial"/>
+                <w:i w:val="false"/>
+                <w:b w:val="false"/>
+                <w:u w:val="none"/>
+                <w:strike w:val="false"/>
+                <w:sz w:val="22"/>
+                <w:szCs w:val="22"/>
+                <w:color w:val="000000"/>
+              </w:rPr>
+            </w:pPr>
+            <w:r>
+              <w:rPr>
+                <w:rFonts w:ascii="Arial" w:hAnsi="Arial" w:eastAsia="Arial" w:cs="Arial"/>
                 <w:i w:val="false"/>
                 <w:b w:val="false"/>
                 <w:u w:val="none"/>
@@ -1727,7 +1713,6 @@
           </w:tcPr>
           <w:p>
             <w:pPr>
-              <w:pStyle w:val="Normal"/>
               <w:jc w:val="center"/>
               <w:pBdr>
                 <w:bottom w:val="none" w:sz="0" w:space="0" w:color="000000"/>
@@ -1738,19 +1723,19 @@
               <w:spacing w:after="100" w:before="100" w:line="240"/>
               <w:ind w:left="100" w:right="100" w:firstLine="0" w:firstLineChars="0"/>
               <w:rPr>
-                <w:rFonts w:ascii="Helvetica" w:hAnsi="Helvetica" w:eastAsia="Helvetica" w:cs="Helvetica"/>
-                <w:i w:val="false"/>
-                <w:b w:val="false"/>
-                <w:u w:val="none"/>
-                <w:strike w:val="false"/>
-                <w:sz w:val="22"/>
-                <w:szCs w:val="22"/>
-                <w:color w:val="000000"/>
-              </w:rPr>
-            </w:pPr>
-            <w:r>
-              <w:rPr>
-                <w:rFonts w:ascii="Helvetica" w:hAnsi="Helvetica" w:eastAsia="Helvetica" w:cs="Helvetica"/>
+                <w:rFonts w:ascii="Arial" w:hAnsi="Arial" w:eastAsia="Arial" w:cs="Arial"/>
+                <w:i w:val="false"/>
+                <w:b w:val="false"/>
+                <w:u w:val="none"/>
+                <w:strike w:val="false"/>
+                <w:sz w:val="22"/>
+                <w:szCs w:val="22"/>
+                <w:color w:val="000000"/>
+              </w:rPr>
+            </w:pPr>
+            <w:r>
+              <w:rPr>
+                <w:rFonts w:ascii="Arial" w:hAnsi="Arial" w:eastAsia="Arial" w:cs="Arial"/>
                 <w:i w:val="false"/>
                 <w:b w:val="false"/>
                 <w:u w:val="none"/>
@@ -1766,28 +1751,28 @@
       </w:tr>
       <w:tr>
         <w:trPr>
-          <w:trHeight w:val="608" w:hRule="auto"/>
+          <w:trHeight w:val="617" w:hRule="auto"/>
         </w:trPr>
-        <w:tc>
-          <w:tcPr>
-            <w:tcBorders>
-              <w:bottom w:val="none" w:sz="0" w:space="0" w:color="000000"/>
-              <w:top w:val="none" w:sz="0" w:space="0" w:color="000000"/>
-              <w:left w:val="none" w:sz="0" w:space="0" w:color="000000"/>
-              <w:right w:val="none" w:sz="0" w:space="0" w:color="000000"/>
-            </w:tcBorders>
-            <w:shd w:val="clear" w:color="auto" w:fill="FFFFFF"/>
-            <w:tcMar>
-              <w:top w:w="0" w:type="dxa"/>
-              <w:bottom w:w="0" w:type="dxa"/>
-              <w:left w:w="0" w:type="dxa"/>
-              <w:right w:w="0" w:type="dxa"/>
-            </w:tcMar>
-            <w:vAlign w:val="top"/>
-          </w:tcPr>
-          <w:p>
-            <w:pPr>
-              <w:pStyle w:val="Normal"/>
+        body15
+        <w:tc>
+          <w:tcPr>
+            <w:tcBorders>
+              <w:bottom w:val="none" w:sz="0" w:space="0" w:color="000000"/>
+              <w:top w:val="none" w:sz="0" w:space="0" w:color="000000"/>
+              <w:left w:val="none" w:sz="0" w:space="0" w:color="000000"/>
+              <w:right w:val="none" w:sz="0" w:space="0" w:color="000000"/>
+            </w:tcBorders>
+            <w:shd w:val="clear" w:color="auto" w:fill="FFFFFF"/>
+            <w:tcMar>
+              <w:top w:w="0" w:type="dxa"/>
+              <w:bottom w:w="0" w:type="dxa"/>
+              <w:left w:w="0" w:type="dxa"/>
+              <w:right w:w="0" w:type="dxa"/>
+            </w:tcMar>
+            <w:vAlign w:val="top"/>
+          </w:tcPr>
+          <w:p>
+            <w:pPr>
               <w:jc w:val="left"/>
               <w:pBdr>
                 <w:bottom w:val="none" w:sz="0" w:space="0" w:color="000000"/>
@@ -1798,7 +1783,7 @@
               <w:spacing w:after="100" w:before="100" w:line="240"/>
               <w:ind w:left="100" w:right="100" w:firstLine="0" w:firstLineChars="0"/>
               <w:rPr>
-                <w:rFonts w:ascii="Helvetica" w:hAnsi="Helvetica" w:eastAsia="Helvetica" w:cs="Helvetica"/>
+                <w:rFonts w:ascii="Arial" w:hAnsi="Arial" w:eastAsia="Arial" w:cs="Arial"/>
                 <w:i w:val="false"/>
                 <w:b w:val="true"/>
                 <w:u w:val="none"/>
@@ -1810,7 +1795,7 @@
             </w:pPr>
             <w:r>
               <w:rPr>
-                <w:rFonts w:ascii="Helvetica" w:hAnsi="Helvetica" w:eastAsia="Helvetica" w:cs="Helvetica"/>
+                <w:rFonts w:ascii="Arial" w:hAnsi="Arial" w:eastAsia="Arial" w:cs="Arial"/>
                 <w:i w:val="false"/>
                 <w:b w:val="true"/>
                 <w:u w:val="none"/>
@@ -1842,7 +1827,6 @@
           </w:tcPr>
           <w:p>
             <w:pPr>
-              <w:pStyle w:val="Normal"/>
               <w:jc w:val="center"/>
               <w:pBdr>
                 <w:bottom w:val="none" w:sz="0" w:space="0" w:color="000000"/>
@@ -1853,19 +1837,19 @@
               <w:spacing w:after="100" w:before="100" w:line="240"/>
               <w:ind w:left="100" w:right="100" w:firstLine="0" w:firstLineChars="0"/>
               <w:rPr>
-                <w:rFonts w:ascii="Helvetica" w:hAnsi="Helvetica" w:eastAsia="Helvetica" w:cs="Helvetica"/>
-                <w:i w:val="false"/>
-                <w:b w:val="false"/>
-                <w:u w:val="none"/>
-                <w:strike w:val="false"/>
-                <w:sz w:val="22"/>
-                <w:szCs w:val="22"/>
-                <w:color w:val="000000"/>
-              </w:rPr>
-            </w:pPr>
-            <w:r>
-              <w:rPr>
-                <w:rFonts w:ascii="Helvetica" w:hAnsi="Helvetica" w:eastAsia="Helvetica" w:cs="Helvetica"/>
+                <w:rFonts w:ascii="Arial" w:hAnsi="Arial" w:eastAsia="Arial" w:cs="Arial"/>
+                <w:i w:val="false"/>
+                <w:b w:val="false"/>
+                <w:u w:val="none"/>
+                <w:strike w:val="false"/>
+                <w:sz w:val="22"/>
+                <w:szCs w:val="22"/>
+                <w:color w:val="000000"/>
+              </w:rPr>
+            </w:pPr>
+            <w:r>
+              <w:rPr>
+                <w:rFonts w:ascii="Arial" w:hAnsi="Arial" w:eastAsia="Arial" w:cs="Arial"/>
                 <w:i w:val="false"/>
                 <w:b w:val="false"/>
                 <w:u w:val="none"/>
@@ -1881,28 +1865,28 @@
       </w:tr>
       <w:tr>
         <w:trPr>
-          <w:trHeight w:val="608" w:hRule="auto"/>
+          <w:trHeight w:val="617" w:hRule="auto"/>
         </w:trPr>
-        <w:tc>
-          <w:tcPr>
-            <w:tcBorders>
-              <w:bottom w:val="none" w:sz="0" w:space="0" w:color="000000"/>
-              <w:top w:val="none" w:sz="0" w:space="0" w:color="000000"/>
-              <w:left w:val="none" w:sz="0" w:space="0" w:color="000000"/>
-              <w:right w:val="none" w:sz="0" w:space="0" w:color="000000"/>
-            </w:tcBorders>
-            <w:shd w:val="clear" w:color="auto" w:fill="FFFFFF"/>
-            <w:tcMar>
-              <w:top w:w="0" w:type="dxa"/>
-              <w:bottom w:w="0" w:type="dxa"/>
-              <w:left w:w="0" w:type="dxa"/>
-              <w:right w:w="0" w:type="dxa"/>
-            </w:tcMar>
-            <w:vAlign w:val="top"/>
-          </w:tcPr>
-          <w:p>
-            <w:pPr>
-              <w:pStyle w:val="Normal"/>
+        body16
+        <w:tc>
+          <w:tcPr>
+            <w:tcBorders>
+              <w:bottom w:val="none" w:sz="0" w:space="0" w:color="000000"/>
+              <w:top w:val="none" w:sz="0" w:space="0" w:color="000000"/>
+              <w:left w:val="none" w:sz="0" w:space="0" w:color="000000"/>
+              <w:right w:val="none" w:sz="0" w:space="0" w:color="000000"/>
+            </w:tcBorders>
+            <w:shd w:val="clear" w:color="auto" w:fill="FFFFFF"/>
+            <w:tcMar>
+              <w:top w:w="0" w:type="dxa"/>
+              <w:bottom w:w="0" w:type="dxa"/>
+              <w:left w:w="0" w:type="dxa"/>
+              <w:right w:w="0" w:type="dxa"/>
+            </w:tcMar>
+            <w:vAlign w:val="top"/>
+          </w:tcPr>
+          <w:p>
+            <w:pPr>
               <w:jc w:val="left"/>
               <w:pBdr>
                 <w:bottom w:val="none" w:sz="0" w:space="0" w:color="000000"/>
@@ -1913,19 +1897,19 @@
               <w:spacing w:after="100" w:before="100" w:line="240"/>
               <w:ind w:left="300" w:right="100" w:firstLine="0" w:firstLineChars="0"/>
               <w:rPr>
-                <w:rFonts w:ascii="Helvetica" w:hAnsi="Helvetica" w:eastAsia="Helvetica" w:cs="Helvetica"/>
-                <w:i w:val="false"/>
-                <w:b w:val="false"/>
-                <w:u w:val="none"/>
-                <w:strike w:val="false"/>
-                <w:sz w:val="22"/>
-                <w:szCs w:val="22"/>
-                <w:color w:val="000000"/>
-              </w:rPr>
-            </w:pPr>
-            <w:r>
-              <w:rPr>
-                <w:rFonts w:ascii="Helvetica" w:hAnsi="Helvetica" w:eastAsia="Helvetica" w:cs="Helvetica"/>
+                <w:rFonts w:ascii="Arial" w:hAnsi="Arial" w:eastAsia="Arial" w:cs="Arial"/>
+                <w:i w:val="false"/>
+                <w:b w:val="false"/>
+                <w:u w:val="none"/>
+                <w:strike w:val="false"/>
+                <w:sz w:val="22"/>
+                <w:szCs w:val="22"/>
+                <w:color w:val="000000"/>
+              </w:rPr>
+            </w:pPr>
+            <w:r>
+              <w:rPr>
+                <w:rFonts w:ascii="Arial" w:hAnsi="Arial" w:eastAsia="Arial" w:cs="Arial"/>
                 <w:i w:val="false"/>
                 <w:b w:val="false"/>
                 <w:u w:val="none"/>
@@ -1957,7 +1941,6 @@
           </w:tcPr>
           <w:p>
             <w:pPr>
-              <w:pStyle w:val="Normal"/>
               <w:jc w:val="center"/>
               <w:pBdr>
                 <w:bottom w:val="none" w:sz="0" w:space="0" w:color="000000"/>
@@ -1968,19 +1951,19 @@
               <w:spacing w:after="100" w:before="100" w:line="240"/>
               <w:ind w:left="100" w:right="100" w:firstLine="0" w:firstLineChars="0"/>
               <w:rPr>
-                <w:rFonts w:ascii="Helvetica" w:hAnsi="Helvetica" w:eastAsia="Helvetica" w:cs="Helvetica"/>
-                <w:i w:val="false"/>
-                <w:b w:val="false"/>
-                <w:u w:val="none"/>
-                <w:strike w:val="false"/>
-                <w:sz w:val="22"/>
-                <w:szCs w:val="22"/>
-                <w:color w:val="000000"/>
-              </w:rPr>
-            </w:pPr>
-            <w:r>
-              <w:rPr>
-                <w:rFonts w:ascii="Helvetica" w:hAnsi="Helvetica" w:eastAsia="Helvetica" w:cs="Helvetica"/>
+                <w:rFonts w:ascii="Arial" w:hAnsi="Arial" w:eastAsia="Arial" w:cs="Arial"/>
+                <w:i w:val="false"/>
+                <w:b w:val="false"/>
+                <w:u w:val="none"/>
+                <w:strike w:val="false"/>
+                <w:sz w:val="22"/>
+                <w:szCs w:val="22"/>
+                <w:color w:val="000000"/>
+              </w:rPr>
+            </w:pPr>
+            <w:r>
+              <w:rPr>
+                <w:rFonts w:ascii="Arial" w:hAnsi="Arial" w:eastAsia="Arial" w:cs="Arial"/>
                 <w:i w:val="false"/>
                 <w:b w:val="false"/>
                 <w:u w:val="none"/>
@@ -1996,28 +1979,28 @@
       </w:tr>
       <w:tr>
         <w:trPr>
-          <w:trHeight w:val="608" w:hRule="auto"/>
+          <w:trHeight w:val="617" w:hRule="auto"/>
         </w:trPr>
-        <w:tc>
-          <w:tcPr>
-            <w:tcBorders>
-              <w:bottom w:val="none" w:sz="0" w:space="0" w:color="000000"/>
-              <w:top w:val="none" w:sz="0" w:space="0" w:color="000000"/>
-              <w:left w:val="none" w:sz="0" w:space="0" w:color="000000"/>
-              <w:right w:val="none" w:sz="0" w:space="0" w:color="000000"/>
-            </w:tcBorders>
-            <w:shd w:val="clear" w:color="auto" w:fill="FFFFFF"/>
-            <w:tcMar>
-              <w:top w:w="0" w:type="dxa"/>
-              <w:bottom w:w="0" w:type="dxa"/>
-              <w:left w:w="0" w:type="dxa"/>
-              <w:right w:w="0" w:type="dxa"/>
-            </w:tcMar>
-            <w:vAlign w:val="top"/>
-          </w:tcPr>
-          <w:p>
-            <w:pPr>
-              <w:pStyle w:val="Normal"/>
+        body17
+        <w:tc>
+          <w:tcPr>
+            <w:tcBorders>
+              <w:bottom w:val="none" w:sz="0" w:space="0" w:color="000000"/>
+              <w:top w:val="none" w:sz="0" w:space="0" w:color="000000"/>
+              <w:left w:val="none" w:sz="0" w:space="0" w:color="000000"/>
+              <w:right w:val="none" w:sz="0" w:space="0" w:color="000000"/>
+            </w:tcBorders>
+            <w:shd w:val="clear" w:color="auto" w:fill="FFFFFF"/>
+            <w:tcMar>
+              <w:top w:w="0" w:type="dxa"/>
+              <w:bottom w:w="0" w:type="dxa"/>
+              <w:left w:w="0" w:type="dxa"/>
+              <w:right w:w="0" w:type="dxa"/>
+            </w:tcMar>
+            <w:vAlign w:val="top"/>
+          </w:tcPr>
+          <w:p>
+            <w:pPr>
               <w:jc w:val="left"/>
               <w:pBdr>
                 <w:bottom w:val="none" w:sz="0" w:space="0" w:color="000000"/>
@@ -2028,19 +2011,19 @@
               <w:spacing w:after="100" w:before="100" w:line="240"/>
               <w:ind w:left="300" w:right="100" w:firstLine="0" w:firstLineChars="0"/>
               <w:rPr>
-                <w:rFonts w:ascii="Helvetica" w:hAnsi="Helvetica" w:eastAsia="Helvetica" w:cs="Helvetica"/>
-                <w:i w:val="false"/>
-                <w:b w:val="false"/>
-                <w:u w:val="none"/>
-                <w:strike w:val="false"/>
-                <w:sz w:val="22"/>
-                <w:szCs w:val="22"/>
-                <w:color w:val="000000"/>
-              </w:rPr>
-            </w:pPr>
-            <w:r>
-              <w:rPr>
-                <w:rFonts w:ascii="Helvetica" w:hAnsi="Helvetica" w:eastAsia="Helvetica" w:cs="Helvetica"/>
+                <w:rFonts w:ascii="Arial" w:hAnsi="Arial" w:eastAsia="Arial" w:cs="Arial"/>
+                <w:i w:val="false"/>
+                <w:b w:val="false"/>
+                <w:u w:val="none"/>
+                <w:strike w:val="false"/>
+                <w:sz w:val="22"/>
+                <w:szCs w:val="22"/>
+                <w:color w:val="000000"/>
+              </w:rPr>
+            </w:pPr>
+            <w:r>
+              <w:rPr>
+                <w:rFonts w:ascii="Arial" w:hAnsi="Arial" w:eastAsia="Arial" w:cs="Arial"/>
                 <w:i w:val="false"/>
                 <w:b w:val="false"/>
                 <w:u w:val="none"/>
@@ -2072,7 +2055,6 @@
           </w:tcPr>
           <w:p>
             <w:pPr>
-              <w:pStyle w:val="Normal"/>
               <w:jc w:val="center"/>
               <w:pBdr>
                 <w:bottom w:val="none" w:sz="0" w:space="0" w:color="000000"/>
@@ -2083,19 +2065,19 @@
               <w:spacing w:after="100" w:before="100" w:line="240"/>
               <w:ind w:left="100" w:right="100" w:firstLine="0" w:firstLineChars="0"/>
               <w:rPr>
-                <w:rFonts w:ascii="Helvetica" w:hAnsi="Helvetica" w:eastAsia="Helvetica" w:cs="Helvetica"/>
-                <w:i w:val="false"/>
-                <w:b w:val="false"/>
-                <w:u w:val="none"/>
-                <w:strike w:val="false"/>
-                <w:sz w:val="22"/>
-                <w:szCs w:val="22"/>
-                <w:color w:val="000000"/>
-              </w:rPr>
-            </w:pPr>
-            <w:r>
-              <w:rPr>
-                <w:rFonts w:ascii="Helvetica" w:hAnsi="Helvetica" w:eastAsia="Helvetica" w:cs="Helvetica"/>
+                <w:rFonts w:ascii="Arial" w:hAnsi="Arial" w:eastAsia="Arial" w:cs="Arial"/>
+                <w:i w:val="false"/>
+                <w:b w:val="false"/>
+                <w:u w:val="none"/>
+                <w:strike w:val="false"/>
+                <w:sz w:val="22"/>
+                <w:szCs w:val="22"/>
+                <w:color w:val="000000"/>
+              </w:rPr>
+            </w:pPr>
+            <w:r>
+              <w:rPr>
+                <w:rFonts w:ascii="Arial" w:hAnsi="Arial" w:eastAsia="Arial" w:cs="Arial"/>
                 <w:i w:val="false"/>
                 <w:b w:val="false"/>
                 <w:u w:val="none"/>
@@ -2111,28 +2093,28 @@
       </w:tr>
       <w:tr>
         <w:trPr>
-          <w:trHeight w:val="608" w:hRule="auto"/>
+          <w:trHeight w:val="617" w:hRule="auto"/>
         </w:trPr>
-        <w:tc>
-          <w:tcPr>
-            <w:tcBorders>
-              <w:bottom w:val="none" w:sz="0" w:space="0" w:color="000000"/>
-              <w:top w:val="none" w:sz="0" w:space="0" w:color="000000"/>
-              <w:left w:val="none" w:sz="0" w:space="0" w:color="000000"/>
-              <w:right w:val="none" w:sz="0" w:space="0" w:color="000000"/>
-            </w:tcBorders>
-            <w:shd w:val="clear" w:color="auto" w:fill="FFFFFF"/>
-            <w:tcMar>
-              <w:top w:w="0" w:type="dxa"/>
-              <w:bottom w:w="0" w:type="dxa"/>
-              <w:left w:w="0" w:type="dxa"/>
-              <w:right w:w="0" w:type="dxa"/>
-            </w:tcMar>
-            <w:vAlign w:val="top"/>
-          </w:tcPr>
-          <w:p>
-            <w:pPr>
-              <w:pStyle w:val="Normal"/>
+        body18
+        <w:tc>
+          <w:tcPr>
+            <w:tcBorders>
+              <w:bottom w:val="none" w:sz="0" w:space="0" w:color="000000"/>
+              <w:top w:val="none" w:sz="0" w:space="0" w:color="000000"/>
+              <w:left w:val="none" w:sz="0" w:space="0" w:color="000000"/>
+              <w:right w:val="none" w:sz="0" w:space="0" w:color="000000"/>
+            </w:tcBorders>
+            <w:shd w:val="clear" w:color="auto" w:fill="FFFFFF"/>
+            <w:tcMar>
+              <w:top w:w="0" w:type="dxa"/>
+              <w:bottom w:w="0" w:type="dxa"/>
+              <w:left w:w="0" w:type="dxa"/>
+              <w:right w:w="0" w:type="dxa"/>
+            </w:tcMar>
+            <w:vAlign w:val="top"/>
+          </w:tcPr>
+          <w:p>
+            <w:pPr>
               <w:jc w:val="left"/>
               <w:pBdr>
                 <w:bottom w:val="none" w:sz="0" w:space="0" w:color="000000"/>
@@ -2143,19 +2125,19 @@
               <w:spacing w:after="100" w:before="100" w:line="240"/>
               <w:ind w:left="300" w:right="100" w:firstLine="0" w:firstLineChars="0"/>
               <w:rPr>
-                <w:rFonts w:ascii="Helvetica" w:hAnsi="Helvetica" w:eastAsia="Helvetica" w:cs="Helvetica"/>
-                <w:i w:val="false"/>
-                <w:b w:val="false"/>
-                <w:u w:val="none"/>
-                <w:strike w:val="false"/>
-                <w:sz w:val="22"/>
-                <w:szCs w:val="22"/>
-                <w:color w:val="000000"/>
-              </w:rPr>
-            </w:pPr>
-            <w:r>
-              <w:rPr>
-                <w:rFonts w:ascii="Helvetica" w:hAnsi="Helvetica" w:eastAsia="Helvetica" w:cs="Helvetica"/>
+                <w:rFonts w:ascii="Arial" w:hAnsi="Arial" w:eastAsia="Arial" w:cs="Arial"/>
+                <w:i w:val="false"/>
+                <w:b w:val="false"/>
+                <w:u w:val="none"/>
+                <w:strike w:val="false"/>
+                <w:sz w:val="22"/>
+                <w:szCs w:val="22"/>
+                <w:color w:val="000000"/>
+              </w:rPr>
+            </w:pPr>
+            <w:r>
+              <w:rPr>
+                <w:rFonts w:ascii="Arial" w:hAnsi="Arial" w:eastAsia="Arial" w:cs="Arial"/>
                 <w:i w:val="false"/>
                 <w:b w:val="false"/>
                 <w:u w:val="none"/>
@@ -2187,7 +2169,6 @@
           </w:tcPr>
           <w:p>
             <w:pPr>
-              <w:pStyle w:val="Normal"/>
               <w:jc w:val="center"/>
               <w:pBdr>
                 <w:bottom w:val="none" w:sz="0" w:space="0" w:color="000000"/>
@@ -2198,19 +2179,19 @@
               <w:spacing w:after="100" w:before="100" w:line="240"/>
               <w:ind w:left="100" w:right="100" w:firstLine="0" w:firstLineChars="0"/>
               <w:rPr>
-                <w:rFonts w:ascii="Helvetica" w:hAnsi="Helvetica" w:eastAsia="Helvetica" w:cs="Helvetica"/>
-                <w:i w:val="false"/>
-                <w:b w:val="false"/>
-                <w:u w:val="none"/>
-                <w:strike w:val="false"/>
-                <w:sz w:val="22"/>
-                <w:szCs w:val="22"/>
-                <w:color w:val="000000"/>
-              </w:rPr>
-            </w:pPr>
-            <w:r>
-              <w:rPr>
-                <w:rFonts w:ascii="Helvetica" w:hAnsi="Helvetica" w:eastAsia="Helvetica" w:cs="Helvetica"/>
+                <w:rFonts w:ascii="Arial" w:hAnsi="Arial" w:eastAsia="Arial" w:cs="Arial"/>
+                <w:i w:val="false"/>
+                <w:b w:val="false"/>
+                <w:u w:val="none"/>
+                <w:strike w:val="false"/>
+                <w:sz w:val="22"/>
+                <w:szCs w:val="22"/>
+                <w:color w:val="000000"/>
+              </w:rPr>
+            </w:pPr>
+            <w:r>
+              <w:rPr>
+                <w:rFonts w:ascii="Arial" w:hAnsi="Arial" w:eastAsia="Arial" w:cs="Arial"/>
                 <w:i w:val="false"/>
                 <w:b w:val="false"/>
                 <w:u w:val="none"/>
@@ -2226,28 +2207,28 @@
       </w:tr>
       <w:tr>
         <w:trPr>
-          <w:trHeight w:val="608" w:hRule="auto"/>
+          <w:trHeight w:val="617" w:hRule="auto"/>
         </w:trPr>
-        <w:tc>
-          <w:tcPr>
-            <w:tcBorders>
-              <w:bottom w:val="none" w:sz="0" w:space="0" w:color="000000"/>
-              <w:top w:val="none" w:sz="0" w:space="0" w:color="000000"/>
-              <w:left w:val="none" w:sz="0" w:space="0" w:color="000000"/>
-              <w:right w:val="none" w:sz="0" w:space="0" w:color="000000"/>
-            </w:tcBorders>
-            <w:shd w:val="clear" w:color="auto" w:fill="FFFFFF"/>
-            <w:tcMar>
-              <w:top w:w="0" w:type="dxa"/>
-              <w:bottom w:w="0" w:type="dxa"/>
-              <w:left w:w="0" w:type="dxa"/>
-              <w:right w:w="0" w:type="dxa"/>
-            </w:tcMar>
-            <w:vAlign w:val="top"/>
-          </w:tcPr>
-          <w:p>
-            <w:pPr>
-              <w:pStyle w:val="Normal"/>
+        body19
+        <w:tc>
+          <w:tcPr>
+            <w:tcBorders>
+              <w:bottom w:val="none" w:sz="0" w:space="0" w:color="000000"/>
+              <w:top w:val="none" w:sz="0" w:space="0" w:color="000000"/>
+              <w:left w:val="none" w:sz="0" w:space="0" w:color="000000"/>
+              <w:right w:val="none" w:sz="0" w:space="0" w:color="000000"/>
+            </w:tcBorders>
+            <w:shd w:val="clear" w:color="auto" w:fill="FFFFFF"/>
+            <w:tcMar>
+              <w:top w:w="0" w:type="dxa"/>
+              <w:bottom w:w="0" w:type="dxa"/>
+              <w:left w:w="0" w:type="dxa"/>
+              <w:right w:w="0" w:type="dxa"/>
+            </w:tcMar>
+            <w:vAlign w:val="top"/>
+          </w:tcPr>
+          <w:p>
+            <w:pPr>
               <w:jc w:val="left"/>
               <w:pBdr>
                 <w:bottom w:val="none" w:sz="0" w:space="0" w:color="000000"/>
@@ -2258,19 +2239,19 @@
               <w:spacing w:after="100" w:before="100" w:line="240"/>
               <w:ind w:left="300" w:right="100" w:firstLine="0" w:firstLineChars="0"/>
               <w:rPr>
-                <w:rFonts w:ascii="Helvetica" w:hAnsi="Helvetica" w:eastAsia="Helvetica" w:cs="Helvetica"/>
-                <w:i w:val="false"/>
-                <w:b w:val="false"/>
-                <w:u w:val="none"/>
-                <w:strike w:val="false"/>
-                <w:sz w:val="22"/>
-                <w:szCs w:val="22"/>
-                <w:color w:val="000000"/>
-              </w:rPr>
-            </w:pPr>
-            <w:r>
-              <w:rPr>
-                <w:rFonts w:ascii="Helvetica" w:hAnsi="Helvetica" w:eastAsia="Helvetica" w:cs="Helvetica"/>
+                <w:rFonts w:ascii="Arial" w:hAnsi="Arial" w:eastAsia="Arial" w:cs="Arial"/>
+                <w:i w:val="false"/>
+                <w:b w:val="false"/>
+                <w:u w:val="none"/>
+                <w:strike w:val="false"/>
+                <w:sz w:val="22"/>
+                <w:szCs w:val="22"/>
+                <w:color w:val="000000"/>
+              </w:rPr>
+            </w:pPr>
+            <w:r>
+              <w:rPr>
+                <w:rFonts w:ascii="Arial" w:hAnsi="Arial" w:eastAsia="Arial" w:cs="Arial"/>
                 <w:i w:val="false"/>
                 <w:b w:val="false"/>
                 <w:u w:val="none"/>
@@ -2302,7 +2283,6 @@
           </w:tcPr>
           <w:p>
             <w:pPr>
-              <w:pStyle w:val="Normal"/>
               <w:jc w:val="center"/>
               <w:pBdr>
                 <w:bottom w:val="none" w:sz="0" w:space="0" w:color="000000"/>
@@ -2313,19 +2293,19 @@
               <w:spacing w:after="100" w:before="100" w:line="240"/>
               <w:ind w:left="100" w:right="100" w:firstLine="0" w:firstLineChars="0"/>
               <w:rPr>
-                <w:rFonts w:ascii="Helvetica" w:hAnsi="Helvetica" w:eastAsia="Helvetica" w:cs="Helvetica"/>
-                <w:i w:val="false"/>
-                <w:b w:val="false"/>
-                <w:u w:val="none"/>
-                <w:strike w:val="false"/>
-                <w:sz w:val="22"/>
-                <w:szCs w:val="22"/>
-                <w:color w:val="000000"/>
-              </w:rPr>
-            </w:pPr>
-            <w:r>
-              <w:rPr>
-                <w:rFonts w:ascii="Helvetica" w:hAnsi="Helvetica" w:eastAsia="Helvetica" w:cs="Helvetica"/>
+                <w:rFonts w:ascii="Arial" w:hAnsi="Arial" w:eastAsia="Arial" w:cs="Arial"/>
+                <w:i w:val="false"/>
+                <w:b w:val="false"/>
+                <w:u w:val="none"/>
+                <w:strike w:val="false"/>
+                <w:sz w:val="22"/>
+                <w:szCs w:val="22"/>
+                <w:color w:val="000000"/>
+              </w:rPr>
+            </w:pPr>
+            <w:r>
+              <w:rPr>
+                <w:rFonts w:ascii="Arial" w:hAnsi="Arial" w:eastAsia="Arial" w:cs="Arial"/>
                 <w:i w:val="false"/>
                 <w:b w:val="false"/>
                 <w:u w:val="none"/>
@@ -2341,28 +2321,28 @@
       </w:tr>
       <w:tr>
         <w:trPr>
-          <w:trHeight w:val="608" w:hRule="auto"/>
+          <w:trHeight w:val="617" w:hRule="auto"/>
         </w:trPr>
-        <w:tc>
-          <w:tcPr>
-            <w:tcBorders>
-              <w:bottom w:val="none" w:sz="0" w:space="0" w:color="000000"/>
-              <w:top w:val="none" w:sz="0" w:space="0" w:color="000000"/>
-              <w:left w:val="none" w:sz="0" w:space="0" w:color="000000"/>
-              <w:right w:val="none" w:sz="0" w:space="0" w:color="000000"/>
-            </w:tcBorders>
-            <w:shd w:val="clear" w:color="auto" w:fill="FFFFFF"/>
-            <w:tcMar>
-              <w:top w:w="0" w:type="dxa"/>
-              <w:bottom w:w="0" w:type="dxa"/>
-              <w:left w:w="0" w:type="dxa"/>
-              <w:right w:w="0" w:type="dxa"/>
-            </w:tcMar>
-            <w:vAlign w:val="top"/>
-          </w:tcPr>
-          <w:p>
-            <w:pPr>
-              <w:pStyle w:val="Normal"/>
+        body20
+        <w:tc>
+          <w:tcPr>
+            <w:tcBorders>
+              <w:bottom w:val="none" w:sz="0" w:space="0" w:color="000000"/>
+              <w:top w:val="none" w:sz="0" w:space="0" w:color="000000"/>
+              <w:left w:val="none" w:sz="0" w:space="0" w:color="000000"/>
+              <w:right w:val="none" w:sz="0" w:space="0" w:color="000000"/>
+            </w:tcBorders>
+            <w:shd w:val="clear" w:color="auto" w:fill="FFFFFF"/>
+            <w:tcMar>
+              <w:top w:w="0" w:type="dxa"/>
+              <w:bottom w:w="0" w:type="dxa"/>
+              <w:left w:w="0" w:type="dxa"/>
+              <w:right w:w="0" w:type="dxa"/>
+            </w:tcMar>
+            <w:vAlign w:val="top"/>
+          </w:tcPr>
+          <w:p>
+            <w:pPr>
               <w:jc w:val="left"/>
               <w:pBdr>
                 <w:bottom w:val="none" w:sz="0" w:space="0" w:color="000000"/>
@@ -2373,7 +2353,7 @@
               <w:spacing w:after="100" w:before="100" w:line="240"/>
               <w:ind w:left="100" w:right="100" w:firstLine="0" w:firstLineChars="0"/>
               <w:rPr>
-                <w:rFonts w:ascii="Helvetica" w:hAnsi="Helvetica" w:eastAsia="Helvetica" w:cs="Helvetica"/>
+                <w:rFonts w:ascii="Arial" w:hAnsi="Arial" w:eastAsia="Arial" w:cs="Arial"/>
                 <w:i w:val="false"/>
                 <w:b w:val="true"/>
                 <w:u w:val="none"/>
@@ -2385,7 +2365,7 @@
             </w:pPr>
             <w:r>
               <w:rPr>
-                <w:rFonts w:ascii="Helvetica" w:hAnsi="Helvetica" w:eastAsia="Helvetica" w:cs="Helvetica"/>
+                <w:rFonts w:ascii="Arial" w:hAnsi="Arial" w:eastAsia="Arial" w:cs="Arial"/>
                 <w:i w:val="false"/>
                 <w:b w:val="true"/>
                 <w:u w:val="none"/>
@@ -2417,7 +2397,6 @@
           </w:tcPr>
           <w:p>
             <w:pPr>
-              <w:pStyle w:val="Normal"/>
               <w:jc w:val="center"/>
               <w:pBdr>
                 <w:bottom w:val="none" w:sz="0" w:space="0" w:color="000000"/>
@@ -2428,19 +2407,19 @@
               <w:spacing w:after="100" w:before="100" w:line="240"/>
               <w:ind w:left="100" w:right="100" w:firstLine="0" w:firstLineChars="0"/>
               <w:rPr>
-                <w:rFonts w:ascii="Helvetica" w:hAnsi="Helvetica" w:eastAsia="Helvetica" w:cs="Helvetica"/>
-                <w:i w:val="false"/>
-                <w:b w:val="false"/>
-                <w:u w:val="none"/>
-                <w:strike w:val="false"/>
-                <w:sz w:val="22"/>
-                <w:szCs w:val="22"/>
-                <w:color w:val="000000"/>
-              </w:rPr>
-            </w:pPr>
-            <w:r>
-              <w:rPr>
-                <w:rFonts w:ascii="Helvetica" w:hAnsi="Helvetica" w:eastAsia="Helvetica" w:cs="Helvetica"/>
+                <w:rFonts w:ascii="Arial" w:hAnsi="Arial" w:eastAsia="Arial" w:cs="Arial"/>
+                <w:i w:val="false"/>
+                <w:b w:val="false"/>
+                <w:u w:val="none"/>
+                <w:strike w:val="false"/>
+                <w:sz w:val="22"/>
+                <w:szCs w:val="22"/>
+                <w:color w:val="000000"/>
+              </w:rPr>
+            </w:pPr>
+            <w:r>
+              <w:rPr>
+                <w:rFonts w:ascii="Arial" w:hAnsi="Arial" w:eastAsia="Arial" w:cs="Arial"/>
                 <w:i w:val="false"/>
                 <w:b w:val="false"/>
                 <w:u w:val="none"/>
@@ -2456,28 +2435,28 @@
       </w:tr>
       <w:tr>
         <w:trPr>
-          <w:trHeight w:val="608" w:hRule="auto"/>
+          <w:trHeight w:val="617" w:hRule="auto"/>
         </w:trPr>
-        <w:tc>
-          <w:tcPr>
-            <w:tcBorders>
-              <w:bottom w:val="none" w:sz="0" w:space="0" w:color="000000"/>
-              <w:top w:val="none" w:sz="0" w:space="0" w:color="000000"/>
-              <w:left w:val="none" w:sz="0" w:space="0" w:color="000000"/>
-              <w:right w:val="none" w:sz="0" w:space="0" w:color="000000"/>
-            </w:tcBorders>
-            <w:shd w:val="clear" w:color="auto" w:fill="FFFFFF"/>
-            <w:tcMar>
-              <w:top w:w="0" w:type="dxa"/>
-              <w:bottom w:w="0" w:type="dxa"/>
-              <w:left w:w="0" w:type="dxa"/>
-              <w:right w:w="0" w:type="dxa"/>
-            </w:tcMar>
-            <w:vAlign w:val="top"/>
-          </w:tcPr>
-          <w:p>
-            <w:pPr>
-              <w:pStyle w:val="Normal"/>
+        body21
+        <w:tc>
+          <w:tcPr>
+            <w:tcBorders>
+              <w:bottom w:val="none" w:sz="0" w:space="0" w:color="000000"/>
+              <w:top w:val="none" w:sz="0" w:space="0" w:color="000000"/>
+              <w:left w:val="none" w:sz="0" w:space="0" w:color="000000"/>
+              <w:right w:val="none" w:sz="0" w:space="0" w:color="000000"/>
+            </w:tcBorders>
+            <w:shd w:val="clear" w:color="auto" w:fill="FFFFFF"/>
+            <w:tcMar>
+              <w:top w:w="0" w:type="dxa"/>
+              <w:bottom w:w="0" w:type="dxa"/>
+              <w:left w:w="0" w:type="dxa"/>
+              <w:right w:w="0" w:type="dxa"/>
+            </w:tcMar>
+            <w:vAlign w:val="top"/>
+          </w:tcPr>
+          <w:p>
+            <w:pPr>
               <w:jc w:val="left"/>
               <w:pBdr>
                 <w:bottom w:val="none" w:sz="0" w:space="0" w:color="000000"/>
@@ -2488,19 +2467,19 @@
               <w:spacing w:after="100" w:before="100" w:line="240"/>
               <w:ind w:left="300" w:right="100" w:firstLine="0" w:firstLineChars="0"/>
               <w:rPr>
-                <w:rFonts w:ascii="Helvetica" w:hAnsi="Helvetica" w:eastAsia="Helvetica" w:cs="Helvetica"/>
-                <w:i w:val="false"/>
-                <w:b w:val="false"/>
-                <w:u w:val="none"/>
-                <w:strike w:val="false"/>
-                <w:sz w:val="22"/>
-                <w:szCs w:val="22"/>
-                <w:color w:val="000000"/>
-              </w:rPr>
-            </w:pPr>
-            <w:r>
-              <w:rPr>
-                <w:rFonts w:ascii="Helvetica" w:hAnsi="Helvetica" w:eastAsia="Helvetica" w:cs="Helvetica"/>
+                <w:rFonts w:ascii="Arial" w:hAnsi="Arial" w:eastAsia="Arial" w:cs="Arial"/>
+                <w:i w:val="false"/>
+                <w:b w:val="false"/>
+                <w:u w:val="none"/>
+                <w:strike w:val="false"/>
+                <w:sz w:val="22"/>
+                <w:szCs w:val="22"/>
+                <w:color w:val="000000"/>
+              </w:rPr>
+            </w:pPr>
+            <w:r>
+              <w:rPr>
+                <w:rFonts w:ascii="Arial" w:hAnsi="Arial" w:eastAsia="Arial" w:cs="Arial"/>
                 <w:i w:val="false"/>
                 <w:b w:val="false"/>
                 <w:u w:val="none"/>
@@ -2532,7 +2511,6 @@
           </w:tcPr>
           <w:p>
             <w:pPr>
-              <w:pStyle w:val="Normal"/>
               <w:jc w:val="center"/>
               <w:pBdr>
                 <w:bottom w:val="none" w:sz="0" w:space="0" w:color="000000"/>
@@ -2543,19 +2521,19 @@
               <w:spacing w:after="100" w:before="100" w:line="240"/>
               <w:ind w:left="100" w:right="100" w:firstLine="0" w:firstLineChars="0"/>
               <w:rPr>
-                <w:rFonts w:ascii="Helvetica" w:hAnsi="Helvetica" w:eastAsia="Helvetica" w:cs="Helvetica"/>
-                <w:i w:val="false"/>
-                <w:b w:val="false"/>
-                <w:u w:val="none"/>
-                <w:strike w:val="false"/>
-                <w:sz w:val="22"/>
-                <w:szCs w:val="22"/>
-                <w:color w:val="000000"/>
-              </w:rPr>
-            </w:pPr>
-            <w:r>
-              <w:rPr>
-                <w:rFonts w:ascii="Helvetica" w:hAnsi="Helvetica" w:eastAsia="Helvetica" w:cs="Helvetica"/>
+                <w:rFonts w:ascii="Arial" w:hAnsi="Arial" w:eastAsia="Arial" w:cs="Arial"/>
+                <w:i w:val="false"/>
+                <w:b w:val="false"/>
+                <w:u w:val="none"/>
+                <w:strike w:val="false"/>
+                <w:sz w:val="22"/>
+                <w:szCs w:val="22"/>
+                <w:color w:val="000000"/>
+              </w:rPr>
+            </w:pPr>
+            <w:r>
+              <w:rPr>
+                <w:rFonts w:ascii="Arial" w:hAnsi="Arial" w:eastAsia="Arial" w:cs="Arial"/>
                 <w:i w:val="false"/>
                 <w:b w:val="false"/>
                 <w:u w:val="none"/>
@@ -2571,28 +2549,28 @@
       </w:tr>
       <w:tr>
         <w:trPr>
-          <w:trHeight w:val="608" w:hRule="auto"/>
+          <w:trHeight w:val="617" w:hRule="auto"/>
         </w:trPr>
-        <w:tc>
-          <w:tcPr>
-            <w:tcBorders>
-              <w:bottom w:val="none" w:sz="0" w:space="0" w:color="000000"/>
-              <w:top w:val="none" w:sz="0" w:space="0" w:color="000000"/>
-              <w:left w:val="none" w:sz="0" w:space="0" w:color="000000"/>
-              <w:right w:val="none" w:sz="0" w:space="0" w:color="000000"/>
-            </w:tcBorders>
-            <w:shd w:val="clear" w:color="auto" w:fill="FFFFFF"/>
-            <w:tcMar>
-              <w:top w:w="0" w:type="dxa"/>
-              <w:bottom w:w="0" w:type="dxa"/>
-              <w:left w:w="0" w:type="dxa"/>
-              <w:right w:w="0" w:type="dxa"/>
-            </w:tcMar>
-            <w:vAlign w:val="top"/>
-          </w:tcPr>
-          <w:p>
-            <w:pPr>
-              <w:pStyle w:val="Normal"/>
+        body22
+        <w:tc>
+          <w:tcPr>
+            <w:tcBorders>
+              <w:bottom w:val="none" w:sz="0" w:space="0" w:color="000000"/>
+              <w:top w:val="none" w:sz="0" w:space="0" w:color="000000"/>
+              <w:left w:val="none" w:sz="0" w:space="0" w:color="000000"/>
+              <w:right w:val="none" w:sz="0" w:space="0" w:color="000000"/>
+            </w:tcBorders>
+            <w:shd w:val="clear" w:color="auto" w:fill="FFFFFF"/>
+            <w:tcMar>
+              <w:top w:w="0" w:type="dxa"/>
+              <w:bottom w:w="0" w:type="dxa"/>
+              <w:left w:w="0" w:type="dxa"/>
+              <w:right w:w="0" w:type="dxa"/>
+            </w:tcMar>
+            <w:vAlign w:val="top"/>
+          </w:tcPr>
+          <w:p>
+            <w:pPr>
               <w:jc w:val="left"/>
               <w:pBdr>
                 <w:bottom w:val="none" w:sz="0" w:space="0" w:color="000000"/>
@@ -2603,7 +2581,7 @@
               <w:spacing w:after="100" w:before="100" w:line="240"/>
               <w:ind w:left="100" w:right="100" w:firstLine="0" w:firstLineChars="0"/>
               <w:rPr>
-                <w:rFonts w:ascii="Helvetica" w:hAnsi="Helvetica" w:eastAsia="Helvetica" w:cs="Helvetica"/>
+                <w:rFonts w:ascii="Arial" w:hAnsi="Arial" w:eastAsia="Arial" w:cs="Arial"/>
                 <w:i w:val="false"/>
                 <w:b w:val="true"/>
                 <w:u w:val="none"/>
@@ -2615,7 +2593,7 @@
             </w:pPr>
             <w:r>
               <w:rPr>
-                <w:rFonts w:ascii="Helvetica" w:hAnsi="Helvetica" w:eastAsia="Helvetica" w:cs="Helvetica"/>
+                <w:rFonts w:ascii="Arial" w:hAnsi="Arial" w:eastAsia="Arial" w:cs="Arial"/>
                 <w:i w:val="false"/>
                 <w:b w:val="true"/>
                 <w:u w:val="none"/>
@@ -2647,7 +2625,6 @@
           </w:tcPr>
           <w:p>
             <w:pPr>
-              <w:pStyle w:val="Normal"/>
               <w:jc w:val="center"/>
               <w:pBdr>
                 <w:bottom w:val="none" w:sz="0" w:space="0" w:color="000000"/>
@@ -2658,19 +2635,19 @@
               <w:spacing w:after="100" w:before="100" w:line="240"/>
               <w:ind w:left="100" w:right="100" w:firstLine="0" w:firstLineChars="0"/>
               <w:rPr>
-                <w:rFonts w:ascii="Helvetica" w:hAnsi="Helvetica" w:eastAsia="Helvetica" w:cs="Helvetica"/>
-                <w:i w:val="false"/>
-                <w:b w:val="false"/>
-                <w:u w:val="none"/>
-                <w:strike w:val="false"/>
-                <w:sz w:val="22"/>
-                <w:szCs w:val="22"/>
-                <w:color w:val="000000"/>
-              </w:rPr>
-            </w:pPr>
-            <w:r>
-              <w:rPr>
-                <w:rFonts w:ascii="Helvetica" w:hAnsi="Helvetica" w:eastAsia="Helvetica" w:cs="Helvetica"/>
+                <w:rFonts w:ascii="Arial" w:hAnsi="Arial" w:eastAsia="Arial" w:cs="Arial"/>
+                <w:i w:val="false"/>
+                <w:b w:val="false"/>
+                <w:u w:val="none"/>
+                <w:strike w:val="false"/>
+                <w:sz w:val="22"/>
+                <w:szCs w:val="22"/>
+                <w:color w:val="000000"/>
+              </w:rPr>
+            </w:pPr>
+            <w:r>
+              <w:rPr>
+                <w:rFonts w:ascii="Arial" w:hAnsi="Arial" w:eastAsia="Arial" w:cs="Arial"/>
                 <w:i w:val="false"/>
                 <w:b w:val="false"/>
                 <w:u w:val="none"/>
@@ -2686,28 +2663,28 @@
       </w:tr>
       <w:tr>
         <w:trPr>
-          <w:trHeight w:val="608" w:hRule="auto"/>
+          <w:trHeight w:val="617" w:hRule="auto"/>
         </w:trPr>
-        <w:tc>
-          <w:tcPr>
-            <w:tcBorders>
-              <w:bottom w:val="none" w:sz="0" w:space="0" w:color="000000"/>
-              <w:top w:val="none" w:sz="0" w:space="0" w:color="000000"/>
-              <w:left w:val="none" w:sz="0" w:space="0" w:color="000000"/>
-              <w:right w:val="none" w:sz="0" w:space="0" w:color="000000"/>
-            </w:tcBorders>
-            <w:shd w:val="clear" w:color="auto" w:fill="FFFFFF"/>
-            <w:tcMar>
-              <w:top w:w="0" w:type="dxa"/>
-              <w:bottom w:w="0" w:type="dxa"/>
-              <w:left w:w="0" w:type="dxa"/>
-              <w:right w:w="0" w:type="dxa"/>
-            </w:tcMar>
-            <w:vAlign w:val="top"/>
-          </w:tcPr>
-          <w:p>
-            <w:pPr>
-              <w:pStyle w:val="Normal"/>
+        body23
+        <w:tc>
+          <w:tcPr>
+            <w:tcBorders>
+              <w:bottom w:val="none" w:sz="0" w:space="0" w:color="000000"/>
+              <w:top w:val="none" w:sz="0" w:space="0" w:color="000000"/>
+              <w:left w:val="none" w:sz="0" w:space="0" w:color="000000"/>
+              <w:right w:val="none" w:sz="0" w:space="0" w:color="000000"/>
+            </w:tcBorders>
+            <w:shd w:val="clear" w:color="auto" w:fill="FFFFFF"/>
+            <w:tcMar>
+              <w:top w:w="0" w:type="dxa"/>
+              <w:bottom w:w="0" w:type="dxa"/>
+              <w:left w:w="0" w:type="dxa"/>
+              <w:right w:w="0" w:type="dxa"/>
+            </w:tcMar>
+            <w:vAlign w:val="top"/>
+          </w:tcPr>
+          <w:p>
+            <w:pPr>
               <w:jc w:val="left"/>
               <w:pBdr>
                 <w:bottom w:val="none" w:sz="0" w:space="0" w:color="000000"/>
@@ -2718,19 +2695,19 @@
               <w:spacing w:after="100" w:before="100" w:line="240"/>
               <w:ind w:left="300" w:right="100" w:firstLine="0" w:firstLineChars="0"/>
               <w:rPr>
-                <w:rFonts w:ascii="Helvetica" w:hAnsi="Helvetica" w:eastAsia="Helvetica" w:cs="Helvetica"/>
-                <w:i w:val="false"/>
-                <w:b w:val="false"/>
-                <w:u w:val="none"/>
-                <w:strike w:val="false"/>
-                <w:sz w:val="22"/>
-                <w:szCs w:val="22"/>
-                <w:color w:val="000000"/>
-              </w:rPr>
-            </w:pPr>
-            <w:r>
-              <w:rPr>
-                <w:rFonts w:ascii="Helvetica" w:hAnsi="Helvetica" w:eastAsia="Helvetica" w:cs="Helvetica"/>
+                <w:rFonts w:ascii="Arial" w:hAnsi="Arial" w:eastAsia="Arial" w:cs="Arial"/>
+                <w:i w:val="false"/>
+                <w:b w:val="false"/>
+                <w:u w:val="none"/>
+                <w:strike w:val="false"/>
+                <w:sz w:val="22"/>
+                <w:szCs w:val="22"/>
+                <w:color w:val="000000"/>
+              </w:rPr>
+            </w:pPr>
+            <w:r>
+              <w:rPr>
+                <w:rFonts w:ascii="Arial" w:hAnsi="Arial" w:eastAsia="Arial" w:cs="Arial"/>
                 <w:i w:val="false"/>
                 <w:b w:val="false"/>
                 <w:u w:val="none"/>
@@ -2762,7 +2739,6 @@
           </w:tcPr>
           <w:p>
             <w:pPr>
-              <w:pStyle w:val="Normal"/>
               <w:jc w:val="center"/>
               <w:pBdr>
                 <w:bottom w:val="none" w:sz="0" w:space="0" w:color="000000"/>
@@ -2773,19 +2749,19 @@
               <w:spacing w:after="100" w:before="100" w:line="240"/>
               <w:ind w:left="100" w:right="100" w:firstLine="0" w:firstLineChars="0"/>
               <w:rPr>
-                <w:rFonts w:ascii="Helvetica" w:hAnsi="Helvetica" w:eastAsia="Helvetica" w:cs="Helvetica"/>
-                <w:i w:val="false"/>
-                <w:b w:val="false"/>
-                <w:u w:val="none"/>
-                <w:strike w:val="false"/>
-                <w:sz w:val="22"/>
-                <w:szCs w:val="22"/>
-                <w:color w:val="000000"/>
-              </w:rPr>
-            </w:pPr>
-            <w:r>
-              <w:rPr>
-                <w:rFonts w:ascii="Helvetica" w:hAnsi="Helvetica" w:eastAsia="Helvetica" w:cs="Helvetica"/>
+                <w:rFonts w:ascii="Arial" w:hAnsi="Arial" w:eastAsia="Arial" w:cs="Arial"/>
+                <w:i w:val="false"/>
+                <w:b w:val="false"/>
+                <w:u w:val="none"/>
+                <w:strike w:val="false"/>
+                <w:sz w:val="22"/>
+                <w:szCs w:val="22"/>
+                <w:color w:val="000000"/>
+              </w:rPr>
+            </w:pPr>
+            <w:r>
+              <w:rPr>
+                <w:rFonts w:ascii="Arial" w:hAnsi="Arial" w:eastAsia="Arial" w:cs="Arial"/>
                 <w:i w:val="false"/>
                 <w:b w:val="false"/>
                 <w:u w:val="none"/>
@@ -2801,28 +2777,28 @@
       </w:tr>
       <w:tr>
         <w:trPr>
-          <w:trHeight w:val="608" w:hRule="auto"/>
+          <w:trHeight w:val="617" w:hRule="auto"/>
         </w:trPr>
-        <w:tc>
-          <w:tcPr>
-            <w:tcBorders>
-              <w:bottom w:val="none" w:sz="0" w:space="0" w:color="000000"/>
-              <w:top w:val="none" w:sz="0" w:space="0" w:color="000000"/>
-              <w:left w:val="none" w:sz="0" w:space="0" w:color="000000"/>
-              <w:right w:val="none" w:sz="0" w:space="0" w:color="000000"/>
-            </w:tcBorders>
-            <w:shd w:val="clear" w:color="auto" w:fill="FFFFFF"/>
-            <w:tcMar>
-              <w:top w:w="0" w:type="dxa"/>
-              <w:bottom w:w="0" w:type="dxa"/>
-              <w:left w:w="0" w:type="dxa"/>
-              <w:right w:w="0" w:type="dxa"/>
-            </w:tcMar>
-            <w:vAlign w:val="top"/>
-          </w:tcPr>
-          <w:p>
-            <w:pPr>
-              <w:pStyle w:val="Normal"/>
+        body24
+        <w:tc>
+          <w:tcPr>
+            <w:tcBorders>
+              <w:bottom w:val="none" w:sz="0" w:space="0" w:color="000000"/>
+              <w:top w:val="none" w:sz="0" w:space="0" w:color="000000"/>
+              <w:left w:val="none" w:sz="0" w:space="0" w:color="000000"/>
+              <w:right w:val="none" w:sz="0" w:space="0" w:color="000000"/>
+            </w:tcBorders>
+            <w:shd w:val="clear" w:color="auto" w:fill="FFFFFF"/>
+            <w:tcMar>
+              <w:top w:w="0" w:type="dxa"/>
+              <w:bottom w:w="0" w:type="dxa"/>
+              <w:left w:w="0" w:type="dxa"/>
+              <w:right w:w="0" w:type="dxa"/>
+            </w:tcMar>
+            <w:vAlign w:val="top"/>
+          </w:tcPr>
+          <w:p>
+            <w:pPr>
               <w:jc w:val="left"/>
               <w:pBdr>
                 <w:bottom w:val="none" w:sz="0" w:space="0" w:color="000000"/>
@@ -2833,19 +2809,19 @@
               <w:spacing w:after="100" w:before="100" w:line="240"/>
               <w:ind w:left="300" w:right="100" w:firstLine="0" w:firstLineChars="0"/>
               <w:rPr>
-                <w:rFonts w:ascii="Helvetica" w:hAnsi="Helvetica" w:eastAsia="Helvetica" w:cs="Helvetica"/>
-                <w:i w:val="false"/>
-                <w:b w:val="false"/>
-                <w:u w:val="none"/>
-                <w:strike w:val="false"/>
-                <w:sz w:val="22"/>
-                <w:szCs w:val="22"/>
-                <w:color w:val="000000"/>
-              </w:rPr>
-            </w:pPr>
-            <w:r>
-              <w:rPr>
-                <w:rFonts w:ascii="Helvetica" w:hAnsi="Helvetica" w:eastAsia="Helvetica" w:cs="Helvetica"/>
+                <w:rFonts w:ascii="Arial" w:hAnsi="Arial" w:eastAsia="Arial" w:cs="Arial"/>
+                <w:i w:val="false"/>
+                <w:b w:val="false"/>
+                <w:u w:val="none"/>
+                <w:strike w:val="false"/>
+                <w:sz w:val="22"/>
+                <w:szCs w:val="22"/>
+                <w:color w:val="000000"/>
+              </w:rPr>
+            </w:pPr>
+            <w:r>
+              <w:rPr>
+                <w:rFonts w:ascii="Arial" w:hAnsi="Arial" w:eastAsia="Arial" w:cs="Arial"/>
                 <w:i w:val="false"/>
                 <w:b w:val="false"/>
                 <w:u w:val="none"/>
@@ -2877,7 +2853,6 @@
           </w:tcPr>
           <w:p>
             <w:pPr>
-              <w:pStyle w:val="Normal"/>
               <w:jc w:val="center"/>
               <w:pBdr>
                 <w:bottom w:val="none" w:sz="0" w:space="0" w:color="000000"/>
@@ -2888,19 +2863,19 @@
               <w:spacing w:after="100" w:before="100" w:line="240"/>
               <w:ind w:left="100" w:right="100" w:firstLine="0" w:firstLineChars="0"/>
               <w:rPr>
-                <w:rFonts w:ascii="Helvetica" w:hAnsi="Helvetica" w:eastAsia="Helvetica" w:cs="Helvetica"/>
-                <w:i w:val="false"/>
-                <w:b w:val="false"/>
-                <w:u w:val="none"/>
-                <w:strike w:val="false"/>
-                <w:sz w:val="22"/>
-                <w:szCs w:val="22"/>
-                <w:color w:val="000000"/>
-              </w:rPr>
-            </w:pPr>
-            <w:r>
-              <w:rPr>
-                <w:rFonts w:ascii="Helvetica" w:hAnsi="Helvetica" w:eastAsia="Helvetica" w:cs="Helvetica"/>
+                <w:rFonts w:ascii="Arial" w:hAnsi="Arial" w:eastAsia="Arial" w:cs="Arial"/>
+                <w:i w:val="false"/>
+                <w:b w:val="false"/>
+                <w:u w:val="none"/>
+                <w:strike w:val="false"/>
+                <w:sz w:val="22"/>
+                <w:szCs w:val="22"/>
+                <w:color w:val="000000"/>
+              </w:rPr>
+            </w:pPr>
+            <w:r>
+              <w:rPr>
+                <w:rFonts w:ascii="Arial" w:hAnsi="Arial" w:eastAsia="Arial" w:cs="Arial"/>
                 <w:i w:val="false"/>
                 <w:b w:val="false"/>
                 <w:u w:val="none"/>
@@ -2916,28 +2891,28 @@
       </w:tr>
       <w:tr>
         <w:trPr>
-          <w:trHeight w:val="608" w:hRule="auto"/>
+          <w:trHeight w:val="617" w:hRule="auto"/>
         </w:trPr>
-        <w:tc>
-          <w:tcPr>
-            <w:tcBorders>
-              <w:bottom w:val="none" w:sz="0" w:space="0" w:color="000000"/>
-              <w:top w:val="none" w:sz="0" w:space="0" w:color="000000"/>
-              <w:left w:val="none" w:sz="0" w:space="0" w:color="000000"/>
-              <w:right w:val="none" w:sz="0" w:space="0" w:color="000000"/>
-            </w:tcBorders>
-            <w:shd w:val="clear" w:color="auto" w:fill="FFFFFF"/>
-            <w:tcMar>
-              <w:top w:w="0" w:type="dxa"/>
-              <w:bottom w:w="0" w:type="dxa"/>
-              <w:left w:w="0" w:type="dxa"/>
-              <w:right w:w="0" w:type="dxa"/>
-            </w:tcMar>
-            <w:vAlign w:val="top"/>
-          </w:tcPr>
-          <w:p>
-            <w:pPr>
-              <w:pStyle w:val="Normal"/>
+        body25
+        <w:tc>
+          <w:tcPr>
+            <w:tcBorders>
+              <w:bottom w:val="none" w:sz="0" w:space="0" w:color="000000"/>
+              <w:top w:val="none" w:sz="0" w:space="0" w:color="000000"/>
+              <w:left w:val="none" w:sz="0" w:space="0" w:color="000000"/>
+              <w:right w:val="none" w:sz="0" w:space="0" w:color="000000"/>
+            </w:tcBorders>
+            <w:shd w:val="clear" w:color="auto" w:fill="FFFFFF"/>
+            <w:tcMar>
+              <w:top w:w="0" w:type="dxa"/>
+              <w:bottom w:w="0" w:type="dxa"/>
+              <w:left w:w="0" w:type="dxa"/>
+              <w:right w:w="0" w:type="dxa"/>
+            </w:tcMar>
+            <w:vAlign w:val="top"/>
+          </w:tcPr>
+          <w:p>
+            <w:pPr>
               <w:jc w:val="left"/>
               <w:pBdr>
                 <w:bottom w:val="none" w:sz="0" w:space="0" w:color="000000"/>
@@ -2948,19 +2923,19 @@
               <w:spacing w:after="100" w:before="100" w:line="240"/>
               <w:ind w:left="300" w:right="100" w:firstLine="0" w:firstLineChars="0"/>
               <w:rPr>
-                <w:rFonts w:ascii="Helvetica" w:hAnsi="Helvetica" w:eastAsia="Helvetica" w:cs="Helvetica"/>
-                <w:i w:val="false"/>
-                <w:b w:val="false"/>
-                <w:u w:val="none"/>
-                <w:strike w:val="false"/>
-                <w:sz w:val="22"/>
-                <w:szCs w:val="22"/>
-                <w:color w:val="000000"/>
-              </w:rPr>
-            </w:pPr>
-            <w:r>
-              <w:rPr>
-                <w:rFonts w:ascii="Helvetica" w:hAnsi="Helvetica" w:eastAsia="Helvetica" w:cs="Helvetica"/>
+                <w:rFonts w:ascii="Arial" w:hAnsi="Arial" w:eastAsia="Arial" w:cs="Arial"/>
+                <w:i w:val="false"/>
+                <w:b w:val="false"/>
+                <w:u w:val="none"/>
+                <w:strike w:val="false"/>
+                <w:sz w:val="22"/>
+                <w:szCs w:val="22"/>
+                <w:color w:val="000000"/>
+              </w:rPr>
+            </w:pPr>
+            <w:r>
+              <w:rPr>
+                <w:rFonts w:ascii="Arial" w:hAnsi="Arial" w:eastAsia="Arial" w:cs="Arial"/>
                 <w:i w:val="false"/>
                 <w:b w:val="false"/>
                 <w:u w:val="none"/>
@@ -2992,7 +2967,6 @@
           </w:tcPr>
           <w:p>
             <w:pPr>
-              <w:pStyle w:val="Normal"/>
               <w:jc w:val="center"/>
               <w:pBdr>
                 <w:bottom w:val="none" w:sz="0" w:space="0" w:color="000000"/>
@@ -3003,19 +2977,19 @@
               <w:spacing w:after="100" w:before="100" w:line="240"/>
               <w:ind w:left="100" w:right="100" w:firstLine="0" w:firstLineChars="0"/>
               <w:rPr>
-                <w:rFonts w:ascii="Helvetica" w:hAnsi="Helvetica" w:eastAsia="Helvetica" w:cs="Helvetica"/>
-                <w:i w:val="false"/>
-                <w:b w:val="false"/>
-                <w:u w:val="none"/>
-                <w:strike w:val="false"/>
-                <w:sz w:val="22"/>
-                <w:szCs w:val="22"/>
-                <w:color w:val="000000"/>
-              </w:rPr>
-            </w:pPr>
-            <w:r>
-              <w:rPr>
-                <w:rFonts w:ascii="Helvetica" w:hAnsi="Helvetica" w:eastAsia="Helvetica" w:cs="Helvetica"/>
+                <w:rFonts w:ascii="Arial" w:hAnsi="Arial" w:eastAsia="Arial" w:cs="Arial"/>
+                <w:i w:val="false"/>
+                <w:b w:val="false"/>
+                <w:u w:val="none"/>
+                <w:strike w:val="false"/>
+                <w:sz w:val="22"/>
+                <w:szCs w:val="22"/>
+                <w:color w:val="000000"/>
+              </w:rPr>
+            </w:pPr>
+            <w:r>
+              <w:rPr>
+                <w:rFonts w:ascii="Arial" w:hAnsi="Arial" w:eastAsia="Arial" w:cs="Arial"/>
                 <w:i w:val="false"/>
                 <w:b w:val="false"/>
                 <w:u w:val="none"/>
@@ -3031,28 +3005,28 @@
       </w:tr>
       <w:tr>
         <w:trPr>
-          <w:trHeight w:val="608" w:hRule="auto"/>
+          <w:trHeight w:val="617" w:hRule="auto"/>
         </w:trPr>
-        <w:tc>
-          <w:tcPr>
-            <w:tcBorders>
-              <w:bottom w:val="none" w:sz="0" w:space="0" w:color="000000"/>
-              <w:top w:val="none" w:sz="0" w:space="0" w:color="000000"/>
-              <w:left w:val="none" w:sz="0" w:space="0" w:color="000000"/>
-              <w:right w:val="none" w:sz="0" w:space="0" w:color="000000"/>
-            </w:tcBorders>
-            <w:shd w:val="clear" w:color="auto" w:fill="FFFFFF"/>
-            <w:tcMar>
-              <w:top w:w="0" w:type="dxa"/>
-              <w:bottom w:w="0" w:type="dxa"/>
-              <w:left w:w="0" w:type="dxa"/>
-              <w:right w:w="0" w:type="dxa"/>
-            </w:tcMar>
-            <w:vAlign w:val="top"/>
-          </w:tcPr>
-          <w:p>
-            <w:pPr>
-              <w:pStyle w:val="Normal"/>
+        body26
+        <w:tc>
+          <w:tcPr>
+            <w:tcBorders>
+              <w:bottom w:val="none" w:sz="0" w:space="0" w:color="000000"/>
+              <w:top w:val="none" w:sz="0" w:space="0" w:color="000000"/>
+              <w:left w:val="none" w:sz="0" w:space="0" w:color="000000"/>
+              <w:right w:val="none" w:sz="0" w:space="0" w:color="000000"/>
+            </w:tcBorders>
+            <w:shd w:val="clear" w:color="auto" w:fill="FFFFFF"/>
+            <w:tcMar>
+              <w:top w:w="0" w:type="dxa"/>
+              <w:bottom w:w="0" w:type="dxa"/>
+              <w:left w:w="0" w:type="dxa"/>
+              <w:right w:w="0" w:type="dxa"/>
+            </w:tcMar>
+            <w:vAlign w:val="top"/>
+          </w:tcPr>
+          <w:p>
+            <w:pPr>
               <w:jc w:val="left"/>
               <w:pBdr>
                 <w:bottom w:val="none" w:sz="0" w:space="0" w:color="000000"/>
@@ -3063,7 +3037,7 @@
               <w:spacing w:after="100" w:before="100" w:line="240"/>
               <w:ind w:left="100" w:right="100" w:firstLine="0" w:firstLineChars="0"/>
               <w:rPr>
-                <w:rFonts w:ascii="Helvetica" w:hAnsi="Helvetica" w:eastAsia="Helvetica" w:cs="Helvetica"/>
+                <w:rFonts w:ascii="Arial" w:hAnsi="Arial" w:eastAsia="Arial" w:cs="Arial"/>
                 <w:i w:val="false"/>
                 <w:b w:val="true"/>
                 <w:u w:val="none"/>
@@ -3075,7 +3049,7 @@
             </w:pPr>
             <w:r>
               <w:rPr>
-                <w:rFonts w:ascii="Helvetica" w:hAnsi="Helvetica" w:eastAsia="Helvetica" w:cs="Helvetica"/>
+                <w:rFonts w:ascii="Arial" w:hAnsi="Arial" w:eastAsia="Arial" w:cs="Arial"/>
                 <w:i w:val="false"/>
                 <w:b w:val="true"/>
                 <w:u w:val="none"/>
@@ -3107,7 +3081,6 @@
           </w:tcPr>
           <w:p>
             <w:pPr>
-              <w:pStyle w:val="Normal"/>
               <w:jc w:val="center"/>
               <w:pBdr>
                 <w:bottom w:val="none" w:sz="0" w:space="0" w:color="000000"/>
@@ -3118,19 +3091,19 @@
               <w:spacing w:after="100" w:before="100" w:line="240"/>
               <w:ind w:left="100" w:right="100" w:firstLine="0" w:firstLineChars="0"/>
               <w:rPr>
-                <w:rFonts w:ascii="Helvetica" w:hAnsi="Helvetica" w:eastAsia="Helvetica" w:cs="Helvetica"/>
-                <w:i w:val="false"/>
-                <w:b w:val="false"/>
-                <w:u w:val="none"/>
-                <w:strike w:val="false"/>
-                <w:sz w:val="22"/>
-                <w:szCs w:val="22"/>
-                <w:color w:val="000000"/>
-              </w:rPr>
-            </w:pPr>
-            <w:r>
-              <w:rPr>
-                <w:rFonts w:ascii="Helvetica" w:hAnsi="Helvetica" w:eastAsia="Helvetica" w:cs="Helvetica"/>
+                <w:rFonts w:ascii="Arial" w:hAnsi="Arial" w:eastAsia="Arial" w:cs="Arial"/>
+                <w:i w:val="false"/>
+                <w:b w:val="false"/>
+                <w:u w:val="none"/>
+                <w:strike w:val="false"/>
+                <w:sz w:val="22"/>
+                <w:szCs w:val="22"/>
+                <w:color w:val="000000"/>
+              </w:rPr>
+            </w:pPr>
+            <w:r>
+              <w:rPr>
+                <w:rFonts w:ascii="Arial" w:hAnsi="Arial" w:eastAsia="Arial" w:cs="Arial"/>
                 <w:i w:val="false"/>
                 <w:b w:val="false"/>
                 <w:u w:val="none"/>
@@ -3146,28 +3119,28 @@
       </w:tr>
       <w:tr>
         <w:trPr>
-          <w:trHeight w:val="608" w:hRule="auto"/>
+          <w:trHeight w:val="617" w:hRule="auto"/>
         </w:trPr>
-        <w:tc>
-          <w:tcPr>
-            <w:tcBorders>
-              <w:bottom w:val="none" w:sz="0" w:space="0" w:color="000000"/>
-              <w:top w:val="none" w:sz="0" w:space="0" w:color="000000"/>
-              <w:left w:val="none" w:sz="0" w:space="0" w:color="000000"/>
-              <w:right w:val="none" w:sz="0" w:space="0" w:color="000000"/>
-            </w:tcBorders>
-            <w:shd w:val="clear" w:color="auto" w:fill="FFFFFF"/>
-            <w:tcMar>
-              <w:top w:w="0" w:type="dxa"/>
-              <w:bottom w:w="0" w:type="dxa"/>
-              <w:left w:w="0" w:type="dxa"/>
-              <w:right w:w="0" w:type="dxa"/>
-            </w:tcMar>
-            <w:vAlign w:val="top"/>
-          </w:tcPr>
-          <w:p>
-            <w:pPr>
-              <w:pStyle w:val="Normal"/>
+        body27
+        <w:tc>
+          <w:tcPr>
+            <w:tcBorders>
+              <w:bottom w:val="none" w:sz="0" w:space="0" w:color="000000"/>
+              <w:top w:val="none" w:sz="0" w:space="0" w:color="000000"/>
+              <w:left w:val="none" w:sz="0" w:space="0" w:color="000000"/>
+              <w:right w:val="none" w:sz="0" w:space="0" w:color="000000"/>
+            </w:tcBorders>
+            <w:shd w:val="clear" w:color="auto" w:fill="FFFFFF"/>
+            <w:tcMar>
+              <w:top w:w="0" w:type="dxa"/>
+              <w:bottom w:w="0" w:type="dxa"/>
+              <w:left w:w="0" w:type="dxa"/>
+              <w:right w:w="0" w:type="dxa"/>
+            </w:tcMar>
+            <w:vAlign w:val="top"/>
+          </w:tcPr>
+          <w:p>
+            <w:pPr>
               <w:jc w:val="left"/>
               <w:pBdr>
                 <w:bottom w:val="none" w:sz="0" w:space="0" w:color="000000"/>
@@ -3178,19 +3151,19 @@
               <w:spacing w:after="100" w:before="100" w:line="240"/>
               <w:ind w:left="300" w:right="100" w:firstLine="0" w:firstLineChars="0"/>
               <w:rPr>
-                <w:rFonts w:ascii="Helvetica" w:hAnsi="Helvetica" w:eastAsia="Helvetica" w:cs="Helvetica"/>
-                <w:i w:val="false"/>
-                <w:b w:val="false"/>
-                <w:u w:val="none"/>
-                <w:strike w:val="false"/>
-                <w:sz w:val="22"/>
-                <w:szCs w:val="22"/>
-                <w:color w:val="000000"/>
-              </w:rPr>
-            </w:pPr>
-            <w:r>
-              <w:rPr>
-                <w:rFonts w:ascii="Helvetica" w:hAnsi="Helvetica" w:eastAsia="Helvetica" w:cs="Helvetica"/>
+                <w:rFonts w:ascii="Arial" w:hAnsi="Arial" w:eastAsia="Arial" w:cs="Arial"/>
+                <w:i w:val="false"/>
+                <w:b w:val="false"/>
+                <w:u w:val="none"/>
+                <w:strike w:val="false"/>
+                <w:sz w:val="22"/>
+                <w:szCs w:val="22"/>
+                <w:color w:val="000000"/>
+              </w:rPr>
+            </w:pPr>
+            <w:r>
+              <w:rPr>
+                <w:rFonts w:ascii="Arial" w:hAnsi="Arial" w:eastAsia="Arial" w:cs="Arial"/>
                 <w:i w:val="false"/>
                 <w:b w:val="false"/>
                 <w:u w:val="none"/>
@@ -3222,7 +3195,6 @@
           </w:tcPr>
           <w:p>
             <w:pPr>
-              <w:pStyle w:val="Normal"/>
               <w:jc w:val="center"/>
               <w:pBdr>
                 <w:bottom w:val="none" w:sz="0" w:space="0" w:color="000000"/>
@@ -3233,19 +3205,19 @@
               <w:spacing w:after="100" w:before="100" w:line="240"/>
               <w:ind w:left="100" w:right="100" w:firstLine="0" w:firstLineChars="0"/>
               <w:rPr>
-                <w:rFonts w:ascii="Helvetica" w:hAnsi="Helvetica" w:eastAsia="Helvetica" w:cs="Helvetica"/>
-                <w:i w:val="false"/>
-                <w:b w:val="false"/>
-                <w:u w:val="none"/>
-                <w:strike w:val="false"/>
-                <w:sz w:val="22"/>
-                <w:szCs w:val="22"/>
-                <w:color w:val="000000"/>
-              </w:rPr>
-            </w:pPr>
-            <w:r>
-              <w:rPr>
-                <w:rFonts w:ascii="Helvetica" w:hAnsi="Helvetica" w:eastAsia="Helvetica" w:cs="Helvetica"/>
+                <w:rFonts w:ascii="Arial" w:hAnsi="Arial" w:eastAsia="Arial" w:cs="Arial"/>
+                <w:i w:val="false"/>
+                <w:b w:val="false"/>
+                <w:u w:val="none"/>
+                <w:strike w:val="false"/>
+                <w:sz w:val="22"/>
+                <w:szCs w:val="22"/>
+                <w:color w:val="000000"/>
+              </w:rPr>
+            </w:pPr>
+            <w:r>
+              <w:rPr>
+                <w:rFonts w:ascii="Arial" w:hAnsi="Arial" w:eastAsia="Arial" w:cs="Arial"/>
                 <w:i w:val="false"/>
                 <w:b w:val="false"/>
                 <w:u w:val="none"/>
@@ -3261,28 +3233,28 @@
       </w:tr>
       <w:tr>
         <w:trPr>
-          <w:trHeight w:val="608" w:hRule="auto"/>
+          <w:trHeight w:val="617" w:hRule="auto"/>
         </w:trPr>
-        <w:tc>
-          <w:tcPr>
-            <w:tcBorders>
-              <w:bottom w:val="none" w:sz="0" w:space="0" w:color="000000"/>
-              <w:top w:val="none" w:sz="0" w:space="0" w:color="000000"/>
-              <w:left w:val="none" w:sz="0" w:space="0" w:color="000000"/>
-              <w:right w:val="none" w:sz="0" w:space="0" w:color="000000"/>
-            </w:tcBorders>
-            <w:shd w:val="clear" w:color="auto" w:fill="FFFFFF"/>
-            <w:tcMar>
-              <w:top w:w="0" w:type="dxa"/>
-              <w:bottom w:w="0" w:type="dxa"/>
-              <w:left w:w="0" w:type="dxa"/>
-              <w:right w:w="0" w:type="dxa"/>
-            </w:tcMar>
-            <w:vAlign w:val="top"/>
-          </w:tcPr>
-          <w:p>
-            <w:pPr>
-              <w:pStyle w:val="Normal"/>
+        body28
+        <w:tc>
+          <w:tcPr>
+            <w:tcBorders>
+              <w:bottom w:val="none" w:sz="0" w:space="0" w:color="000000"/>
+              <w:top w:val="none" w:sz="0" w:space="0" w:color="000000"/>
+              <w:left w:val="none" w:sz="0" w:space="0" w:color="000000"/>
+              <w:right w:val="none" w:sz="0" w:space="0" w:color="000000"/>
+            </w:tcBorders>
+            <w:shd w:val="clear" w:color="auto" w:fill="FFFFFF"/>
+            <w:tcMar>
+              <w:top w:w="0" w:type="dxa"/>
+              <w:bottom w:w="0" w:type="dxa"/>
+              <w:left w:w="0" w:type="dxa"/>
+              <w:right w:w="0" w:type="dxa"/>
+            </w:tcMar>
+            <w:vAlign w:val="top"/>
+          </w:tcPr>
+          <w:p>
+            <w:pPr>
               <w:jc w:val="left"/>
               <w:pBdr>
                 <w:bottom w:val="none" w:sz="0" w:space="0" w:color="000000"/>
@@ -3293,7 +3265,7 @@
               <w:spacing w:after="100" w:before="100" w:line="240"/>
               <w:ind w:left="100" w:right="100" w:firstLine="0" w:firstLineChars="0"/>
               <w:rPr>
-                <w:rFonts w:ascii="Helvetica" w:hAnsi="Helvetica" w:eastAsia="Helvetica" w:cs="Helvetica"/>
+                <w:rFonts w:ascii="Arial" w:hAnsi="Arial" w:eastAsia="Arial" w:cs="Arial"/>
                 <w:i w:val="false"/>
                 <w:b w:val="true"/>
                 <w:u w:val="none"/>
@@ -3305,7 +3277,7 @@
             </w:pPr>
             <w:r>
               <w:rPr>
-                <w:rFonts w:ascii="Helvetica" w:hAnsi="Helvetica" w:eastAsia="Helvetica" w:cs="Helvetica"/>
+                <w:rFonts w:ascii="Arial" w:hAnsi="Arial" w:eastAsia="Arial" w:cs="Arial"/>
                 <w:i w:val="false"/>
                 <w:b w:val="true"/>
                 <w:u w:val="none"/>
@@ -3337,7 +3309,6 @@
           </w:tcPr>
           <w:p>
             <w:pPr>
-              <w:pStyle w:val="Normal"/>
               <w:jc w:val="center"/>
               <w:pBdr>
                 <w:bottom w:val="none" w:sz="0" w:space="0" w:color="000000"/>
@@ -3348,19 +3319,19 @@
               <w:spacing w:after="100" w:before="100" w:line="240"/>
               <w:ind w:left="100" w:right="100" w:firstLine="0" w:firstLineChars="0"/>
               <w:rPr>
-                <w:rFonts w:ascii="Helvetica" w:hAnsi="Helvetica" w:eastAsia="Helvetica" w:cs="Helvetica"/>
-                <w:i w:val="false"/>
-                <w:b w:val="false"/>
-                <w:u w:val="none"/>
-                <w:strike w:val="false"/>
-                <w:sz w:val="22"/>
-                <w:szCs w:val="22"/>
-                <w:color w:val="000000"/>
-              </w:rPr>
-            </w:pPr>
-            <w:r>
-              <w:rPr>
-                <w:rFonts w:ascii="Helvetica" w:hAnsi="Helvetica" w:eastAsia="Helvetica" w:cs="Helvetica"/>
+                <w:rFonts w:ascii="Arial" w:hAnsi="Arial" w:eastAsia="Arial" w:cs="Arial"/>
+                <w:i w:val="false"/>
+                <w:b w:val="false"/>
+                <w:u w:val="none"/>
+                <w:strike w:val="false"/>
+                <w:sz w:val="22"/>
+                <w:szCs w:val="22"/>
+                <w:color w:val="000000"/>
+              </w:rPr>
+            </w:pPr>
+            <w:r>
+              <w:rPr>
+                <w:rFonts w:ascii="Arial" w:hAnsi="Arial" w:eastAsia="Arial" w:cs="Arial"/>
                 <w:i w:val="false"/>
                 <w:b w:val="false"/>
                 <w:u w:val="none"/>
@@ -3376,28 +3347,28 @@
       </w:tr>
       <w:tr>
         <w:trPr>
-          <w:trHeight w:val="608" w:hRule="auto"/>
+          <w:trHeight w:val="617" w:hRule="auto"/>
         </w:trPr>
-        <w:tc>
-          <w:tcPr>
-            <w:tcBorders>
-              <w:bottom w:val="none" w:sz="0" w:space="0" w:color="000000"/>
-              <w:top w:val="none" w:sz="0" w:space="0" w:color="000000"/>
-              <w:left w:val="none" w:sz="0" w:space="0" w:color="000000"/>
-              <w:right w:val="none" w:sz="0" w:space="0" w:color="000000"/>
-            </w:tcBorders>
-            <w:shd w:val="clear" w:color="auto" w:fill="FFFFFF"/>
-            <w:tcMar>
-              <w:top w:w="0" w:type="dxa"/>
-              <w:bottom w:w="0" w:type="dxa"/>
-              <w:left w:w="0" w:type="dxa"/>
-              <w:right w:w="0" w:type="dxa"/>
-            </w:tcMar>
-            <w:vAlign w:val="top"/>
-          </w:tcPr>
-          <w:p>
-            <w:pPr>
-              <w:pStyle w:val="Normal"/>
+        body29
+        <w:tc>
+          <w:tcPr>
+            <w:tcBorders>
+              <w:bottom w:val="none" w:sz="0" w:space="0" w:color="000000"/>
+              <w:top w:val="none" w:sz="0" w:space="0" w:color="000000"/>
+              <w:left w:val="none" w:sz="0" w:space="0" w:color="000000"/>
+              <w:right w:val="none" w:sz="0" w:space="0" w:color="000000"/>
+            </w:tcBorders>
+            <w:shd w:val="clear" w:color="auto" w:fill="FFFFFF"/>
+            <w:tcMar>
+              <w:top w:w="0" w:type="dxa"/>
+              <w:bottom w:w="0" w:type="dxa"/>
+              <w:left w:w="0" w:type="dxa"/>
+              <w:right w:w="0" w:type="dxa"/>
+            </w:tcMar>
+            <w:vAlign w:val="top"/>
+          </w:tcPr>
+          <w:p>
+            <w:pPr>
               <w:jc w:val="left"/>
               <w:pBdr>
                 <w:bottom w:val="none" w:sz="0" w:space="0" w:color="000000"/>
@@ -3408,19 +3379,19 @@
               <w:spacing w:after="100" w:before="100" w:line="240"/>
               <w:ind w:left="300" w:right="100" w:firstLine="0" w:firstLineChars="0"/>
               <w:rPr>
-                <w:rFonts w:ascii="Helvetica" w:hAnsi="Helvetica" w:eastAsia="Helvetica" w:cs="Helvetica"/>
-                <w:i w:val="false"/>
-                <w:b w:val="false"/>
-                <w:u w:val="none"/>
-                <w:strike w:val="false"/>
-                <w:sz w:val="22"/>
-                <w:szCs w:val="22"/>
-                <w:color w:val="000000"/>
-              </w:rPr>
-            </w:pPr>
-            <w:r>
-              <w:rPr>
-                <w:rFonts w:ascii="Helvetica" w:hAnsi="Helvetica" w:eastAsia="Helvetica" w:cs="Helvetica"/>
+                <w:rFonts w:ascii="Arial" w:hAnsi="Arial" w:eastAsia="Arial" w:cs="Arial"/>
+                <w:i w:val="false"/>
+                <w:b w:val="false"/>
+                <w:u w:val="none"/>
+                <w:strike w:val="false"/>
+                <w:sz w:val="22"/>
+                <w:szCs w:val="22"/>
+                <w:color w:val="000000"/>
+              </w:rPr>
+            </w:pPr>
+            <w:r>
+              <w:rPr>
+                <w:rFonts w:ascii="Arial" w:hAnsi="Arial" w:eastAsia="Arial" w:cs="Arial"/>
                 <w:i w:val="false"/>
                 <w:b w:val="false"/>
                 <w:u w:val="none"/>
@@ -3452,7 +3423,6 @@
           </w:tcPr>
           <w:p>
             <w:pPr>
-              <w:pStyle w:val="Normal"/>
               <w:jc w:val="center"/>
               <w:pBdr>
                 <w:bottom w:val="none" w:sz="0" w:space="0" w:color="000000"/>
@@ -3463,19 +3433,19 @@
               <w:spacing w:after="100" w:before="100" w:line="240"/>
               <w:ind w:left="100" w:right="100" w:firstLine="0" w:firstLineChars="0"/>
               <w:rPr>
-                <w:rFonts w:ascii="Helvetica" w:hAnsi="Helvetica" w:eastAsia="Helvetica" w:cs="Helvetica"/>
-                <w:i w:val="false"/>
-                <w:b w:val="false"/>
-                <w:u w:val="none"/>
-                <w:strike w:val="false"/>
-                <w:sz w:val="22"/>
-                <w:szCs w:val="22"/>
-                <w:color w:val="000000"/>
-              </w:rPr>
-            </w:pPr>
-            <w:r>
-              <w:rPr>
-                <w:rFonts w:ascii="Helvetica" w:hAnsi="Helvetica" w:eastAsia="Helvetica" w:cs="Helvetica"/>
+                <w:rFonts w:ascii="Arial" w:hAnsi="Arial" w:eastAsia="Arial" w:cs="Arial"/>
+                <w:i w:val="false"/>
+                <w:b w:val="false"/>
+                <w:u w:val="none"/>
+                <w:strike w:val="false"/>
+                <w:sz w:val="22"/>
+                <w:szCs w:val="22"/>
+                <w:color w:val="000000"/>
+              </w:rPr>
+            </w:pPr>
+            <w:r>
+              <w:rPr>
+                <w:rFonts w:ascii="Arial" w:hAnsi="Arial" w:eastAsia="Arial" w:cs="Arial"/>
                 <w:i w:val="false"/>
                 <w:b w:val="false"/>
                 <w:u w:val="none"/>
@@ -3491,28 +3461,28 @@
       </w:tr>
       <w:tr>
         <w:trPr>
-          <w:trHeight w:val="608" w:hRule="auto"/>
+          <w:trHeight w:val="617" w:hRule="auto"/>
         </w:trPr>
-        <w:tc>
-          <w:tcPr>
-            <w:tcBorders>
-              <w:bottom w:val="none" w:sz="0" w:space="0" w:color="000000"/>
-              <w:top w:val="none" w:sz="0" w:space="0" w:color="000000"/>
-              <w:left w:val="none" w:sz="0" w:space="0" w:color="000000"/>
-              <w:right w:val="none" w:sz="0" w:space="0" w:color="000000"/>
-            </w:tcBorders>
-            <w:shd w:val="clear" w:color="auto" w:fill="FFFFFF"/>
-            <w:tcMar>
-              <w:top w:w="0" w:type="dxa"/>
-              <w:bottom w:w="0" w:type="dxa"/>
-              <w:left w:w="0" w:type="dxa"/>
-              <w:right w:w="0" w:type="dxa"/>
-            </w:tcMar>
-            <w:vAlign w:val="top"/>
-          </w:tcPr>
-          <w:p>
-            <w:pPr>
-              <w:pStyle w:val="Normal"/>
+        body30
+        <w:tc>
+          <w:tcPr>
+            <w:tcBorders>
+              <w:bottom w:val="none" w:sz="0" w:space="0" w:color="000000"/>
+              <w:top w:val="none" w:sz="0" w:space="0" w:color="000000"/>
+              <w:left w:val="none" w:sz="0" w:space="0" w:color="000000"/>
+              <w:right w:val="none" w:sz="0" w:space="0" w:color="000000"/>
+            </w:tcBorders>
+            <w:shd w:val="clear" w:color="auto" w:fill="FFFFFF"/>
+            <w:tcMar>
+              <w:top w:w="0" w:type="dxa"/>
+              <w:bottom w:w="0" w:type="dxa"/>
+              <w:left w:w="0" w:type="dxa"/>
+              <w:right w:w="0" w:type="dxa"/>
+            </w:tcMar>
+            <w:vAlign w:val="top"/>
+          </w:tcPr>
+          <w:p>
+            <w:pPr>
               <w:jc w:val="left"/>
               <w:pBdr>
                 <w:bottom w:val="none" w:sz="0" w:space="0" w:color="000000"/>
@@ -3523,19 +3493,19 @@
               <w:spacing w:after="100" w:before="100" w:line="240"/>
               <w:ind w:left="300" w:right="100" w:firstLine="0" w:firstLineChars="0"/>
               <w:rPr>
-                <w:rFonts w:ascii="Helvetica" w:hAnsi="Helvetica" w:eastAsia="Helvetica" w:cs="Helvetica"/>
-                <w:i w:val="false"/>
-                <w:b w:val="false"/>
-                <w:u w:val="none"/>
-                <w:strike w:val="false"/>
-                <w:sz w:val="22"/>
-                <w:szCs w:val="22"/>
-                <w:color w:val="000000"/>
-              </w:rPr>
-            </w:pPr>
-            <w:r>
-              <w:rPr>
-                <w:rFonts w:ascii="Helvetica" w:hAnsi="Helvetica" w:eastAsia="Helvetica" w:cs="Helvetica"/>
+                <w:rFonts w:ascii="Arial" w:hAnsi="Arial" w:eastAsia="Arial" w:cs="Arial"/>
+                <w:i w:val="false"/>
+                <w:b w:val="false"/>
+                <w:u w:val="none"/>
+                <w:strike w:val="false"/>
+                <w:sz w:val="22"/>
+                <w:szCs w:val="22"/>
+                <w:color w:val="000000"/>
+              </w:rPr>
+            </w:pPr>
+            <w:r>
+              <w:rPr>
+                <w:rFonts w:ascii="Arial" w:hAnsi="Arial" w:eastAsia="Arial" w:cs="Arial"/>
                 <w:i w:val="false"/>
                 <w:b w:val="false"/>
                 <w:u w:val="none"/>
@@ -3567,7 +3537,6 @@
           </w:tcPr>
           <w:p>
             <w:pPr>
-              <w:pStyle w:val="Normal"/>
               <w:jc w:val="center"/>
               <w:pBdr>
                 <w:bottom w:val="none" w:sz="0" w:space="0" w:color="000000"/>
@@ -3578,19 +3547,19 @@
               <w:spacing w:after="100" w:before="100" w:line="240"/>
               <w:ind w:left="100" w:right="100" w:firstLine="0" w:firstLineChars="0"/>
               <w:rPr>
-                <w:rFonts w:ascii="Helvetica" w:hAnsi="Helvetica" w:eastAsia="Helvetica" w:cs="Helvetica"/>
-                <w:i w:val="false"/>
-                <w:b w:val="false"/>
-                <w:u w:val="none"/>
-                <w:strike w:val="false"/>
-                <w:sz w:val="22"/>
-                <w:szCs w:val="22"/>
-                <w:color w:val="000000"/>
-              </w:rPr>
-            </w:pPr>
-            <w:r>
-              <w:rPr>
-                <w:rFonts w:ascii="Helvetica" w:hAnsi="Helvetica" w:eastAsia="Helvetica" w:cs="Helvetica"/>
+                <w:rFonts w:ascii="Arial" w:hAnsi="Arial" w:eastAsia="Arial" w:cs="Arial"/>
+                <w:i w:val="false"/>
+                <w:b w:val="false"/>
+                <w:u w:val="none"/>
+                <w:strike w:val="false"/>
+                <w:sz w:val="22"/>
+                <w:szCs w:val="22"/>
+                <w:color w:val="000000"/>
+              </w:rPr>
+            </w:pPr>
+            <w:r>
+              <w:rPr>
+                <w:rFonts w:ascii="Arial" w:hAnsi="Arial" w:eastAsia="Arial" w:cs="Arial"/>
                 <w:i w:val="false"/>
                 <w:b w:val="false"/>
                 <w:u w:val="none"/>
@@ -3606,28 +3575,28 @@
       </w:tr>
       <w:tr>
         <w:trPr>
-          <w:trHeight w:val="608" w:hRule="auto"/>
+          <w:trHeight w:val="617" w:hRule="auto"/>
         </w:trPr>
-        <w:tc>
-          <w:tcPr>
-            <w:tcBorders>
-              <w:bottom w:val="none" w:sz="0" w:space="0" w:color="000000"/>
-              <w:top w:val="none" w:sz="0" w:space="0" w:color="000000"/>
-              <w:left w:val="none" w:sz="0" w:space="0" w:color="000000"/>
-              <w:right w:val="none" w:sz="0" w:space="0" w:color="000000"/>
-            </w:tcBorders>
-            <w:shd w:val="clear" w:color="auto" w:fill="FFFFFF"/>
-            <w:tcMar>
-              <w:top w:w="0" w:type="dxa"/>
-              <w:bottom w:w="0" w:type="dxa"/>
-              <w:left w:w="0" w:type="dxa"/>
-              <w:right w:w="0" w:type="dxa"/>
-            </w:tcMar>
-            <w:vAlign w:val="top"/>
-          </w:tcPr>
-          <w:p>
-            <w:pPr>
-              <w:pStyle w:val="Normal"/>
+        body31
+        <w:tc>
+          <w:tcPr>
+            <w:tcBorders>
+              <w:bottom w:val="none" w:sz="0" w:space="0" w:color="000000"/>
+              <w:top w:val="none" w:sz="0" w:space="0" w:color="000000"/>
+              <w:left w:val="none" w:sz="0" w:space="0" w:color="000000"/>
+              <w:right w:val="none" w:sz="0" w:space="0" w:color="000000"/>
+            </w:tcBorders>
+            <w:shd w:val="clear" w:color="auto" w:fill="FFFFFF"/>
+            <w:tcMar>
+              <w:top w:w="0" w:type="dxa"/>
+              <w:bottom w:w="0" w:type="dxa"/>
+              <w:left w:w="0" w:type="dxa"/>
+              <w:right w:w="0" w:type="dxa"/>
+            </w:tcMar>
+            <w:vAlign w:val="top"/>
+          </w:tcPr>
+          <w:p>
+            <w:pPr>
               <w:jc w:val="left"/>
               <w:pBdr>
                 <w:bottom w:val="none" w:sz="0" w:space="0" w:color="000000"/>
@@ -3638,19 +3607,19 @@
               <w:spacing w:after="100" w:before="100" w:line="240"/>
               <w:ind w:left="300" w:right="100" w:firstLine="0" w:firstLineChars="0"/>
               <w:rPr>
-                <w:rFonts w:ascii="Helvetica" w:hAnsi="Helvetica" w:eastAsia="Helvetica" w:cs="Helvetica"/>
-                <w:i w:val="false"/>
-                <w:b w:val="false"/>
-                <w:u w:val="none"/>
-                <w:strike w:val="false"/>
-                <w:sz w:val="22"/>
-                <w:szCs w:val="22"/>
-                <w:color w:val="000000"/>
-              </w:rPr>
-            </w:pPr>
-            <w:r>
-              <w:rPr>
-                <w:rFonts w:ascii="Helvetica" w:hAnsi="Helvetica" w:eastAsia="Helvetica" w:cs="Helvetica"/>
+                <w:rFonts w:ascii="Arial" w:hAnsi="Arial" w:eastAsia="Arial" w:cs="Arial"/>
+                <w:i w:val="false"/>
+                <w:b w:val="false"/>
+                <w:u w:val="none"/>
+                <w:strike w:val="false"/>
+                <w:sz w:val="22"/>
+                <w:szCs w:val="22"/>
+                <w:color w:val="000000"/>
+              </w:rPr>
+            </w:pPr>
+            <w:r>
+              <w:rPr>
+                <w:rFonts w:ascii="Arial" w:hAnsi="Arial" w:eastAsia="Arial" w:cs="Arial"/>
                 <w:i w:val="false"/>
                 <w:b w:val="false"/>
                 <w:u w:val="none"/>
@@ -3682,7 +3651,6 @@
           </w:tcPr>
           <w:p>
             <w:pPr>
-              <w:pStyle w:val="Normal"/>
               <w:jc w:val="center"/>
               <w:pBdr>
                 <w:bottom w:val="none" w:sz="0" w:space="0" w:color="000000"/>
@@ -3693,19 +3661,19 @@
               <w:spacing w:after="100" w:before="100" w:line="240"/>
               <w:ind w:left="100" w:right="100" w:firstLine="0" w:firstLineChars="0"/>
               <w:rPr>
-                <w:rFonts w:ascii="Helvetica" w:hAnsi="Helvetica" w:eastAsia="Helvetica" w:cs="Helvetica"/>
-                <w:i w:val="false"/>
-                <w:b w:val="false"/>
-                <w:u w:val="none"/>
-                <w:strike w:val="false"/>
-                <w:sz w:val="22"/>
-                <w:szCs w:val="22"/>
-                <w:color w:val="000000"/>
-              </w:rPr>
-            </w:pPr>
-            <w:r>
-              <w:rPr>
-                <w:rFonts w:ascii="Helvetica" w:hAnsi="Helvetica" w:eastAsia="Helvetica" w:cs="Helvetica"/>
+                <w:rFonts w:ascii="Arial" w:hAnsi="Arial" w:eastAsia="Arial" w:cs="Arial"/>
+                <w:i w:val="false"/>
+                <w:b w:val="false"/>
+                <w:u w:val="none"/>
+                <w:strike w:val="false"/>
+                <w:sz w:val="22"/>
+                <w:szCs w:val="22"/>
+                <w:color w:val="000000"/>
+              </w:rPr>
+            </w:pPr>
+            <w:r>
+              <w:rPr>
+                <w:rFonts w:ascii="Arial" w:hAnsi="Arial" w:eastAsia="Arial" w:cs="Arial"/>
                 <w:i w:val="false"/>
                 <w:b w:val="false"/>
                 <w:u w:val="none"/>
@@ -3721,28 +3689,28 @@
       </w:tr>
       <w:tr>
         <w:trPr>
-          <w:trHeight w:val="608" w:hRule="auto"/>
+          <w:trHeight w:val="617" w:hRule="auto"/>
         </w:trPr>
-        <w:tc>
-          <w:tcPr>
-            <w:tcBorders>
-              <w:bottom w:val="none" w:sz="0" w:space="0" w:color="000000"/>
-              <w:top w:val="none" w:sz="0" w:space="0" w:color="000000"/>
-              <w:left w:val="none" w:sz="0" w:space="0" w:color="000000"/>
-              <w:right w:val="none" w:sz="0" w:space="0" w:color="000000"/>
-            </w:tcBorders>
-            <w:shd w:val="clear" w:color="auto" w:fill="FFFFFF"/>
-            <w:tcMar>
-              <w:top w:w="0" w:type="dxa"/>
-              <w:bottom w:w="0" w:type="dxa"/>
-              <w:left w:w="0" w:type="dxa"/>
-              <w:right w:w="0" w:type="dxa"/>
-            </w:tcMar>
-            <w:vAlign w:val="top"/>
-          </w:tcPr>
-          <w:p>
-            <w:pPr>
-              <w:pStyle w:val="Normal"/>
+        body32
+        <w:tc>
+          <w:tcPr>
+            <w:tcBorders>
+              <w:bottom w:val="none" w:sz="0" w:space="0" w:color="000000"/>
+              <w:top w:val="none" w:sz="0" w:space="0" w:color="000000"/>
+              <w:left w:val="none" w:sz="0" w:space="0" w:color="000000"/>
+              <w:right w:val="none" w:sz="0" w:space="0" w:color="000000"/>
+            </w:tcBorders>
+            <w:shd w:val="clear" w:color="auto" w:fill="FFFFFF"/>
+            <w:tcMar>
+              <w:top w:w="0" w:type="dxa"/>
+              <w:bottom w:w="0" w:type="dxa"/>
+              <w:left w:w="0" w:type="dxa"/>
+              <w:right w:w="0" w:type="dxa"/>
+            </w:tcMar>
+            <w:vAlign w:val="top"/>
+          </w:tcPr>
+          <w:p>
+            <w:pPr>
               <w:jc w:val="left"/>
               <w:pBdr>
                 <w:bottom w:val="none" w:sz="0" w:space="0" w:color="000000"/>
@@ -3753,7 +3721,7 @@
               <w:spacing w:after="100" w:before="100" w:line="240"/>
               <w:ind w:left="100" w:right="100" w:firstLine="0" w:firstLineChars="0"/>
               <w:rPr>
-                <w:rFonts w:ascii="Helvetica" w:hAnsi="Helvetica" w:eastAsia="Helvetica" w:cs="Helvetica"/>
+                <w:rFonts w:ascii="Arial" w:hAnsi="Arial" w:eastAsia="Arial" w:cs="Arial"/>
                 <w:i w:val="false"/>
                 <w:b w:val="true"/>
                 <w:u w:val="none"/>
@@ -3765,7 +3733,7 @@
             </w:pPr>
             <w:r>
               <w:rPr>
-                <w:rFonts w:ascii="Helvetica" w:hAnsi="Helvetica" w:eastAsia="Helvetica" w:cs="Helvetica"/>
+                <w:rFonts w:ascii="Arial" w:hAnsi="Arial" w:eastAsia="Arial" w:cs="Arial"/>
                 <w:i w:val="false"/>
                 <w:b w:val="true"/>
                 <w:u w:val="none"/>
@@ -3797,7 +3765,6 @@
           </w:tcPr>
           <w:p>
             <w:pPr>
-              <w:pStyle w:val="Normal"/>
               <w:jc w:val="center"/>
               <w:pBdr>
                 <w:bottom w:val="none" w:sz="0" w:space="0" w:color="000000"/>
@@ -3808,19 +3775,19 @@
               <w:spacing w:after="100" w:before="100" w:line="240"/>
               <w:ind w:left="100" w:right="100" w:firstLine="0" w:firstLineChars="0"/>
               <w:rPr>
-                <w:rFonts w:ascii="Helvetica" w:hAnsi="Helvetica" w:eastAsia="Helvetica" w:cs="Helvetica"/>
-                <w:i w:val="false"/>
-                <w:b w:val="false"/>
-                <w:u w:val="none"/>
-                <w:strike w:val="false"/>
-                <w:sz w:val="22"/>
-                <w:szCs w:val="22"/>
-                <w:color w:val="000000"/>
-              </w:rPr>
-            </w:pPr>
-            <w:r>
-              <w:rPr>
-                <w:rFonts w:ascii="Helvetica" w:hAnsi="Helvetica" w:eastAsia="Helvetica" w:cs="Helvetica"/>
+                <w:rFonts w:ascii="Arial" w:hAnsi="Arial" w:eastAsia="Arial" w:cs="Arial"/>
+                <w:i w:val="false"/>
+                <w:b w:val="false"/>
+                <w:u w:val="none"/>
+                <w:strike w:val="false"/>
+                <w:sz w:val="22"/>
+                <w:szCs w:val="22"/>
+                <w:color w:val="000000"/>
+              </w:rPr>
+            </w:pPr>
+            <w:r>
+              <w:rPr>
+                <w:rFonts w:ascii="Arial" w:hAnsi="Arial" w:eastAsia="Arial" w:cs="Arial"/>
                 <w:i w:val="false"/>
                 <w:b w:val="false"/>
                 <w:u w:val="none"/>
@@ -3836,28 +3803,28 @@
       </w:tr>
       <w:tr>
         <w:trPr>
-          <w:trHeight w:val="608" w:hRule="auto"/>
+          <w:trHeight w:val="617" w:hRule="auto"/>
         </w:trPr>
-        <w:tc>
-          <w:tcPr>
-            <w:tcBorders>
-              <w:bottom w:val="none" w:sz="0" w:space="0" w:color="000000"/>
-              <w:top w:val="none" w:sz="0" w:space="0" w:color="000000"/>
-              <w:left w:val="none" w:sz="0" w:space="0" w:color="000000"/>
-              <w:right w:val="none" w:sz="0" w:space="0" w:color="000000"/>
-            </w:tcBorders>
-            <w:shd w:val="clear" w:color="auto" w:fill="FFFFFF"/>
-            <w:tcMar>
-              <w:top w:w="0" w:type="dxa"/>
-              <w:bottom w:w="0" w:type="dxa"/>
-              <w:left w:w="0" w:type="dxa"/>
-              <w:right w:w="0" w:type="dxa"/>
-            </w:tcMar>
-            <w:vAlign w:val="top"/>
-          </w:tcPr>
-          <w:p>
-            <w:pPr>
-              <w:pStyle w:val="Normal"/>
+        body33
+        <w:tc>
+          <w:tcPr>
+            <w:tcBorders>
+              <w:bottom w:val="none" w:sz="0" w:space="0" w:color="000000"/>
+              <w:top w:val="none" w:sz="0" w:space="0" w:color="000000"/>
+              <w:left w:val="none" w:sz="0" w:space="0" w:color="000000"/>
+              <w:right w:val="none" w:sz="0" w:space="0" w:color="000000"/>
+            </w:tcBorders>
+            <w:shd w:val="clear" w:color="auto" w:fill="FFFFFF"/>
+            <w:tcMar>
+              <w:top w:w="0" w:type="dxa"/>
+              <w:bottom w:w="0" w:type="dxa"/>
+              <w:left w:w="0" w:type="dxa"/>
+              <w:right w:w="0" w:type="dxa"/>
+            </w:tcMar>
+            <w:vAlign w:val="top"/>
+          </w:tcPr>
+          <w:p>
+            <w:pPr>
               <w:jc w:val="left"/>
               <w:pBdr>
                 <w:bottom w:val="none" w:sz="0" w:space="0" w:color="000000"/>
@@ -3868,19 +3835,19 @@
               <w:spacing w:after="100" w:before="100" w:line="240"/>
               <w:ind w:left="300" w:right="100" w:firstLine="0" w:firstLineChars="0"/>
               <w:rPr>
-                <w:rFonts w:ascii="Helvetica" w:hAnsi="Helvetica" w:eastAsia="Helvetica" w:cs="Helvetica"/>
-                <w:i w:val="false"/>
-                <w:b w:val="false"/>
-                <w:u w:val="none"/>
-                <w:strike w:val="false"/>
-                <w:sz w:val="22"/>
-                <w:szCs w:val="22"/>
-                <w:color w:val="000000"/>
-              </w:rPr>
-            </w:pPr>
-            <w:r>
-              <w:rPr>
-                <w:rFonts w:ascii="Helvetica" w:hAnsi="Helvetica" w:eastAsia="Helvetica" w:cs="Helvetica"/>
+                <w:rFonts w:ascii="Arial" w:hAnsi="Arial" w:eastAsia="Arial" w:cs="Arial"/>
+                <w:i w:val="false"/>
+                <w:b w:val="false"/>
+                <w:u w:val="none"/>
+                <w:strike w:val="false"/>
+                <w:sz w:val="22"/>
+                <w:szCs w:val="22"/>
+                <w:color w:val="000000"/>
+              </w:rPr>
+            </w:pPr>
+            <w:r>
+              <w:rPr>
+                <w:rFonts w:ascii="Arial" w:hAnsi="Arial" w:eastAsia="Arial" w:cs="Arial"/>
                 <w:i w:val="false"/>
                 <w:b w:val="false"/>
                 <w:u w:val="none"/>
@@ -3912,7 +3879,6 @@
           </w:tcPr>
           <w:p>
             <w:pPr>
-              <w:pStyle w:val="Normal"/>
               <w:jc w:val="center"/>
               <w:pBdr>
                 <w:bottom w:val="none" w:sz="0" w:space="0" w:color="000000"/>
@@ -3923,19 +3889,19 @@
               <w:spacing w:after="100" w:before="100" w:line="240"/>
               <w:ind w:left="100" w:right="100" w:firstLine="0" w:firstLineChars="0"/>
               <w:rPr>
-                <w:rFonts w:ascii="Helvetica" w:hAnsi="Helvetica" w:eastAsia="Helvetica" w:cs="Helvetica"/>
-                <w:i w:val="false"/>
-                <w:b w:val="false"/>
-                <w:u w:val="none"/>
-                <w:strike w:val="false"/>
-                <w:sz w:val="22"/>
-                <w:szCs w:val="22"/>
-                <w:color w:val="000000"/>
-              </w:rPr>
-            </w:pPr>
-            <w:r>
-              <w:rPr>
-                <w:rFonts w:ascii="Helvetica" w:hAnsi="Helvetica" w:eastAsia="Helvetica" w:cs="Helvetica"/>
+                <w:rFonts w:ascii="Arial" w:hAnsi="Arial" w:eastAsia="Arial" w:cs="Arial"/>
+                <w:i w:val="false"/>
+                <w:b w:val="false"/>
+                <w:u w:val="none"/>
+                <w:strike w:val="false"/>
+                <w:sz w:val="22"/>
+                <w:szCs w:val="22"/>
+                <w:color w:val="000000"/>
+              </w:rPr>
+            </w:pPr>
+            <w:r>
+              <w:rPr>
+                <w:rFonts w:ascii="Arial" w:hAnsi="Arial" w:eastAsia="Arial" w:cs="Arial"/>
                 <w:i w:val="false"/>
                 <w:b w:val="false"/>
                 <w:u w:val="none"/>
@@ -3951,28 +3917,28 @@
       </w:tr>
       <w:tr>
         <w:trPr>
-          <w:trHeight w:val="608" w:hRule="auto"/>
+          <w:trHeight w:val="617" w:hRule="auto"/>
         </w:trPr>
-        <w:tc>
-          <w:tcPr>
-            <w:tcBorders>
-              <w:bottom w:val="none" w:sz="0" w:space="0" w:color="000000"/>
-              <w:top w:val="none" w:sz="0" w:space="0" w:color="000000"/>
-              <w:left w:val="none" w:sz="0" w:space="0" w:color="000000"/>
-              <w:right w:val="none" w:sz="0" w:space="0" w:color="000000"/>
-            </w:tcBorders>
-            <w:shd w:val="clear" w:color="auto" w:fill="FFFFFF"/>
-            <w:tcMar>
-              <w:top w:w="0" w:type="dxa"/>
-              <w:bottom w:w="0" w:type="dxa"/>
-              <w:left w:w="0" w:type="dxa"/>
-              <w:right w:w="0" w:type="dxa"/>
-            </w:tcMar>
-            <w:vAlign w:val="top"/>
-          </w:tcPr>
-          <w:p>
-            <w:pPr>
-              <w:pStyle w:val="Normal"/>
+        body34
+        <w:tc>
+          <w:tcPr>
+            <w:tcBorders>
+              <w:bottom w:val="none" w:sz="0" w:space="0" w:color="000000"/>
+              <w:top w:val="none" w:sz="0" w:space="0" w:color="000000"/>
+              <w:left w:val="none" w:sz="0" w:space="0" w:color="000000"/>
+              <w:right w:val="none" w:sz="0" w:space="0" w:color="000000"/>
+            </w:tcBorders>
+            <w:shd w:val="clear" w:color="auto" w:fill="FFFFFF"/>
+            <w:tcMar>
+              <w:top w:w="0" w:type="dxa"/>
+              <w:bottom w:w="0" w:type="dxa"/>
+              <w:left w:w="0" w:type="dxa"/>
+              <w:right w:w="0" w:type="dxa"/>
+            </w:tcMar>
+            <w:vAlign w:val="top"/>
+          </w:tcPr>
+          <w:p>
+            <w:pPr>
               <w:jc w:val="left"/>
               <w:pBdr>
                 <w:bottom w:val="none" w:sz="0" w:space="0" w:color="000000"/>
@@ -3983,19 +3949,19 @@
               <w:spacing w:after="100" w:before="100" w:line="240"/>
               <w:ind w:left="300" w:right="100" w:firstLine="0" w:firstLineChars="0"/>
               <w:rPr>
-                <w:rFonts w:ascii="Helvetica" w:hAnsi="Helvetica" w:eastAsia="Helvetica" w:cs="Helvetica"/>
-                <w:i w:val="false"/>
-                <w:b w:val="false"/>
-                <w:u w:val="none"/>
-                <w:strike w:val="false"/>
-                <w:sz w:val="22"/>
-                <w:szCs w:val="22"/>
-                <w:color w:val="000000"/>
-              </w:rPr>
-            </w:pPr>
-            <w:r>
-              <w:rPr>
-                <w:rFonts w:ascii="Helvetica" w:hAnsi="Helvetica" w:eastAsia="Helvetica" w:cs="Helvetica"/>
+                <w:rFonts w:ascii="Arial" w:hAnsi="Arial" w:eastAsia="Arial" w:cs="Arial"/>
+                <w:i w:val="false"/>
+                <w:b w:val="false"/>
+                <w:u w:val="none"/>
+                <w:strike w:val="false"/>
+                <w:sz w:val="22"/>
+                <w:szCs w:val="22"/>
+                <w:color w:val="000000"/>
+              </w:rPr>
+            </w:pPr>
+            <w:r>
+              <w:rPr>
+                <w:rFonts w:ascii="Arial" w:hAnsi="Arial" w:eastAsia="Arial" w:cs="Arial"/>
                 <w:i w:val="false"/>
                 <w:b w:val="false"/>
                 <w:u w:val="none"/>
@@ -4027,7 +3993,6 @@
           </w:tcPr>
           <w:p>
             <w:pPr>
-              <w:pStyle w:val="Normal"/>
               <w:jc w:val="center"/>
               <w:pBdr>
                 <w:bottom w:val="none" w:sz="0" w:space="0" w:color="000000"/>
@@ -4038,19 +4003,19 @@
               <w:spacing w:after="100" w:before="100" w:line="240"/>
               <w:ind w:left="100" w:right="100" w:firstLine="0" w:firstLineChars="0"/>
               <w:rPr>
-                <w:rFonts w:ascii="Helvetica" w:hAnsi="Helvetica" w:eastAsia="Helvetica" w:cs="Helvetica"/>
-                <w:i w:val="false"/>
-                <w:b w:val="false"/>
-                <w:u w:val="none"/>
-                <w:strike w:val="false"/>
-                <w:sz w:val="22"/>
-                <w:szCs w:val="22"/>
-                <w:color w:val="000000"/>
-              </w:rPr>
-            </w:pPr>
-            <w:r>
-              <w:rPr>
-                <w:rFonts w:ascii="Helvetica" w:hAnsi="Helvetica" w:eastAsia="Helvetica" w:cs="Helvetica"/>
+                <w:rFonts w:ascii="Arial" w:hAnsi="Arial" w:eastAsia="Arial" w:cs="Arial"/>
+                <w:i w:val="false"/>
+                <w:b w:val="false"/>
+                <w:u w:val="none"/>
+                <w:strike w:val="false"/>
+                <w:sz w:val="22"/>
+                <w:szCs w:val="22"/>
+                <w:color w:val="000000"/>
+              </w:rPr>
+            </w:pPr>
+            <w:r>
+              <w:rPr>
+                <w:rFonts w:ascii="Arial" w:hAnsi="Arial" w:eastAsia="Arial" w:cs="Arial"/>
                 <w:i w:val="false"/>
                 <w:b w:val="false"/>
                 <w:u w:val="none"/>
@@ -4066,28 +4031,28 @@
       </w:tr>
       <w:tr>
         <w:trPr>
-          <w:trHeight w:val="608" w:hRule="auto"/>
+          <w:trHeight w:val="617" w:hRule="auto"/>
         </w:trPr>
-        <w:tc>
-          <w:tcPr>
-            <w:tcBorders>
-              <w:bottom w:val="none" w:sz="0" w:space="0" w:color="000000"/>
-              <w:top w:val="none" w:sz="0" w:space="0" w:color="000000"/>
-              <w:left w:val="none" w:sz="0" w:space="0" w:color="000000"/>
-              <w:right w:val="none" w:sz="0" w:space="0" w:color="000000"/>
-            </w:tcBorders>
-            <w:shd w:val="clear" w:color="auto" w:fill="FFFFFF"/>
-            <w:tcMar>
-              <w:top w:w="0" w:type="dxa"/>
-              <w:bottom w:w="0" w:type="dxa"/>
-              <w:left w:w="0" w:type="dxa"/>
-              <w:right w:w="0" w:type="dxa"/>
-            </w:tcMar>
-            <w:vAlign w:val="top"/>
-          </w:tcPr>
-          <w:p>
-            <w:pPr>
-              <w:pStyle w:val="Normal"/>
+        body35
+        <w:tc>
+          <w:tcPr>
+            <w:tcBorders>
+              <w:bottom w:val="none" w:sz="0" w:space="0" w:color="000000"/>
+              <w:top w:val="none" w:sz="0" w:space="0" w:color="000000"/>
+              <w:left w:val="none" w:sz="0" w:space="0" w:color="000000"/>
+              <w:right w:val="none" w:sz="0" w:space="0" w:color="000000"/>
+            </w:tcBorders>
+            <w:shd w:val="clear" w:color="auto" w:fill="FFFFFF"/>
+            <w:tcMar>
+              <w:top w:w="0" w:type="dxa"/>
+              <w:bottom w:w="0" w:type="dxa"/>
+              <w:left w:w="0" w:type="dxa"/>
+              <w:right w:w="0" w:type="dxa"/>
+            </w:tcMar>
+            <w:vAlign w:val="top"/>
+          </w:tcPr>
+          <w:p>
+            <w:pPr>
               <w:jc w:val="left"/>
               <w:pBdr>
                 <w:bottom w:val="none" w:sz="0" w:space="0" w:color="000000"/>
@@ -4098,19 +4063,19 @@
               <w:spacing w:after="100" w:before="100" w:line="240"/>
               <w:ind w:left="300" w:right="100" w:firstLine="0" w:firstLineChars="0"/>
               <w:rPr>
-                <w:rFonts w:ascii="Helvetica" w:hAnsi="Helvetica" w:eastAsia="Helvetica" w:cs="Helvetica"/>
-                <w:i w:val="false"/>
-                <w:b w:val="false"/>
-                <w:u w:val="none"/>
-                <w:strike w:val="false"/>
-                <w:sz w:val="22"/>
-                <w:szCs w:val="22"/>
-                <w:color w:val="000000"/>
-              </w:rPr>
-            </w:pPr>
-            <w:r>
-              <w:rPr>
-                <w:rFonts w:ascii="Helvetica" w:hAnsi="Helvetica" w:eastAsia="Helvetica" w:cs="Helvetica"/>
+                <w:rFonts w:ascii="Arial" w:hAnsi="Arial" w:eastAsia="Arial" w:cs="Arial"/>
+                <w:i w:val="false"/>
+                <w:b w:val="false"/>
+                <w:u w:val="none"/>
+                <w:strike w:val="false"/>
+                <w:sz w:val="22"/>
+                <w:szCs w:val="22"/>
+                <w:color w:val="000000"/>
+              </w:rPr>
+            </w:pPr>
+            <w:r>
+              <w:rPr>
+                <w:rFonts w:ascii="Arial" w:hAnsi="Arial" w:eastAsia="Arial" w:cs="Arial"/>
                 <w:i w:val="false"/>
                 <w:b w:val="false"/>
                 <w:u w:val="none"/>
@@ -4142,7 +4107,6 @@
           </w:tcPr>
           <w:p>
             <w:pPr>
-              <w:pStyle w:val="Normal"/>
               <w:jc w:val="center"/>
               <w:pBdr>
                 <w:bottom w:val="none" w:sz="0" w:space="0" w:color="000000"/>
@@ -4153,19 +4117,19 @@
               <w:spacing w:after="100" w:before="100" w:line="240"/>
               <w:ind w:left="100" w:right="100" w:firstLine="0" w:firstLineChars="0"/>
               <w:rPr>
-                <w:rFonts w:ascii="Helvetica" w:hAnsi="Helvetica" w:eastAsia="Helvetica" w:cs="Helvetica"/>
-                <w:i w:val="false"/>
-                <w:b w:val="false"/>
-                <w:u w:val="none"/>
-                <w:strike w:val="false"/>
-                <w:sz w:val="22"/>
-                <w:szCs w:val="22"/>
-                <w:color w:val="000000"/>
-              </w:rPr>
-            </w:pPr>
-            <w:r>
-              <w:rPr>
-                <w:rFonts w:ascii="Helvetica" w:hAnsi="Helvetica" w:eastAsia="Helvetica" w:cs="Helvetica"/>
+                <w:rFonts w:ascii="Arial" w:hAnsi="Arial" w:eastAsia="Arial" w:cs="Arial"/>
+                <w:i w:val="false"/>
+                <w:b w:val="false"/>
+                <w:u w:val="none"/>
+                <w:strike w:val="false"/>
+                <w:sz w:val="22"/>
+                <w:szCs w:val="22"/>
+                <w:color w:val="000000"/>
+              </w:rPr>
+            </w:pPr>
+            <w:r>
+              <w:rPr>
+                <w:rFonts w:ascii="Arial" w:hAnsi="Arial" w:eastAsia="Arial" w:cs="Arial"/>
                 <w:i w:val="false"/>
                 <w:b w:val="false"/>
                 <w:u w:val="none"/>
@@ -4181,28 +4145,28 @@
       </w:tr>
       <w:tr>
         <w:trPr>
-          <w:trHeight w:val="608" w:hRule="auto"/>
+          <w:trHeight w:val="617" w:hRule="auto"/>
         </w:trPr>
-        <w:tc>
-          <w:tcPr>
-            <w:tcBorders>
-              <w:bottom w:val="none" w:sz="0" w:space="0" w:color="000000"/>
-              <w:top w:val="none" w:sz="0" w:space="0" w:color="000000"/>
-              <w:left w:val="none" w:sz="0" w:space="0" w:color="000000"/>
-              <w:right w:val="none" w:sz="0" w:space="0" w:color="000000"/>
-            </w:tcBorders>
-            <w:shd w:val="clear" w:color="auto" w:fill="FFFFFF"/>
-            <w:tcMar>
-              <w:top w:w="0" w:type="dxa"/>
-              <w:bottom w:w="0" w:type="dxa"/>
-              <w:left w:w="0" w:type="dxa"/>
-              <w:right w:w="0" w:type="dxa"/>
-            </w:tcMar>
-            <w:vAlign w:val="top"/>
-          </w:tcPr>
-          <w:p>
-            <w:pPr>
-              <w:pStyle w:val="Normal"/>
+        body36
+        <w:tc>
+          <w:tcPr>
+            <w:tcBorders>
+              <w:bottom w:val="none" w:sz="0" w:space="0" w:color="000000"/>
+              <w:top w:val="none" w:sz="0" w:space="0" w:color="000000"/>
+              <w:left w:val="none" w:sz="0" w:space="0" w:color="000000"/>
+              <w:right w:val="none" w:sz="0" w:space="0" w:color="000000"/>
+            </w:tcBorders>
+            <w:shd w:val="clear" w:color="auto" w:fill="FFFFFF"/>
+            <w:tcMar>
+              <w:top w:w="0" w:type="dxa"/>
+              <w:bottom w:w="0" w:type="dxa"/>
+              <w:left w:w="0" w:type="dxa"/>
+              <w:right w:w="0" w:type="dxa"/>
+            </w:tcMar>
+            <w:vAlign w:val="top"/>
+          </w:tcPr>
+          <w:p>
+            <w:pPr>
               <w:jc w:val="left"/>
               <w:pBdr>
                 <w:bottom w:val="none" w:sz="0" w:space="0" w:color="000000"/>
@@ -4213,19 +4177,19 @@
               <w:spacing w:after="100" w:before="100" w:line="240"/>
               <w:ind w:left="300" w:right="100" w:firstLine="0" w:firstLineChars="0"/>
               <w:rPr>
-                <w:rFonts w:ascii="Helvetica" w:hAnsi="Helvetica" w:eastAsia="Helvetica" w:cs="Helvetica"/>
-                <w:i w:val="false"/>
-                <w:b w:val="false"/>
-                <w:u w:val="none"/>
-                <w:strike w:val="false"/>
-                <w:sz w:val="22"/>
-                <w:szCs w:val="22"/>
-                <w:color w:val="000000"/>
-              </w:rPr>
-            </w:pPr>
-            <w:r>
-              <w:rPr>
-                <w:rFonts w:ascii="Helvetica" w:hAnsi="Helvetica" w:eastAsia="Helvetica" w:cs="Helvetica"/>
+                <w:rFonts w:ascii="Arial" w:hAnsi="Arial" w:eastAsia="Arial" w:cs="Arial"/>
+                <w:i w:val="false"/>
+                <w:b w:val="false"/>
+                <w:u w:val="none"/>
+                <w:strike w:val="false"/>
+                <w:sz w:val="22"/>
+                <w:szCs w:val="22"/>
+                <w:color w:val="000000"/>
+              </w:rPr>
+            </w:pPr>
+            <w:r>
+              <w:rPr>
+                <w:rFonts w:ascii="Arial" w:hAnsi="Arial" w:eastAsia="Arial" w:cs="Arial"/>
                 <w:i w:val="false"/>
                 <w:b w:val="false"/>
                 <w:u w:val="none"/>
@@ -4257,7 +4221,6 @@
           </w:tcPr>
           <w:p>
             <w:pPr>
-              <w:pStyle w:val="Normal"/>
               <w:jc w:val="center"/>
               <w:pBdr>
                 <w:bottom w:val="none" w:sz="0" w:space="0" w:color="000000"/>
@@ -4268,19 +4231,19 @@
               <w:spacing w:after="100" w:before="100" w:line="240"/>
               <w:ind w:left="100" w:right="100" w:firstLine="0" w:firstLineChars="0"/>
               <w:rPr>
-                <w:rFonts w:ascii="Helvetica" w:hAnsi="Helvetica" w:eastAsia="Helvetica" w:cs="Helvetica"/>
-                <w:i w:val="false"/>
-                <w:b w:val="false"/>
-                <w:u w:val="none"/>
-                <w:strike w:val="false"/>
-                <w:sz w:val="22"/>
-                <w:szCs w:val="22"/>
-                <w:color w:val="000000"/>
-              </w:rPr>
-            </w:pPr>
-            <w:r>
-              <w:rPr>
-                <w:rFonts w:ascii="Helvetica" w:hAnsi="Helvetica" w:eastAsia="Helvetica" w:cs="Helvetica"/>
+                <w:rFonts w:ascii="Arial" w:hAnsi="Arial" w:eastAsia="Arial" w:cs="Arial"/>
+                <w:i w:val="false"/>
+                <w:b w:val="false"/>
+                <w:u w:val="none"/>
+                <w:strike w:val="false"/>
+                <w:sz w:val="22"/>
+                <w:szCs w:val="22"/>
+                <w:color w:val="000000"/>
+              </w:rPr>
+            </w:pPr>
+            <w:r>
+              <w:rPr>
+                <w:rFonts w:ascii="Arial" w:hAnsi="Arial" w:eastAsia="Arial" w:cs="Arial"/>
                 <w:i w:val="false"/>
                 <w:b w:val="false"/>
                 <w:u w:val="none"/>
@@ -4296,28 +4259,28 @@
       </w:tr>
       <w:tr>
         <w:trPr>
-          <w:trHeight w:val="608" w:hRule="auto"/>
+          <w:trHeight w:val="617" w:hRule="auto"/>
         </w:trPr>
-        <w:tc>
-          <w:tcPr>
-            <w:tcBorders>
-              <w:bottom w:val="none" w:sz="0" w:space="0" w:color="000000"/>
-              <w:top w:val="none" w:sz="0" w:space="0" w:color="000000"/>
-              <w:left w:val="none" w:sz="0" w:space="0" w:color="000000"/>
-              <w:right w:val="none" w:sz="0" w:space="0" w:color="000000"/>
-            </w:tcBorders>
-            <w:shd w:val="clear" w:color="auto" w:fill="FFFFFF"/>
-            <w:tcMar>
-              <w:top w:w="0" w:type="dxa"/>
-              <w:bottom w:w="0" w:type="dxa"/>
-              <w:left w:w="0" w:type="dxa"/>
-              <w:right w:w="0" w:type="dxa"/>
-            </w:tcMar>
-            <w:vAlign w:val="top"/>
-          </w:tcPr>
-          <w:p>
-            <w:pPr>
-              <w:pStyle w:val="Normal"/>
+        body37
+        <w:tc>
+          <w:tcPr>
+            <w:tcBorders>
+              <w:bottom w:val="none" w:sz="0" w:space="0" w:color="000000"/>
+              <w:top w:val="none" w:sz="0" w:space="0" w:color="000000"/>
+              <w:left w:val="none" w:sz="0" w:space="0" w:color="000000"/>
+              <w:right w:val="none" w:sz="0" w:space="0" w:color="000000"/>
+            </w:tcBorders>
+            <w:shd w:val="clear" w:color="auto" w:fill="FFFFFF"/>
+            <w:tcMar>
+              <w:top w:w="0" w:type="dxa"/>
+              <w:bottom w:w="0" w:type="dxa"/>
+              <w:left w:w="0" w:type="dxa"/>
+              <w:right w:w="0" w:type="dxa"/>
+            </w:tcMar>
+            <w:vAlign w:val="top"/>
+          </w:tcPr>
+          <w:p>
+            <w:pPr>
               <w:jc w:val="left"/>
               <w:pBdr>
                 <w:bottom w:val="none" w:sz="0" w:space="0" w:color="000000"/>
@@ -4328,7 +4291,7 @@
               <w:spacing w:after="100" w:before="100" w:line="240"/>
               <w:ind w:left="100" w:right="100" w:firstLine="0" w:firstLineChars="0"/>
               <w:rPr>
-                <w:rFonts w:ascii="Helvetica" w:hAnsi="Helvetica" w:eastAsia="Helvetica" w:cs="Helvetica"/>
+                <w:rFonts w:ascii="Arial" w:hAnsi="Arial" w:eastAsia="Arial" w:cs="Arial"/>
                 <w:i w:val="false"/>
                 <w:b w:val="true"/>
                 <w:u w:val="none"/>
@@ -4340,7 +4303,7 @@
             </w:pPr>
             <w:r>
               <w:rPr>
-                <w:rFonts w:ascii="Helvetica" w:hAnsi="Helvetica" w:eastAsia="Helvetica" w:cs="Helvetica"/>
+                <w:rFonts w:ascii="Arial" w:hAnsi="Arial" w:eastAsia="Arial" w:cs="Arial"/>
                 <w:i w:val="false"/>
                 <w:b w:val="true"/>
                 <w:u w:val="none"/>
@@ -4372,7 +4335,6 @@
           </w:tcPr>
           <w:p>
             <w:pPr>
-              <w:pStyle w:val="Normal"/>
               <w:jc w:val="center"/>
               <w:pBdr>
                 <w:bottom w:val="none" w:sz="0" w:space="0" w:color="000000"/>
@@ -4383,19 +4345,19 @@
               <w:spacing w:after="100" w:before="100" w:line="240"/>
               <w:ind w:left="100" w:right="100" w:firstLine="0" w:firstLineChars="0"/>
               <w:rPr>
-                <w:rFonts w:ascii="Helvetica" w:hAnsi="Helvetica" w:eastAsia="Helvetica" w:cs="Helvetica"/>
-                <w:i w:val="false"/>
-                <w:b w:val="false"/>
-                <w:u w:val="none"/>
-                <w:strike w:val="false"/>
-                <w:sz w:val="22"/>
-                <w:szCs w:val="22"/>
-                <w:color w:val="000000"/>
-              </w:rPr>
-            </w:pPr>
-            <w:r>
-              <w:rPr>
-                <w:rFonts w:ascii="Helvetica" w:hAnsi="Helvetica" w:eastAsia="Helvetica" w:cs="Helvetica"/>
+                <w:rFonts w:ascii="Arial" w:hAnsi="Arial" w:eastAsia="Arial" w:cs="Arial"/>
+                <w:i w:val="false"/>
+                <w:b w:val="false"/>
+                <w:u w:val="none"/>
+                <w:strike w:val="false"/>
+                <w:sz w:val="22"/>
+                <w:szCs w:val="22"/>
+                <w:color w:val="000000"/>
+              </w:rPr>
+            </w:pPr>
+            <w:r>
+              <w:rPr>
+                <w:rFonts w:ascii="Arial" w:hAnsi="Arial" w:eastAsia="Arial" w:cs="Arial"/>
                 <w:i w:val="false"/>
                 <w:b w:val="false"/>
                 <w:u w:val="none"/>
@@ -4411,28 +4373,28 @@
       </w:tr>
       <w:tr>
         <w:trPr>
-          <w:trHeight w:val="608" w:hRule="auto"/>
+          <w:trHeight w:val="617" w:hRule="auto"/>
         </w:trPr>
-        <w:tc>
-          <w:tcPr>
-            <w:tcBorders>
-              <w:bottom w:val="none" w:sz="0" w:space="0" w:color="000000"/>
-              <w:top w:val="none" w:sz="0" w:space="0" w:color="000000"/>
-              <w:left w:val="none" w:sz="0" w:space="0" w:color="000000"/>
-              <w:right w:val="none" w:sz="0" w:space="0" w:color="000000"/>
-            </w:tcBorders>
-            <w:shd w:val="clear" w:color="auto" w:fill="FFFFFF"/>
-            <w:tcMar>
-              <w:top w:w="0" w:type="dxa"/>
-              <w:bottom w:w="0" w:type="dxa"/>
-              <w:left w:w="0" w:type="dxa"/>
-              <w:right w:w="0" w:type="dxa"/>
-            </w:tcMar>
-            <w:vAlign w:val="top"/>
-          </w:tcPr>
-          <w:p>
-            <w:pPr>
-              <w:pStyle w:val="Normal"/>
+        body38
+        <w:tc>
+          <w:tcPr>
+            <w:tcBorders>
+              <w:bottom w:val="none" w:sz="0" w:space="0" w:color="000000"/>
+              <w:top w:val="none" w:sz="0" w:space="0" w:color="000000"/>
+              <w:left w:val="none" w:sz="0" w:space="0" w:color="000000"/>
+              <w:right w:val="none" w:sz="0" w:space="0" w:color="000000"/>
+            </w:tcBorders>
+            <w:shd w:val="clear" w:color="auto" w:fill="FFFFFF"/>
+            <w:tcMar>
+              <w:top w:w="0" w:type="dxa"/>
+              <w:bottom w:w="0" w:type="dxa"/>
+              <w:left w:w="0" w:type="dxa"/>
+              <w:right w:w="0" w:type="dxa"/>
+            </w:tcMar>
+            <w:vAlign w:val="top"/>
+          </w:tcPr>
+          <w:p>
+            <w:pPr>
               <w:jc w:val="left"/>
               <w:pBdr>
                 <w:bottom w:val="none" w:sz="0" w:space="0" w:color="000000"/>
@@ -4443,7 +4405,7 @@
               <w:spacing w:after="100" w:before="100" w:line="240"/>
               <w:ind w:left="100" w:right="100" w:firstLine="0" w:firstLineChars="0"/>
               <w:rPr>
-                <w:rFonts w:ascii="Helvetica" w:hAnsi="Helvetica" w:eastAsia="Helvetica" w:cs="Helvetica"/>
+                <w:rFonts w:ascii="Arial" w:hAnsi="Arial" w:eastAsia="Arial" w:cs="Arial"/>
                 <w:i w:val="false"/>
                 <w:b w:val="true"/>
                 <w:u w:val="none"/>
@@ -4455,7 +4417,7 @@
             </w:pPr>
             <w:r>
               <w:rPr>
-                <w:rFonts w:ascii="Helvetica" w:hAnsi="Helvetica" w:eastAsia="Helvetica" w:cs="Helvetica"/>
+                <w:rFonts w:ascii="Arial" w:hAnsi="Arial" w:eastAsia="Arial" w:cs="Arial"/>
                 <w:i w:val="false"/>
                 <w:b w:val="true"/>
                 <w:u w:val="none"/>
@@ -4487,7 +4449,6 @@
           </w:tcPr>
           <w:p>
             <w:pPr>
-              <w:pStyle w:val="Normal"/>
               <w:jc w:val="center"/>
               <w:pBdr>
                 <w:bottom w:val="none" w:sz="0" w:space="0" w:color="000000"/>
@@ -4498,19 +4459,19 @@
               <w:spacing w:after="100" w:before="100" w:line="240"/>
               <w:ind w:left="100" w:right="100" w:firstLine="0" w:firstLineChars="0"/>
               <w:rPr>
-                <w:rFonts w:ascii="Helvetica" w:hAnsi="Helvetica" w:eastAsia="Helvetica" w:cs="Helvetica"/>
-                <w:i w:val="false"/>
-                <w:b w:val="false"/>
-                <w:u w:val="none"/>
-                <w:strike w:val="false"/>
-                <w:sz w:val="22"/>
-                <w:szCs w:val="22"/>
-                <w:color w:val="000000"/>
-              </w:rPr>
-            </w:pPr>
-            <w:r>
-              <w:rPr>
-                <w:rFonts w:ascii="Helvetica" w:hAnsi="Helvetica" w:eastAsia="Helvetica" w:cs="Helvetica"/>
+                <w:rFonts w:ascii="Arial" w:hAnsi="Arial" w:eastAsia="Arial" w:cs="Arial"/>
+                <w:i w:val="false"/>
+                <w:b w:val="false"/>
+                <w:u w:val="none"/>
+                <w:strike w:val="false"/>
+                <w:sz w:val="22"/>
+                <w:szCs w:val="22"/>
+                <w:color w:val="000000"/>
+              </w:rPr>
+            </w:pPr>
+            <w:r>
+              <w:rPr>
+                <w:rFonts w:ascii="Arial" w:hAnsi="Arial" w:eastAsia="Arial" w:cs="Arial"/>
                 <w:i w:val="false"/>
                 <w:b w:val="false"/>
                 <w:u w:val="none"/>
@@ -4526,28 +4487,28 @@
       </w:tr>
       <w:tr>
         <w:trPr>
-          <w:trHeight w:val="608" w:hRule="auto"/>
+          <w:trHeight w:val="617" w:hRule="auto"/>
         </w:trPr>
-        <w:tc>
-          <w:tcPr>
-            <w:tcBorders>
-              <w:bottom w:val="none" w:sz="0" w:space="0" w:color="000000"/>
-              <w:top w:val="none" w:sz="0" w:space="0" w:color="000000"/>
-              <w:left w:val="none" w:sz="0" w:space="0" w:color="000000"/>
-              <w:right w:val="none" w:sz="0" w:space="0" w:color="000000"/>
-            </w:tcBorders>
-            <w:shd w:val="clear" w:color="auto" w:fill="FFFFFF"/>
-            <w:tcMar>
-              <w:top w:w="0" w:type="dxa"/>
-              <w:bottom w:w="0" w:type="dxa"/>
-              <w:left w:w="0" w:type="dxa"/>
-              <w:right w:w="0" w:type="dxa"/>
-            </w:tcMar>
-            <w:vAlign w:val="top"/>
-          </w:tcPr>
-          <w:p>
-            <w:pPr>
-              <w:pStyle w:val="Normal"/>
+        body39
+        <w:tc>
+          <w:tcPr>
+            <w:tcBorders>
+              <w:bottom w:val="none" w:sz="0" w:space="0" w:color="000000"/>
+              <w:top w:val="none" w:sz="0" w:space="0" w:color="000000"/>
+              <w:left w:val="none" w:sz="0" w:space="0" w:color="000000"/>
+              <w:right w:val="none" w:sz="0" w:space="0" w:color="000000"/>
+            </w:tcBorders>
+            <w:shd w:val="clear" w:color="auto" w:fill="FFFFFF"/>
+            <w:tcMar>
+              <w:top w:w="0" w:type="dxa"/>
+              <w:bottom w:w="0" w:type="dxa"/>
+              <w:left w:w="0" w:type="dxa"/>
+              <w:right w:w="0" w:type="dxa"/>
+            </w:tcMar>
+            <w:vAlign w:val="top"/>
+          </w:tcPr>
+          <w:p>
+            <w:pPr>
               <w:jc w:val="left"/>
               <w:pBdr>
                 <w:bottom w:val="none" w:sz="0" w:space="0" w:color="000000"/>
@@ -4558,7 +4519,7 @@
               <w:spacing w:after="100" w:before="100" w:line="240"/>
               <w:ind w:left="100" w:right="100" w:firstLine="0" w:firstLineChars="0"/>
               <w:rPr>
-                <w:rFonts w:ascii="Helvetica" w:hAnsi="Helvetica" w:eastAsia="Helvetica" w:cs="Helvetica"/>
+                <w:rFonts w:ascii="Arial" w:hAnsi="Arial" w:eastAsia="Arial" w:cs="Arial"/>
                 <w:i w:val="false"/>
                 <w:b w:val="true"/>
                 <w:u w:val="none"/>
@@ -4570,7 +4531,7 @@
             </w:pPr>
             <w:r>
               <w:rPr>
-                <w:rFonts w:ascii="Helvetica" w:hAnsi="Helvetica" w:eastAsia="Helvetica" w:cs="Helvetica"/>
+                <w:rFonts w:ascii="Arial" w:hAnsi="Arial" w:eastAsia="Arial" w:cs="Arial"/>
                 <w:i w:val="false"/>
                 <w:b w:val="true"/>
                 <w:u w:val="none"/>
@@ -4602,7 +4563,6 @@
           </w:tcPr>
           <w:p>
             <w:pPr>
-              <w:pStyle w:val="Normal"/>
               <w:jc w:val="center"/>
               <w:pBdr>
                 <w:bottom w:val="none" w:sz="0" w:space="0" w:color="000000"/>
@@ -4613,19 +4573,19 @@
               <w:spacing w:after="100" w:before="100" w:line="240"/>
               <w:ind w:left="100" w:right="100" w:firstLine="0" w:firstLineChars="0"/>
               <w:rPr>
-                <w:rFonts w:ascii="Helvetica" w:hAnsi="Helvetica" w:eastAsia="Helvetica" w:cs="Helvetica"/>
-                <w:i w:val="false"/>
-                <w:b w:val="false"/>
-                <w:u w:val="none"/>
-                <w:strike w:val="false"/>
-                <w:sz w:val="22"/>
-                <w:szCs w:val="22"/>
-                <w:color w:val="000000"/>
-              </w:rPr>
-            </w:pPr>
-            <w:r>
-              <w:rPr>
-                <w:rFonts w:ascii="Helvetica" w:hAnsi="Helvetica" w:eastAsia="Helvetica" w:cs="Helvetica"/>
+                <w:rFonts w:ascii="Arial" w:hAnsi="Arial" w:eastAsia="Arial" w:cs="Arial"/>
+                <w:i w:val="false"/>
+                <w:b w:val="false"/>
+                <w:u w:val="none"/>
+                <w:strike w:val="false"/>
+                <w:sz w:val="22"/>
+                <w:szCs w:val="22"/>
+                <w:color w:val="000000"/>
+              </w:rPr>
+            </w:pPr>
+            <w:r>
+              <w:rPr>
+                <w:rFonts w:ascii="Arial" w:hAnsi="Arial" w:eastAsia="Arial" w:cs="Arial"/>
                 <w:i w:val="false"/>
                 <w:b w:val="false"/>
                 <w:u w:val="none"/>
@@ -4641,28 +4601,28 @@
       </w:tr>
       <w:tr>
         <w:trPr>
-          <w:trHeight w:val="608" w:hRule="auto"/>
+          <w:trHeight w:val="617" w:hRule="auto"/>
         </w:trPr>
-        <w:tc>
-          <w:tcPr>
-            <w:tcBorders>
-              <w:bottom w:val="none" w:sz="0" w:space="0" w:color="000000"/>
-              <w:top w:val="none" w:sz="0" w:space="0" w:color="000000"/>
-              <w:left w:val="none" w:sz="0" w:space="0" w:color="000000"/>
-              <w:right w:val="none" w:sz="0" w:space="0" w:color="000000"/>
-            </w:tcBorders>
-            <w:shd w:val="clear" w:color="auto" w:fill="FFFFFF"/>
-            <w:tcMar>
-              <w:top w:w="0" w:type="dxa"/>
-              <w:bottom w:w="0" w:type="dxa"/>
-              <w:left w:w="0" w:type="dxa"/>
-              <w:right w:w="0" w:type="dxa"/>
-            </w:tcMar>
-            <w:vAlign w:val="top"/>
-          </w:tcPr>
-          <w:p>
-            <w:pPr>
-              <w:pStyle w:val="Normal"/>
+        body40
+        <w:tc>
+          <w:tcPr>
+            <w:tcBorders>
+              <w:bottom w:val="none" w:sz="0" w:space="0" w:color="000000"/>
+              <w:top w:val="none" w:sz="0" w:space="0" w:color="000000"/>
+              <w:left w:val="none" w:sz="0" w:space="0" w:color="000000"/>
+              <w:right w:val="none" w:sz="0" w:space="0" w:color="000000"/>
+            </w:tcBorders>
+            <w:shd w:val="clear" w:color="auto" w:fill="FFFFFF"/>
+            <w:tcMar>
+              <w:top w:w="0" w:type="dxa"/>
+              <w:bottom w:w="0" w:type="dxa"/>
+              <w:left w:w="0" w:type="dxa"/>
+              <w:right w:w="0" w:type="dxa"/>
+            </w:tcMar>
+            <w:vAlign w:val="top"/>
+          </w:tcPr>
+          <w:p>
+            <w:pPr>
               <w:jc w:val="left"/>
               <w:pBdr>
                 <w:bottom w:val="none" w:sz="0" w:space="0" w:color="000000"/>
@@ -4673,19 +4633,19 @@
               <w:spacing w:after="100" w:before="100" w:line="240"/>
               <w:ind w:left="300" w:right="100" w:firstLine="0" w:firstLineChars="0"/>
               <w:rPr>
-                <w:rFonts w:ascii="Helvetica" w:hAnsi="Helvetica" w:eastAsia="Helvetica" w:cs="Helvetica"/>
-                <w:i w:val="false"/>
-                <w:b w:val="false"/>
-                <w:u w:val="none"/>
-                <w:strike w:val="false"/>
-                <w:sz w:val="22"/>
-                <w:szCs w:val="22"/>
-                <w:color w:val="000000"/>
-              </w:rPr>
-            </w:pPr>
-            <w:r>
-              <w:rPr>
-                <w:rFonts w:ascii="Helvetica" w:hAnsi="Helvetica" w:eastAsia="Helvetica" w:cs="Helvetica"/>
+                <w:rFonts w:ascii="Arial" w:hAnsi="Arial" w:eastAsia="Arial" w:cs="Arial"/>
+                <w:i w:val="false"/>
+                <w:b w:val="false"/>
+                <w:u w:val="none"/>
+                <w:strike w:val="false"/>
+                <w:sz w:val="22"/>
+                <w:szCs w:val="22"/>
+                <w:color w:val="000000"/>
+              </w:rPr>
+            </w:pPr>
+            <w:r>
+              <w:rPr>
+                <w:rFonts w:ascii="Arial" w:hAnsi="Arial" w:eastAsia="Arial" w:cs="Arial"/>
                 <w:i w:val="false"/>
                 <w:b w:val="false"/>
                 <w:u w:val="none"/>
@@ -4717,7 +4677,6 @@
           </w:tcPr>
           <w:p>
             <w:pPr>
-              <w:pStyle w:val="Normal"/>
               <w:jc w:val="center"/>
               <w:pBdr>
                 <w:bottom w:val="none" w:sz="0" w:space="0" w:color="000000"/>
@@ -4728,19 +4687,19 @@
               <w:spacing w:after="100" w:before="100" w:line="240"/>
               <w:ind w:left="100" w:right="100" w:firstLine="0" w:firstLineChars="0"/>
               <w:rPr>
-                <w:rFonts w:ascii="Helvetica" w:hAnsi="Helvetica" w:eastAsia="Helvetica" w:cs="Helvetica"/>
-                <w:i w:val="false"/>
-                <w:b w:val="false"/>
-                <w:u w:val="none"/>
-                <w:strike w:val="false"/>
-                <w:sz w:val="22"/>
-                <w:szCs w:val="22"/>
-                <w:color w:val="000000"/>
-              </w:rPr>
-            </w:pPr>
-            <w:r>
-              <w:rPr>
-                <w:rFonts w:ascii="Helvetica" w:hAnsi="Helvetica" w:eastAsia="Helvetica" w:cs="Helvetica"/>
+                <w:rFonts w:ascii="Arial" w:hAnsi="Arial" w:eastAsia="Arial" w:cs="Arial"/>
+                <w:i w:val="false"/>
+                <w:b w:val="false"/>
+                <w:u w:val="none"/>
+                <w:strike w:val="false"/>
+                <w:sz w:val="22"/>
+                <w:szCs w:val="22"/>
+                <w:color w:val="000000"/>
+              </w:rPr>
+            </w:pPr>
+            <w:r>
+              <w:rPr>
+                <w:rFonts w:ascii="Arial" w:hAnsi="Arial" w:eastAsia="Arial" w:cs="Arial"/>
                 <w:i w:val="false"/>
                 <w:b w:val="false"/>
                 <w:u w:val="none"/>
@@ -4756,8 +4715,9 @@
       </w:tr>
       <w:tr>
         <w:trPr>
-          <w:trHeight w:val="623" w:hRule="auto"/>
+          <w:trHeight w:val="617" w:hRule="auto"/>
         </w:trPr>
+        body41
         <w:tc>
           <w:tcPr>
             <w:tcBorders>
@@ -4777,7 +4737,6 @@
           </w:tcPr>
           <w:p>
             <w:pPr>
-              <w:pStyle w:val="Normal"/>
               <w:jc w:val="left"/>
               <w:pBdr>
                 <w:bottom w:val="none" w:sz="0" w:space="0" w:color="000000"/>
@@ -4788,7 +4747,7 @@
               <w:spacing w:after="100" w:before="100" w:line="240"/>
               <w:ind w:left="100" w:right="100" w:firstLine="0" w:firstLineChars="0"/>
               <w:rPr>
-                <w:rFonts w:ascii="Helvetica" w:hAnsi="Helvetica" w:eastAsia="Helvetica" w:cs="Helvetica"/>
+                <w:rFonts w:ascii="Arial" w:hAnsi="Arial" w:eastAsia="Arial" w:cs="Arial"/>
                 <w:i w:val="false"/>
                 <w:b w:val="true"/>
                 <w:u w:val="none"/>
@@ -4800,7 +4759,7 @@
             </w:pPr>
             <w:r>
               <w:rPr>
-                <w:rFonts w:ascii="Helvetica" w:hAnsi="Helvetica" w:eastAsia="Helvetica" w:cs="Helvetica"/>
+                <w:rFonts w:ascii="Arial" w:hAnsi="Arial" w:eastAsia="Arial" w:cs="Arial"/>
                 <w:i w:val="false"/>
                 <w:b w:val="true"/>
                 <w:u w:val="none"/>
@@ -4832,7 +4791,6 @@
           </w:tcPr>
           <w:p>
             <w:pPr>
-              <w:pStyle w:val="Normal"/>
               <w:jc w:val="center"/>
               <w:pBdr>
                 <w:bottom w:val="none" w:sz="0" w:space="0" w:color="000000"/>
@@ -4843,19 +4801,19 @@
               <w:spacing w:after="100" w:before="100" w:line="240"/>
               <w:ind w:left="100" w:right="100" w:firstLine="0" w:firstLineChars="0"/>
               <w:rPr>
-                <w:rFonts w:ascii="Helvetica" w:hAnsi="Helvetica" w:eastAsia="Helvetica" w:cs="Helvetica"/>
-                <w:i w:val="false"/>
-                <w:b w:val="false"/>
-                <w:u w:val="none"/>
-                <w:strike w:val="false"/>
-                <w:sz w:val="22"/>
-                <w:szCs w:val="22"/>
-                <w:color w:val="000000"/>
-              </w:rPr>
-            </w:pPr>
-            <w:r>
-              <w:rPr>
-                <w:rFonts w:ascii="Helvetica" w:hAnsi="Helvetica" w:eastAsia="Helvetica" w:cs="Helvetica"/>
+                <w:rFonts w:ascii="Arial" w:hAnsi="Arial" w:eastAsia="Arial" w:cs="Arial"/>
+                <w:i w:val="false"/>
+                <w:b w:val="false"/>
+                <w:u w:val="none"/>
+                <w:strike w:val="false"/>
+                <w:sz w:val="22"/>
+                <w:szCs w:val="22"/>
+                <w:color w:val="000000"/>
+              </w:rPr>
+            </w:pPr>
+            <w:r>
+              <w:rPr>
+                <w:rFonts w:ascii="Arial" w:hAnsi="Arial" w:eastAsia="Arial" w:cs="Arial"/>
                 <w:i w:val="false"/>
                 <w:b w:val="false"/>
                 <w:u w:val="none"/>

</xml_diff>